<commit_message>
Trim Unit IV key-word bold spans to 2-4 word hooks (review v1)
</commit_message>
<xml_diff>
--- a/Psychotherapy_Unit_IV_Comprehensive_Notes.docx
+++ b/Psychotherapy_Unit_IV_Comprehensive_Notes.docx
@@ -621,16 +621,16 @@
               <w:t xml:space="preserve">Theoretical view: </w:t>
             </w:r>
             <w:r>
-              <w:t xml:space="preserve"> Later schools extended the approach into </w:t>
+              <w:t xml:space="preserve"> Later schools extended the approach into ego psychology, object relations, </w:t>
             </w:r>
             <w:r>
               <w:rPr>
                 <w:b/>
               </w:rPr>
-              <w:t>ego psychology, object relations, self psychology and attachment</w:t>
-            </w:r>
-            <w:r>
-              <w:t xml:space="preserve">, so that modern psychodynamic therapy is face-to-face and briefer than classical analysis while keeping its core ideas. </w:t>
+              <w:t>self psychology</w:t>
+            </w:r>
+            <w:r>
+              <w:t xml:space="preserve"> and attachment, so that modern psychodynamic therapy is face-to-face and briefer than classical analysis while keeping its core ideas. </w:t>
             </w:r>
             <w:r>
               <w:rPr>
@@ -705,10 +705,10 @@
         <w:rPr>
           <w:b/>
         </w:rPr>
-        <w:t>Jung, Adler, Anna Freud, Klein, Winnicott, Kohut and Bowlby</w:t>
-      </w:r>
-      <w:r>
-        <w:t xml:space="preserve">, so that object relations, self psychology and attachment all grew from the one psychoanalytic root into today's briefer forms. </w:t>
+        <w:t>Jung, Adler, Klein</w:t>
+      </w:r>
+      <w:r>
+        <w:t xml:space="preserve"> and others including Anna Freud, Winnicott, Kohut and Bowlby, so that object relations, self psychology and attachment all grew from the one psychoanalytic root into today's briefer forms. </w:t>
       </w:r>
       <w:r>
         <w:rPr>
@@ -1432,10 +1432,10 @@
               <w:rPr>
                 <w:b/>
               </w:rPr>
-              <w:t>planned time limit, a single focus and an active therapist</w:t>
-            </w:r>
-            <w:r>
-              <w:t xml:space="preserve">, and they rest on the finding that most improvement happens early, with roughly half of clients improved within about eight sessions. </w:t>
+              <w:t>planned time limit</w:t>
+            </w:r>
+            <w:r>
+              <w:t xml:space="preserve">, a single focus and an active therapist, and they rest on the finding that most improvement happens early, with roughly half of clients improved within about eight sessions. </w:t>
             </w:r>
             <w:r>
               <w:rPr>
@@ -1462,10 +1462,10 @@
               <w:rPr>
                 <w:b/>
               </w:rPr>
-              <w:t>Malan's focal therapy, Sifneos' short-term anxiety-provoking therapy, Mann's time-limited therapy and Davanloo's intensive short-term dynamic therapy</w:t>
-            </w:r>
-            <w:r>
-              <w:t xml:space="preserve">, alongside interpersonal therapy and solution-focused brief therapy. </w:t>
+              <w:t>Malan, Sifneos, Mann and Davanloo</w:t>
+            </w:r>
+            <w:r>
+              <w:t xml:space="preserve"> with their focal, short-term anxiety-provoking, time-limited and intensive short-term dynamic therapies, alongside interpersonal therapy and solution-focused brief therapy. </w:t>
             </w:r>
             <w:r>
               <w:rPr>
@@ -2702,10 +2702,10 @@
         <w:rPr>
           <w:b/>
         </w:rPr>
-        <w:t>relationship itself is the main agent of change</w:t>
-      </w:r>
-      <w:r>
-        <w:t xml:space="preserve">, so a genuine, accepting and empathic presence matters more than any specific technique. </w:t>
+        <w:t>relationship itself</w:t>
+      </w:r>
+      <w:r>
+        <w:t xml:space="preserve"> is the main agent of change, so a genuine, accepting and empathic presence matters more than any specific technique. </w:t>
       </w:r>
       <w:r>
         <w:rPr>
@@ -2762,16 +2762,16 @@
         <w:t>techniques</w:t>
       </w:r>
       <w:r>
-        <w:t xml:space="preserve"> are also used, including </w:t>
-      </w:r>
-      <w:r>
-        <w:rPr>
-          <w:b/>
-        </w:rPr>
-        <w:t>focusing on bodily felt sense and chair work</w:t>
-      </w:r>
-      <w:r>
-        <w:t xml:space="preserve">, which help the person contact and process emotion in the present moment. </w:t>
+        <w:t xml:space="preserve"> are also used, including focusing on the </w:t>
+      </w:r>
+      <w:r>
+        <w:rPr>
+          <w:b/>
+        </w:rPr>
+        <w:t>bodily felt sense</w:t>
+      </w:r>
+      <w:r>
+        <w:t xml:space="preserve"> and chair work, which help the person contact and process emotion in the present moment. </w:t>
       </w:r>
       <w:r>
         <w:rPr>
@@ -4468,10 +4468,10 @@
         <w:rPr>
           <w:b/>
         </w:rPr>
-        <w:t>exaggerating a gesture, reversal and staying with the feeling</w:t>
-      </w:r>
-      <w:r>
-        <w:t xml:space="preserve">, each designed as an experiment that heightens awareness rather than as an interpretation. </w:t>
+        <w:t>exaggerating a gesture</w:t>
+      </w:r>
+      <w:r>
+        <w:t xml:space="preserve">, reversal and staying with the feeling, each designed as an experiment that heightens awareness rather than as an interpretation. </w:t>
       </w:r>
       <w:r>
         <w:rPr>
@@ -8307,10 +8307,10 @@
               <w:rPr>
                 <w:b/>
               </w:rPr>
-              <w:t>therapeutic relationship as the main agent of change</w:t>
-            </w:r>
-            <w:r>
-              <w:t xml:space="preserve">, with the therapist acting as a trusted, caring support or </w:t>
+              <w:t>therapeutic relationship</w:t>
+            </w:r>
+            <w:r>
+              <w:t xml:space="preserve"> as the main agent of change, with the therapist acting as a trusted, caring support or </w:t>
             </w:r>
             <w:r>
               <w:t xml:space="preserve">auxiliary ego </w:t>
@@ -8427,10 +8427,10 @@
         <w:rPr>
           <w:b/>
         </w:rPr>
-        <w:t>Wallerstein's Menninger project, Rockland, and Winston, Pinsker and McCullough</w:t>
-      </w:r>
-      <w:r>
-        <w:t xml:space="preserve">, who formalised it for patients whose fragile personality cannot tolerate uncovering work. </w:t>
+        <w:t>Wallerstein's Menninger project</w:t>
+      </w:r>
+      <w:r>
+        <w:t xml:space="preserve">, Rockland, and Winston, Pinsker and McCullough, who formalised it for patients whose fragile personality cannot tolerate uncovering work. </w:t>
       </w:r>
       <w:r>
         <w:rPr>
@@ -10211,10 +10211,10 @@
         <w:rPr>
           <w:b/>
         </w:rPr>
-        <w:t>blocked emotions, trauma, insecure attachment or unmet needs</w:t>
-      </w:r>
-      <w:r>
-        <w:t xml:space="preserve">, which play lets them express and master safely at a symbolic distance from the real event. </w:t>
+        <w:t>blocked emotions</w:t>
+      </w:r>
+      <w:r>
+        <w:t xml:space="preserve">, trauma, insecure attachment or unmet needs, which play lets them express and master safely at a symbolic distance from the real event. </w:t>
       </w:r>
       <w:r>
         <w:rPr>
@@ -10574,10 +10574,10 @@
         <w:rPr>
           <w:b/>
         </w:rPr>
-        <w:t>Bratton and colleagues' 2005 meta-analysis of ninety-three studies</w:t>
-      </w:r>
-      <w:r>
-        <w:t xml:space="preserve"> reported a large mean effect, larger when parents took part, and later child-centred play therapy reviews show moderate to large effects, though critics note methodological weaknesses. </w:t>
+        <w:t>Bratton and colleagues'</w:t>
+      </w:r>
+      <w:r>
+        <w:t xml:space="preserve"> 2005 meta-analysis of ninety-three studies reported a large mean effect, larger when parents took part, and later child-centred play therapy reviews show moderate to large effects, though critics note methodological weaknesses. </w:t>
       </w:r>
       <w:r>
         <w:rPr>
@@ -10917,10 +10917,10 @@
         <w:rPr>
           <w:b/>
         </w:rPr>
-        <w:t>spontaneity and creativity are the foundations of mental health</w:t>
-      </w:r>
-      <w:r>
-        <w:t xml:space="preserve">, so that distress is understood as a loss of spontaneity, rigid role patterns and unfinished action. </w:t>
+        <w:t>spontaneity and creativity</w:t>
+      </w:r>
+      <w:r>
+        <w:t xml:space="preserve"> are the foundations of mental health, so that distress is understood as a loss of spontaneity, rigid role patterns and unfinished action. </w:t>
       </w:r>
       <w:r>
         <w:rPr>
@@ -11058,10 +11058,10 @@
         <w:rPr>
           <w:b/>
         </w:rPr>
-        <w:t>catharsis and release, insight and a wider role repertoire</w:t>
-      </w:r>
-      <w:r>
-        <w:t xml:space="preserve">, renewed spontaneity, better interpersonal skills, the resolution of unfinished business and group cohesion and support. </w:t>
+        <w:t>catharsis and release</w:t>
+      </w:r>
+      <w:r>
+        <w:t xml:space="preserve">, insight and a wider role repertoire, renewed spontaneity, better interpersonal skills, the resolution of unfinished business and group cohesion and support. </w:t>
       </w:r>
       <w:r>
         <w:rPr>
@@ -12190,10 +12190,10 @@
         <w:rPr>
           <w:b/>
         </w:rPr>
-        <w:t>Morita and Naikan therapy from Japan and qigong</w:t>
-      </w:r>
-      <w:r>
-        <w:t xml:space="preserve">, where Morita teaches accepting one's feelings and doing what needs to be done and Naikan uses structured introspection to build gratitude. </w:t>
+        <w:t>Morita and Naikan therapy</w:t>
+      </w:r>
+      <w:r>
+        <w:t xml:space="preserve"> from Japan and qigong, where Morita teaches accepting one's feelings and doing what needs to be done and Naikan uses structured introspection to build gratitude. </w:t>
       </w:r>
       <w:r>
         <w:rPr>
@@ -12259,16 +12259,16 @@
         <w:t>real evidence base</w:t>
       </w:r>
       <w:r>
-        <w:t xml:space="preserve"> as adjuncts for stress, anxiety, depression and chronic pain, while </w:t>
-      </w:r>
-      <w:r>
-        <w:rPr>
-          <w:b/>
-        </w:rPr>
-        <w:t>reiki and pranic healing have weak or inconclusive evidence</w:t>
-      </w:r>
-      <w:r>
-        <w:t xml:space="preserve"> and carry the risk of replacing proper care. </w:t>
+        <w:t xml:space="preserve"> as adjuncts for stress, anxiety, depression and chronic pain, while reiki and pranic healing have </w:t>
+      </w:r>
+      <w:r>
+        <w:rPr>
+          <w:b/>
+        </w:rPr>
+        <w:t>weak or inconclusive</w:t>
+      </w:r>
+      <w:r>
+        <w:t xml:space="preserve"> evidence and carry the risk of replacing proper care. </w:t>
       </w:r>
       <w:r>
         <w:rPr>

</xml_diff>

<commit_message>
Rewrite Psychotherapy Unit IV notes in plain, student-friendly language
Rewrite SECTIONS text and INTRO in content_unit4.py into short, plain
sentences with simple plain-English glosses for every hard term and a
concept explanation (plus tiny examples) for the tricky ideas, keeping
all clinical terms, facts, citations, structure, one flowchart and one
mnemonic per topic. Rebuild HTML and DOCX deliverables.

- Mean sentence length ~27.3 -> ~15.9 words; far fewer long sentences
- 14/14 topics keep flowchart + mnemonic + >=15 points
- 63 amber glosses; short key-word bolding; title + credit byte-exact
- 0 raw tokens, 0 external loads, 0 JS errors, 0 broken TOC links
</commit_message>
<xml_diff>
--- a/Psychotherapy_Unit_IV_Comprehensive_Notes.docx
+++ b/Psychotherapy_Unit_IV_Comprehensive_Notes.docx
@@ -66,7 +66,7 @@
         <w:rPr>
           <w:i/>
         </w:rPr>
-        <w:t>These are concise, exam-ready revision notes for Unit IV of the Psychotherapy paper (M.Phil. Clinical Psychology). They cover the affective psychotherapies one by one, and for each therapy they weave in its origin, basis, formulation, goals, procedures and techniques, stages and process, outcome, indications and the research and current status, so you can revise a whole 5-mark answer from a single topic.</w:t>
+        <w:t>These are easy, exam-ready revision notes for Unit IV of the Psychotherapy paper (M.Phil. Clinical Psychology). They cover the affective psychotherapies one by one. For each therapy you get its origin, basis, formulation, goals, techniques, process, outcome, indications and research in short, plain sentences. So you can revise a whole 5-mark answer from one topic.</w:t>
       </w:r>
     </w:p>
     <w:p>
@@ -82,7 +82,7 @@
         <w:pStyle w:val="ListBullet"/>
       </w:pPr>
       <w:r>
-        <w:t>Each numbered section is one therapy from the syllabus, written as a 5-mark exam answer in full sentences rather than terse fragments, so you can revise straight from the point and reproduce it under exam conditions.</w:t>
+        <w:t>Each numbered section is one therapy from the syllabus. It is written as a 5-mark exam answer in full but simple sentences, so you can revise straight from the point and write it back in the exam.</w:t>
       </w:r>
     </w:p>
     <w:p>
@@ -90,7 +90,7 @@
         <w:pStyle w:val="ListBullet"/>
       </w:pPr>
       <w:r>
-        <w:t>Every topic opens with a one-line summary, carries a flowchart figure that pictures the core idea, gives a short definition box drawn from recognised bodies and classic authors, and closes with a mnemonic that packs the key points into a single memorable word.</w:t>
+        <w:t>Every topic opens with a one-line summary. It then has a flowchart that pictures the core idea, a short definition box from well-known bodies and classic authors, the answer points, an 'at a glance' box, and a mnemonic that packs the key points into one memorable word.</w:t>
       </w:r>
     </w:p>
     <w:p>
@@ -98,7 +98,7 @@
         <w:pStyle w:val="ListBullet"/>
       </w:pPr>
       <w:r>
-        <w:t>A short source note and a references list sit at the end; the references name only the books (full title and author) and the online or primary sources that were actually used.</w:t>
+        <w:t>A short source note and a references list sit at the end. The references name only the books (full title and author) and the online or primary sources that were actually used.</w:t>
       </w:r>
     </w:p>
     <w:p>
@@ -357,7 +357,7 @@
         <w:t>[Irvin D. Yalom, Existential Psychotherapy]</w:t>
       </w:r>
       <w:r>
-        <w:t>, so you can trace any claim back to the work it comes from.</w:t>
+        <w:t>. So you can trace any claim back to the work it comes from.</w:t>
       </w:r>
     </w:p>
     <w:p>
@@ -385,7 +385,7 @@
         <w:t>[Carl R. Rogers, Client-Centered Therapy]</w:t>
       </w:r>
       <w:r>
-        <w:t xml:space="preserve">, and where a point rests on a professional body the citation names that body, for example </w:t>
+        <w:t xml:space="preserve">. Where a point rests on a professional body, the citation names that body, for example </w:t>
       </w:r>
       <w:r>
         <w:rPr>
@@ -420,7 +420,7 @@
         <w:t>bold</w:t>
       </w:r>
       <w:r>
-        <w:t xml:space="preserve"> are the memory hooks: skim the bold words first to recall the gist of a sentence, then read the full sentence to fill in the detail.</w:t>
+        <w:t xml:space="preserve"> are the memory hooks. Skim the bold words first to recall the gist, then read the full sentence for the detail.</w:t>
       </w:r>
     </w:p>
     <w:p>
@@ -437,10 +437,10 @@
         <w:rPr>
           <w:i/>
         </w:rPr>
-        <w:t>(the client's redirection of feelings from past relationships onto the therapist)</w:t>
-      </w:r>
-      <w:r>
-        <w:t>. Just skim the coloured bracket to get the plain meaning, so the difficult word never leaves you stuck.</w:t>
+        <w:t>(reacting to the therapist as if they were someone from your past, like a parent)</w:t>
+      </w:r>
+      <w:r>
+        <w:t>. Just read the coloured bracket to get the plain meaning, so the hard word never leaves you stuck.</w:t>
       </w:r>
     </w:p>
     <w:p>
@@ -448,7 +448,7 @@
         <w:pStyle w:val="ListBullet"/>
       </w:pPr>
       <w:r>
-        <w:t>Every topic carries one flowchart figure that pictures the idea and one mnemonic that packs its key points into a single memorable word.</w:t>
+        <w:t>Tricky ideas also get a short plain sentence that unpacks them, often with a tiny example, right next to the technical wording. Every topic also carries one flowchart and one mnemonic.</w:t>
       </w:r>
     </w:p>
     <w:p>
@@ -469,7 +469,7 @@
         <w:rPr>
           <w:i/>
         </w:rPr>
-        <w:t>Psychodynamic psychotherapy is the modern, briefer descendant of Freudian psychoanalysis that treats symptoms as meaningful compromises between unconscious wishes, reality and conscience, and uses the relationship, free association and interpretation to make the unconscious conscious and bring lasting change.</w:t>
+        <w:t>Psychodynamic psychotherapy is the modern, shorter form of Freud's psychoanalysis. It sees a symptom as a clue to a hidden mental struggle, not a random fault. The therapist uses the relationship, free talking and gentle explaining to bring that hidden struggle into the open, so lasting change can happen.</w:t>
       </w:r>
     </w:p>
     <w:p>
@@ -531,7 +531,7 @@
               <w:t>APA Dictionary of Psychology</w:t>
             </w:r>
             <w:r>
-              <w:t xml:space="preserve"> characterises </w:t>
+              <w:t xml:space="preserve"> describes </w:t>
             </w:r>
             <w:r>
               <w:t xml:space="preserve">psychodynamic psychotherapy </w:t>
@@ -540,19 +540,22 @@
               <w:rPr>
                 <w:i/>
               </w:rPr>
-              <w:t>(therapy that works with unconscious conflict and the therapy relationship)</w:t>
-            </w:r>
-            <w:r>
-              <w:t xml:space="preserve"> as a form of therapy derived from psychoanalysis that focuses on </w:t>
+              <w:t>(therapy that works with hidden mental conflicts and with the bond between client and therapist)</w:t>
+            </w:r>
+            <w:r>
+              <w:t xml:space="preserve"> as a therapy that grew out of psychoanalysis. It works with </w:t>
+            </w:r>
+            <w:r>
+              <w:t xml:space="preserve">unconscious processes </w:t>
             </w:r>
             <w:r>
               <w:rPr>
-                <w:b/>
+                <w:i/>
               </w:rPr>
-              <w:t>unconscious processes</w:t>
-            </w:r>
-            <w:r>
-              <w:t xml:space="preserve"> as they show in present behaviour, aiming at self-awareness and insight into the influence of the past on the present. </w:t>
+              <w:t>(mental activity going on outside your awareness, like a motive you don't notice)</w:t>
+            </w:r>
+            <w:r>
+              <w:t xml:space="preserve"> that still shape how you act today. The aim is self-awareness and seeing how the past shapes the present. </w:t>
             </w:r>
             <w:r>
               <w:rPr>
@@ -582,7 +585,19 @@
               <w:t>Freud</w:t>
             </w:r>
             <w:r>
-              <w:t xml:space="preserve"> founded psychoanalysis with Breuer's 'talking cure', moving from hypnosis and catharsis to </w:t>
+              <w:t xml:space="preserve"> started psychoanalysis with Breuer's 'talking cure'. He moved on from hypnosis and </w:t>
+            </w:r>
+            <w:r>
+              <w:t xml:space="preserve">catharsis </w:t>
+            </w:r>
+            <w:r>
+              <w:rPr>
+                <w:i/>
+              </w:rPr>
+              <w:t>(releasing bottled-up emotion so it stops pressing on you)</w:t>
+            </w:r>
+            <w:r>
+              <w:t xml:space="preserve"> to </w:t>
             </w:r>
             <w:r>
               <w:rPr>
@@ -591,7 +606,7 @@
               <w:t>free association and interpretation</w:t>
             </w:r>
             <w:r>
-              <w:t xml:space="preserve">, and set its aim in the formula that where id was, there </w:t>
+              <w:t xml:space="preserve">. He summed up its aim in one line: where id was, there </w:t>
             </w:r>
             <w:r>
               <w:rPr>
@@ -600,7 +615,7 @@
               <w:t>ego shall be</w:t>
             </w:r>
             <w:r>
-              <w:t xml:space="preserve">. </w:t>
+              <w:t xml:space="preserve"> (the sensible self should take charge). </w:t>
             </w:r>
             <w:r>
               <w:rPr>
@@ -621,7 +636,7 @@
               <w:t xml:space="preserve">Theoretical view: </w:t>
             </w:r>
             <w:r>
-              <w:t xml:space="preserve"> Later schools extended the approach into ego psychology, object relations, </w:t>
+              <w:t xml:space="preserve"> Later schools widened the approach into ego psychology, object relations, </w:t>
             </w:r>
             <w:r>
               <w:rPr>
@@ -630,7 +645,7 @@
               <w:t>self psychology</w:t>
             </w:r>
             <w:r>
-              <w:t xml:space="preserve"> and attachment, so that modern psychodynamic therapy is face-to-face and briefer than classical analysis while keeping its core ideas. </w:t>
+              <w:t xml:space="preserve"> and attachment. So modern psychodynamic therapy is face-to-face and briefer than classical analysis, while keeping the same core ideas. </w:t>
             </w:r>
             <w:r>
               <w:rPr>
@@ -666,7 +681,7 @@
         <w:t>origin</w:t>
       </w:r>
       <w:r>
-        <w:t xml:space="preserve"> the approach begins with </w:t>
+        <w:t xml:space="preserve">, the approach begins with </w:t>
       </w:r>
       <w:r>
         <w:rPr>
@@ -675,7 +690,7 @@
         <w:t>Freud and Breuer</w:t>
       </w:r>
       <w:r>
-        <w:t xml:space="preserve"> and the case of Anna O., the so-called talking cure, out of which Freud built psychoanalysis from hypnosis and catharsis toward free association and dream interpretation. </w:t>
+        <w:t xml:space="preserve"> and the case of Anna O., the so-called talking cure. From it Freud built psychoanalysis, moving from hypnosis and catharsis toward free association and dream interpretation. </w:t>
       </w:r>
       <w:r>
         <w:rPr>
@@ -705,10 +720,10 @@
         <w:rPr>
           <w:b/>
         </w:rPr>
-        <w:t>Jung, Adler, Klein</w:t>
-      </w:r>
-      <w:r>
-        <w:t xml:space="preserve"> and others including Anna Freud, Winnicott, Kohut and Bowlby, so that object relations, self psychology and attachment all grew from the one psychoanalytic root into today's briefer forms. </w:t>
+        <w:t>Jung, Adler and Klein</w:t>
+      </w:r>
+      <w:r>
+        <w:t xml:space="preserve">, plus Anna Freud, Winnicott, Kohut and Bowlby. Object relations, self psychology and attachment all grew from this one root into today's briefer forms. </w:t>
       </w:r>
       <w:r>
         <w:rPr>
@@ -732,19 +747,19 @@
         <w:rPr>
           <w:i/>
         </w:rPr>
-        <w:t>(the view that nothing mental is accidental and every symptom has a cause)</w:t>
-      </w:r>
-      <w:r>
-        <w:t xml:space="preserve">, the idea that behaviour and symptoms </w:t>
-      </w:r>
-      <w:r>
-        <w:rPr>
-          <w:b/>
-        </w:rPr>
-        <w:t>have meaning and causes</w:t>
-      </w:r>
-      <w:r>
-        <w:t xml:space="preserve"> rather than arising by chance, so that even slips of the tongue are read as significant. </w:t>
+        <w:t>(the idea that nothing in the mind is a pure accident, so every symptom has a cause)</w:t>
+      </w:r>
+      <w:r>
+        <w:t xml:space="preserve">. Behaviour and symptoms </w:t>
+      </w:r>
+      <w:r>
+        <w:rPr>
+          <w:b/>
+        </w:rPr>
+        <w:t>have meaning</w:t>
+      </w:r>
+      <w:r>
+        <w:t xml:space="preserve">, so even a slip of the tongue is read as a clue, not chance. </w:t>
       </w:r>
       <w:r>
         <w:rPr>
@@ -768,7 +783,7 @@
         <w:t>unconscious</w:t>
       </w:r>
       <w:r>
-        <w:t xml:space="preserve">, described through the topographic model of conscious, preconscious and unconscious and the structural model in which the </w:t>
+        <w:t xml:space="preserve">. The mind is split into conscious, preconscious and unconscious, and into the </w:t>
       </w:r>
       <w:r>
         <w:rPr>
@@ -777,7 +792,7 @@
         <w:t>id, ego and superego</w:t>
       </w:r>
       <w:r>
-        <w:t xml:space="preserve"> pursue pleasure, reality and conscience. </w:t>
+        <w:t xml:space="preserve"> that chase pleasure, reality and conscience. In short: the id wants, the superego judges, and the ego keeps the peace between them. </w:t>
       </w:r>
       <w:r>
         <w:rPr>
@@ -801,7 +816,7 @@
         <w:t>psychosexual stages</w:t>
       </w:r>
       <w:r>
-        <w:t xml:space="preserve">, oral, anal, phallic, latency and genital, where excessive frustration or indulgence can cause </w:t>
+        <w:t xml:space="preserve">: oral, anal, phallic, latency and genital. Too much frustration or too much indulgence can cause </w:t>
       </w:r>
       <w:r>
         <w:t xml:space="preserve">fixation </w:t>
@@ -810,10 +825,10 @@
         <w:rPr>
           <w:i/>
         </w:rPr>
-        <w:t>(getting stuck at an early developmental stage)</w:t>
-      </w:r>
-      <w:r>
-        <w:t xml:space="preserve"> that later shapes personality and symptoms. </w:t>
+        <w:t>(getting stuck at an early stage, like a part of you never fully growing up)</w:t>
+      </w:r>
+      <w:r>
+        <w:t xml:space="preserve">, which later shapes personality and symptoms. </w:t>
       </w:r>
       <w:r>
         <w:rPr>
@@ -837,16 +852,16 @@
         <w:t>defence mechanisms</w:t>
       </w:r>
       <w:r>
-        <w:t xml:space="preserve"> form another basis, so that </w:t>
-      </w:r>
-      <w:r>
-        <w:rPr>
-          <w:b/>
-        </w:rPr>
-        <w:t>repression, denial, projection, displacement and sublimation</w:t>
-      </w:r>
-      <w:r>
-        <w:t xml:space="preserve"> keep unacceptable wishes out of awareness while quietly steering conduct. </w:t>
+        <w:t xml:space="preserve"> are another basis. Tricks like </w:t>
+      </w:r>
+      <w:r>
+        <w:rPr>
+          <w:b/>
+        </w:rPr>
+        <w:t>repression, denial, projection</w:t>
+      </w:r>
+      <w:r>
+        <w:t xml:space="preserve"> and sublimation push unwanted wishes out of awareness while quietly steering how you act. For example, projection means seeing your own anger in someone else instead of in yourself. </w:t>
       </w:r>
       <w:r>
         <w:rPr>
@@ -879,10 +894,10 @@
         <w:rPr>
           <w:i/>
         </w:rPr>
-        <w:t>(a symptom that partly satisfies a wish and partly defends against it)</w:t>
-      </w:r>
-      <w:r>
-        <w:t xml:space="preserve"> between a repressed wish, the demands of reality and the superego, so it symbolises an underlying conflict and yields secondary gain. </w:t>
+        <w:t>(a symptom that half-satisfies a hidden wish and half-hides it, like a nervous habit that both shows and masks a worry)</w:t>
+      </w:r>
+      <w:r>
+        <w:t xml:space="preserve">. It balances a buried wish, the demands of reality and the conscience, and so stands for an inner conflict. </w:t>
       </w:r>
       <w:r>
         <w:rPr>
@@ -915,7 +930,7 @@
         <w:t>unconscious conscious</w:t>
       </w:r>
       <w:r>
-        <w:t xml:space="preserve">, giving the client insight into hidden conflicts and patterns, strengthening the ego, maturing the defences and so producing lasting change rather than mere symptom removal. </w:t>
+        <w:t xml:space="preserve">. The client gains insight into hidden conflicts and patterns, the ego grows stronger, and defences mature. This brings lasting change, not just the quick removal of a symptom. </w:t>
       </w:r>
       <w:r>
         <w:rPr>
@@ -939,7 +954,7 @@
         <w:t>procedure</w:t>
       </w:r>
       <w:r>
-        <w:t xml:space="preserve">, combining </w:t>
+        <w:t xml:space="preserve">. It combines </w:t>
       </w:r>
       <w:r>
         <w:t xml:space="preserve">neutrality </w:t>
@@ -948,10 +963,10 @@
         <w:rPr>
           <w:i/>
         </w:rPr>
-        <w:t>(not taking sides among the client's wishes, defences and conscience)</w:t>
-      </w:r>
-      <w:r>
-        <w:t xml:space="preserve">, abstinence and relative anonymity so the therapist acts as a </w:t>
+        <w:t>(not taking sides between the client's wishes, defences and conscience)</w:t>
+      </w:r>
+      <w:r>
+        <w:t xml:space="preserve">, restraint and staying fairly private. The therapist acts as a </w:t>
       </w:r>
       <w:r>
         <w:rPr>
@@ -975,7 +990,7 @@
         <w:pStyle w:val="ListBullet"/>
       </w:pPr>
       <w:r>
-        <w:t xml:space="preserve">The fundamental </w:t>
+        <w:t xml:space="preserve">The basic </w:t>
       </w:r>
       <w:r>
         <w:rPr>
@@ -993,10 +1008,10 @@
         <w:rPr>
           <w:i/>
         </w:rPr>
-        <w:t>(saying whatever comes to mind without censoring it)</w:t>
-      </w:r>
-      <w:r>
-        <w:t xml:space="preserve">, in which the client is asked to voice every passing thought, because the gaps and detours reveal where the real conflict lies. </w:t>
+        <w:t>(saying whatever comes to mind without filtering it, even if it feels silly or rude)</w:t>
+      </w:r>
+      <w:r>
+        <w:t xml:space="preserve">. The client voices every passing thought, because the pauses and detours show where the real conflict hides. </w:t>
       </w:r>
       <w:r>
         <w:rPr>
@@ -1017,7 +1032,7 @@
         <w:t>Dream analysis</w:t>
       </w:r>
       <w:r>
-        <w:t xml:space="preserve"> is a classic technique, treating dreams as the royal road to the unconscious and distinguishing the remembered </w:t>
+        <w:t xml:space="preserve"> is a classic technique. Dreams are treated as the royal road to the unconscious. The therapist separates the remembered </w:t>
       </w:r>
       <w:r>
         <w:rPr>
@@ -1026,7 +1041,7 @@
         <w:t>manifest content</w:t>
       </w:r>
       <w:r>
-        <w:t xml:space="preserve"> from the hidden </w:t>
+        <w:t xml:space="preserve"> (the surface story) from the hidden </w:t>
       </w:r>
       <w:r>
         <w:rPr>
@@ -1035,7 +1050,7 @@
         <w:t>latent content</w:t>
       </w:r>
       <w:r>
-        <w:t xml:space="preserve"> reached by exploring the dream's distortions. </w:t>
+        <w:t xml:space="preserve"> (the real meaning behind it). </w:t>
       </w:r>
       <w:r>
         <w:rPr>
@@ -1056,7 +1071,7 @@
         <w:t>Interpretation</w:t>
       </w:r>
       <w:r>
-        <w:t xml:space="preserve"> is the therapist's main tool, tactfully and at the right moment explaining the unconscious meaning of associations, dreams and symptoms, so that what was warded off can be put into words and understood. </w:t>
+        <w:t xml:space="preserve"> is the therapist's main tool. At the right moment, the therapist gently explains the hidden meaning of a client's words, dreams or symptoms. What was pushed away is put into words and understood. </w:t>
       </w:r>
       <w:r>
         <w:rPr>
@@ -1071,7 +1086,7 @@
         <w:pStyle w:val="ListBullet"/>
       </w:pPr>
       <w:r>
-        <w:t xml:space="preserve">Two further techniques are the </w:t>
+        <w:t xml:space="preserve">Two more techniques are the </w:t>
       </w:r>
       <w:r>
         <w:rPr>
@@ -1080,7 +1095,7 @@
         <w:t>analysis of resistance</w:t>
       </w:r>
       <w:r>
-        <w:t xml:space="preserve">, noting lateness, silence or intellectualising, and the </w:t>
+        <w:t xml:space="preserve"> (noticing lateness, silence or over-thinking that block the work) and the </w:t>
       </w:r>
       <w:r>
         <w:t xml:space="preserve">analysis of transference </w:t>
@@ -1089,10 +1104,10 @@
         <w:rPr>
           <w:i/>
         </w:rPr>
-        <w:t>(exploring the client's transfer of old relationship patterns onto the therapist)</w:t>
-      </w:r>
-      <w:r>
-        <w:t xml:space="preserve">, which lets old patterns be relived and understood in the room. </w:t>
+        <w:t>(studying how the client treats the therapist like an important person from their past)</w:t>
+      </w:r>
+      <w:r>
+        <w:t xml:space="preserve">. Old patterns are relived in the room, so they can be understood. </w:t>
       </w:r>
       <w:r>
         <w:rPr>
@@ -1116,7 +1131,7 @@
         <w:t>stages and process</w:t>
       </w:r>
       <w:r>
-        <w:t xml:space="preserve"> the work moves from an </w:t>
+        <w:t xml:space="preserve"> the work moves through three phases. It starts with an </w:t>
       </w:r>
       <w:r>
         <w:rPr>
@@ -1125,16 +1140,16 @@
         <w:t>opening phase</w:t>
       </w:r>
       <w:r>
-        <w:t xml:space="preserve"> of assessment, contract and alliance, through the emergence and </w:t>
-      </w:r>
-      <w:r>
-        <w:rPr>
-          <w:b/>
-        </w:rPr>
-        <w:t>working through</w:t>
-      </w:r>
-      <w:r>
-        <w:t xml:space="preserve"> of transference and resistance, to a planned </w:t>
+        <w:t xml:space="preserve"> of assessment, contract and building trust. Then transference and resistance appear and are </w:t>
+      </w:r>
+      <w:r>
+        <w:rPr>
+          <w:b/>
+        </w:rPr>
+        <w:t>worked through</w:t>
+      </w:r>
+      <w:r>
+        <w:t xml:space="preserve">. Finally a planned </w:t>
       </w:r>
       <w:r>
         <w:rPr>
@@ -1143,7 +1158,7 @@
         <w:t>termination</w:t>
       </w:r>
       <w:r>
-        <w:t xml:space="preserve"> that reviews and consolidates the gains. </w:t>
+        <w:t xml:space="preserve"> reviews and locks in the gains. </w:t>
       </w:r>
       <w:r>
         <w:rPr>
@@ -1158,7 +1173,7 @@
         <w:pStyle w:val="ListBullet"/>
       </w:pPr>
       <w:r>
-        <w:t xml:space="preserve">A distinctive process idea is </w:t>
+        <w:t xml:space="preserve">A key process idea is </w:t>
       </w:r>
       <w:r>
         <w:t xml:space="preserve">working through </w:t>
@@ -1167,10 +1182,10 @@
         <w:rPr>
           <w:i/>
         </w:rPr>
-        <w:t>(repeatedly revisiting an insight until it produces real change)</w:t>
-      </w:r>
-      <w:r>
-        <w:t xml:space="preserve">, the patient and slow repetition of insights across many sessions, since a single interpretation rarely shifts a deeply rooted pattern on its own. </w:t>
+        <w:t>(going over the same insight again and again until it really changes how you live)</w:t>
+      </w:r>
+      <w:r>
+        <w:t xml:space="preserve">. One clever interpretation rarely shifts a deep pattern, so the work is slow and repeated across many sessions. </w:t>
       </w:r>
       <w:r>
         <w:rPr>
@@ -1194,7 +1209,7 @@
         <w:t>outcome</w:t>
       </w:r>
       <w:r>
-        <w:t xml:space="preserve"> sought is reduced symptoms, greater insight, more flexible and mature defences and healthier relationships, and gains often continue to grow after therapy ends in what is called a </w:t>
+        <w:t xml:space="preserve"> sought is fewer symptoms, more insight, more flexible defences and healthier relationships. Gains often keep growing even after therapy ends, which is called a </w:t>
       </w:r>
       <w:r>
         <w:rPr>
@@ -1224,7 +1239,7 @@
         <w:t>Indications</w:t>
       </w:r>
       <w:r>
-        <w:t xml:space="preserve"> favour clients with good ego strength, psychological-mindedness and motivation facing neurotic, personality or interpersonal problems, while acute psychosis, high suicidality and crisis states are </w:t>
+        <w:t xml:space="preserve"> favour clients with good ego strength, curiosity about their own mind and motivation, facing neurotic, personality or relationship problems. Acute psychosis, high suicide risk and crisis states are </w:t>
       </w:r>
       <w:r>
         <w:rPr>
@@ -1257,16 +1272,16 @@
         <w:t>research and current status</w:t>
       </w:r>
       <w:r>
-        <w:t xml:space="preserve">, well-known reviews report that psychodynamic therapy produces </w:t>
-      </w:r>
-      <w:r>
-        <w:rPr>
-          <w:b/>
-        </w:rPr>
-        <w:t>substantial and lasting benefit</w:t>
-      </w:r>
-      <w:r>
-        <w:t xml:space="preserve">, with short-term psychodynamic therapy supported for depression and anxiety and specialised forms helping borderline personality disorder, while classical long analysis remains hard to study. </w:t>
+        <w:t xml:space="preserve">, well-known reviews find psychodynamic therapy gives </w:t>
+      </w:r>
+      <w:r>
+        <w:rPr>
+          <w:b/>
+        </w:rPr>
+        <w:t>substantial, lasting benefit</w:t>
+      </w:r>
+      <w:r>
+        <w:t xml:space="preserve">. Short-term forms help depression and anxiety, and specialised forms help borderline personality disorder, while classical long analysis stays hard to study. </w:t>
       </w:r>
       <w:r>
         <w:rPr>
@@ -1321,7 +1336,7 @@
               <w:t xml:space="preserve">• </w:t>
             </w:r>
             <w:r>
-              <w:t>Formulation: the symptom is a compromise formation that symbolises unconscious conflict.</w:t>
+              <w:t>Formulation: the symptom is a compromise formation that stands for a hidden conflict.</w:t>
             </w:r>
           </w:p>
           <w:p>
@@ -1337,7 +1352,7 @@
               <w:t xml:space="preserve">• </w:t>
             </w:r>
             <w:r>
-              <w:t>Process: opening, transference, working through, termination; indicated for ego-strong neurotic clients.</w:t>
+              <w:t>Process: opening, transference, working through, termination; best for ego-strong neurotic clients.</w:t>
             </w:r>
           </w:p>
         </w:tc>
@@ -1373,7 +1388,7 @@
         <w:rPr>
           <w:i/>
         </w:rPr>
-        <w:t>Brief psychotherapy is a planned, time-limited treatment that works on one agreed focus with an active, directive therapist, using the deadline itself to mobilise motivation, so that symptoms ease and functioning is restored without attempting a full personality overhaul.</w:t>
+        <w:t>Brief psychotherapy is planned, time-limited treatment. Therapist and client agree on one problem to work on, and the therapist stays active and directive. The fixed deadline is used on purpose to fire up motivation. The aim is to ease symptoms and restore functioning, not to remake the whole personality.</w:t>
       </w:r>
     </w:p>
     <w:p>
@@ -1435,7 +1450,7 @@
               <w:t>planned time limit</w:t>
             </w:r>
             <w:r>
-              <w:t xml:space="preserve">, a single focus and an active therapist, and they rest on the finding that most improvement happens early, with roughly half of clients improved within about eight sessions. </w:t>
+              <w:t xml:space="preserve">, a single focus and an active therapist. They rest on a well-known finding: most improvement happens early, with about half of clients better within roughly eight sessions. </w:t>
             </w:r>
             <w:r>
               <w:rPr>
@@ -1465,7 +1480,7 @@
               <w:t>Malan, Sifneos, Mann and Davanloo</w:t>
             </w:r>
             <w:r>
-              <w:t xml:space="preserve"> with their focal, short-term anxiety-provoking, time-limited and intensive short-term dynamic therapies, alongside interpersonal therapy and solution-focused brief therapy. </w:t>
+              <w:t xml:space="preserve">, each with their own short, focused dynamic therapy. Alongside them sit interpersonal therapy and solution-focused brief therapy. </w:t>
             </w:r>
             <w:r>
               <w:rPr>
@@ -1495,7 +1510,7 @@
               <w:t>World Health Organization</w:t>
             </w:r>
             <w:r>
-              <w:t xml:space="preserve"> promotes brief, structured psychological interventions in routine care, framing them as effective help delivered through </w:t>
+              <w:t xml:space="preserve"> promotes brief, structured psychological help in routine care. It frames this as real help given through </w:t>
             </w:r>
             <w:r>
               <w:rPr>
@@ -1504,7 +1519,7 @@
               <w:t>respectful, collaborative</w:t>
             </w:r>
             <w:r>
-              <w:t xml:space="preserve"> conversation within a few sessions. </w:t>
+              <w:t xml:space="preserve"> talk within a few sessions. </w:t>
             </w:r>
             <w:r>
               <w:rPr>
@@ -1549,7 +1564,7 @@
         <w:t>Ferenczi and Rank's</w:t>
       </w:r>
       <w:r>
-        <w:t xml:space="preserve"> active technique and set time limits in the 1920s and from </w:t>
+        <w:t xml:space="preserve"> active, time-limited technique in the 1920s. It also grows from </w:t>
       </w:r>
       <w:r>
         <w:rPr>
@@ -1582,7 +1597,7 @@
         <w:t>origin</w:t>
       </w:r>
       <w:r>
-        <w:t xml:space="preserve"> then branches into many models, including </w:t>
+        <w:t xml:space="preserve"> then branches into many models. The psychodynamic stream has </w:t>
       </w:r>
       <w:r>
         <w:rPr>
@@ -1591,7 +1606,7 @@
         <w:t>Malan, Sifneos, Mann and Davanloo</w:t>
       </w:r>
       <w:r>
-        <w:t xml:space="preserve"> in the psychodynamic stream and </w:t>
+        <w:t xml:space="preserve">; the systemic stream has </w:t>
       </w:r>
       <w:r>
         <w:rPr>
@@ -1600,7 +1615,7 @@
         <w:t>de Shazer and Berg's</w:t>
       </w:r>
       <w:r>
-        <w:t xml:space="preserve"> solution-focused therapy in the systemic stream. </w:t>
+        <w:t xml:space="preserve"> solution-focused therapy. </w:t>
       </w:r>
       <w:r>
         <w:rPr>
@@ -1624,7 +1639,7 @@
         <w:t>origin</w:t>
       </w:r>
       <w:r>
-        <w:t xml:space="preserve"> driver was service pressure, since cost, demand and the evidence that </w:t>
+        <w:t xml:space="preserve"> driver was service pressure. Cost, long waiting lists and the proof that </w:t>
       </w:r>
       <w:r>
         <w:rPr>
@@ -1633,7 +1648,7 @@
         <w:t>most gains come early</w:t>
       </w:r>
       <w:r>
-        <w:t xml:space="preserve"> pushed clinicians toward shorter, planned treatments. </w:t>
+        <w:t xml:space="preserve"> all pushed clinicians toward shorter, planned treatment. </w:t>
       </w:r>
       <w:r>
         <w:rPr>
@@ -1657,7 +1672,7 @@
         <w:t>time limit is therapeutic</w:t>
       </w:r>
       <w:r>
-        <w:t xml:space="preserve">, because a known end date mobilises motivation, concentrates the work and guards against the regression and dependency that an open-ended course can breed. </w:t>
+        <w:t xml:space="preserve">. A known end date lights a fire under the work. It concentrates effort and guards against the drift and over-dependence that an open-ended course can breed. </w:t>
       </w:r>
       <w:r>
         <w:rPr>
@@ -1681,19 +1696,19 @@
         <w:rPr>
           <w:i/>
         </w:rPr>
-        <w:t>(a single agreed problem or theme that organises the whole treatment)</w:t>
-      </w:r>
-      <w:r>
-        <w:t xml:space="preserve">, so the therapist is </w:t>
-      </w:r>
-      <w:r>
-        <w:rPr>
-          <w:b/>
-        </w:rPr>
-        <w:t>active, directive and selective</w:t>
-      </w:r>
-      <w:r>
-        <w:t xml:space="preserve">, steering the sessions back to the one theme rather than following every new concern. </w:t>
+        <w:t>(one agreed problem or theme that the whole therapy is built around)</w:t>
+      </w:r>
+      <w:r>
+        <w:t xml:space="preserve">. The therapist is </w:t>
+      </w:r>
+      <w:r>
+        <w:rPr>
+          <w:b/>
+        </w:rPr>
+        <w:t>active and directive</w:t>
+      </w:r>
+      <w:r>
+        <w:t xml:space="preserve">, steering sessions back to the one theme instead of chasing every new worry. </w:t>
       </w:r>
       <w:r>
         <w:rPr>
@@ -1708,16 +1723,16 @@
         <w:pStyle w:val="ListBullet"/>
       </w:pPr>
       <w:r>
-        <w:t xml:space="preserve">A third basis is optimism about change, emphasising the </w:t>
-      </w:r>
-      <w:r>
-        <w:rPr>
-          <w:b/>
-        </w:rPr>
-        <w:t>here-and-now, the client's strengths</w:t>
-      </w:r>
-      <w:r>
-        <w:t xml:space="preserve"> and the assumption that small changes can set off larger ones, especially in the solution-focused models. </w:t>
+        <w:t xml:space="preserve">A third basis is hope about change. The work stresses the </w:t>
+      </w:r>
+      <w:r>
+        <w:rPr>
+          <w:b/>
+        </w:rPr>
+        <w:t>here-and-now and the client's strengths</w:t>
+      </w:r>
+      <w:r>
+        <w:t xml:space="preserve">. It assumes a small change can set off bigger ones, especially in the solution-focused models. </w:t>
       </w:r>
       <w:r>
         <w:rPr>
@@ -1750,7 +1765,7 @@
         <w:t>focal formulation</w:t>
       </w:r>
       <w:r>
-        <w:t xml:space="preserve">, naming a recurring interpersonal pattern, a current loss or an unresolved conflict tied to the present problem, which keeps the brief work on target. </w:t>
+        <w:t xml:space="preserve">. This names one recurring relationship pattern, a current loss or an unresolved conflict tied to the present problem, and keeps the work on target. </w:t>
       </w:r>
       <w:r>
         <w:rPr>
@@ -1774,7 +1789,7 @@
         <w:t>interpersonal therapy's four problem areas</w:t>
       </w:r>
       <w:r>
-        <w:t xml:space="preserve">, namely grief, role disputes, role transitions and interpersonal deficits, one of which is chosen as the focus. </w:t>
+        <w:t xml:space="preserve">: grief, role disputes, role transitions and interpersonal deficits. One of these is picked as the focus. </w:t>
       </w:r>
       <w:r>
         <w:rPr>
@@ -1798,7 +1813,7 @@
         <w:t>goals</w:t>
       </w:r>
       <w:r>
-        <w:t xml:space="preserve"> are modest and clear, to </w:t>
+        <w:t xml:space="preserve"> are modest and clear: </w:t>
       </w:r>
       <w:r>
         <w:rPr>
@@ -1807,7 +1822,7 @@
         <w:t>resolve the focal problem</w:t>
       </w:r>
       <w:r>
-        <w:t xml:space="preserve">, relieve symptoms and restore previous functioning, plus teaching the client skills to use later, rather than reconstructing the whole personality. </w:t>
+        <w:t xml:space="preserve">, relieve symptoms and restore how the person was functioning before. The therapist also teaches skills for later, rather than rebuilding the personality. </w:t>
       </w:r>
       <w:r>
         <w:rPr>
@@ -1840,7 +1855,7 @@
         <w:t>patient selection</w:t>
       </w:r>
       <w:r>
-        <w:t xml:space="preserve">, and Sifneos' criteria look for a circumscribed complaint, at least one meaningful past relationship, psychological-mindedness, motivation and the capacity to tolerate anxiety. </w:t>
+        <w:t xml:space="preserve">. Sifneos' criteria look for one clear complaint, at least one meaningful past relationship, curiosity about the mind, motivation and the ability to bear some anxiety. </w:t>
       </w:r>
       <w:r>
         <w:rPr>
@@ -1864,7 +1879,7 @@
         <w:t>contract</w:t>
       </w:r>
       <w:r>
-        <w:t xml:space="preserve"> is itself a technique, typically </w:t>
+        <w:t xml:space="preserve"> is itself a technique. It is usually </w:t>
       </w:r>
       <w:r>
         <w:rPr>
@@ -1873,7 +1888,7 @@
         <w:t>6 to 20 sessions</w:t>
       </w:r>
       <w:r>
-        <w:t xml:space="preserve">, often around twelve to sixteen, with a fixed end date agreed at the outset so that both parties work against the clock. </w:t>
+        <w:t xml:space="preserve">, often around twelve to sixteen, with a fixed end date set at the start, so both people work against the clock. </w:t>
       </w:r>
       <w:r>
         <w:rPr>
@@ -1897,16 +1912,7 @@
         <w:t>techniques</w:t>
       </w:r>
       <w:r>
-        <w:t xml:space="preserve"> include focused interpretation, selective attention and inattention, gentle challenge of defences and the deliberate use of </w:t>
-      </w:r>
-      <w:r>
-        <w:rPr>
-          <w:b/>
-        </w:rPr>
-        <w:t>positive transference</w:t>
-      </w:r>
-      <w:r>
-        <w:t xml:space="preserve"> to keep the client engaged with the focus. </w:t>
+        <w:t xml:space="preserve"> include focused interpretation and choosing what to notice and what to let pass. The therapist gently challenges defences and uses the client's warm feelings toward the therapist to keep them engaged with the focus. </w:t>
       </w:r>
       <w:r>
         <w:rPr>
@@ -1930,7 +1936,7 @@
         <w:t>techniques</w:t>
       </w:r>
       <w:r>
-        <w:t xml:space="preserve"> are distinctive, among them the </w:t>
+        <w:t xml:space="preserve"> are distinctive. They include the </w:t>
       </w:r>
       <w:r>
         <w:t xml:space="preserve">miracle question </w:t>
@@ -1939,10 +1945,10 @@
         <w:rPr>
           <w:i/>
         </w:rPr>
-        <w:t>(asking how life would look if the problem vanished overnight)</w:t>
-      </w:r>
-      <w:r>
-        <w:t xml:space="preserve">, scaling questions, hunting for exceptions and complimenting the client's existing resources. </w:t>
+        <w:t>(asking: if you woke up and the problem had vanished overnight, what would be different?)</w:t>
+      </w:r>
+      <w:r>
+        <w:t xml:space="preserve">, scaling questions, hunting for times the problem was absent, and praising the client's existing strengths. </w:t>
       </w:r>
       <w:r>
         <w:rPr>
@@ -1966,7 +1972,7 @@
         <w:t>stages and process</w:t>
       </w:r>
       <w:r>
-        <w:t xml:space="preserve"> the work runs from </w:t>
+        <w:t xml:space="preserve"> the work runs in three parts. First is </w:t>
       </w:r>
       <w:r>
         <w:rPr>
@@ -1975,7 +1981,7 @@
         <w:t>assessment and selection</w:t>
       </w:r>
       <w:r>
-        <w:t xml:space="preserve"> in the first few sessions, through an active </w:t>
+        <w:t xml:space="preserve"> in the early sessions. Then an active </w:t>
       </w:r>
       <w:r>
         <w:rPr>
@@ -1984,7 +1990,7 @@
         <w:t>middle phase</w:t>
       </w:r>
       <w:r>
-        <w:t xml:space="preserve"> on the focus with a mid-point review, to an explicit </w:t>
+        <w:t xml:space="preserve"> on the focus, with a mid-point review. Finally an explicit </w:t>
       </w:r>
       <w:r>
         <w:rPr>
@@ -1993,7 +1999,7 @@
         <w:t>termination</w:t>
       </w:r>
       <w:r>
-        <w:t xml:space="preserve"> that consolidates gains. </w:t>
+        <w:t xml:space="preserve"> that locks in the gains. </w:t>
       </w:r>
       <w:r>
         <w:rPr>
@@ -2017,7 +2023,7 @@
         <w:t>termination is discussed from the start</w:t>
       </w:r>
       <w:r>
-        <w:t xml:space="preserve">, so the ending is planned, the gains are reviewed and a booster or follow-up session may be arranged rather than the therapy simply trailing off. </w:t>
+        <w:t xml:space="preserve">. The ending is planned, the gains are reviewed, and a booster or follow-up session may be arranged, so therapy does not just trail off. </w:t>
       </w:r>
       <w:r>
         <w:rPr>
@@ -2041,7 +2047,7 @@
         <w:t>outcome</w:t>
       </w:r>
       <w:r>
-        <w:t xml:space="preserve"> is symptom relief and improved functioning, and many comparisons find brief therapy </w:t>
+        <w:t xml:space="preserve"> is symptom relief and better functioning. Many comparisons find brief therapy </w:t>
       </w:r>
       <w:r>
         <w:rPr>
@@ -2050,7 +2056,7 @@
         <w:t>as effective as longer therapy</w:t>
       </w:r>
       <w:r>
-        <w:t xml:space="preserve"> for common disorders such as depression, anxiety and adjustment problems. </w:t>
+        <w:t xml:space="preserve"> for common problems like depression, anxiety and adjustment difficulties. </w:t>
       </w:r>
       <w:r>
         <w:rPr>
@@ -2071,7 +2077,7 @@
         <w:t>Indications</w:t>
       </w:r>
       <w:r>
-        <w:t xml:space="preserve"> are acute and focal problems, adjustment disorders, mild to moderate depression and anxiety, grief and crises in motivated clients, while chronic multi-problem conditions and severe high-risk states are </w:t>
+        <w:t xml:space="preserve"> are sharp, focal problems: adjustment disorders, mild to moderate depression and anxiety, grief and crises, in motivated clients. Chronic, many-sided conditions and severe high-risk states are </w:t>
       </w:r>
       <w:r>
         <w:rPr>
@@ -2110,10 +2116,10 @@
         <w:rPr>
           <w:b/>
         </w:rPr>
-        <w:t>interpersonal therapy and brief cognitive-behavioural therapy</w:t>
-      </w:r>
-      <w:r>
-        <w:t xml:space="preserve"> and supportive for short-term psychodynamic and solution-focused work, and brief models are now standard in primary care, student counselling and telehealth. </w:t>
+        <w:t>interpersonal therapy and brief CBT</w:t>
+      </w:r>
+      <w:r>
+        <w:t xml:space="preserve">, and supportive for short-term psychodynamic and solution-focused work. Brief models are now standard in primary care, student counselling and telehealth. </w:t>
       </w:r>
       <w:r>
         <w:rPr>
@@ -2220,7 +2226,7 @@
         <w:rPr>
           <w:i/>
         </w:rPr>
-        <w:t>Humanistic psychotherapy is the third force in psychology, a growth-oriented movement that trusts the person's own actualising tendency, centres subjective experience, free will and the whole person, and makes the genuine therapeutic relationship, rather than technique, the main agent of change.</w:t>
+        <w:t>Humanistic psychotherapy is the 'third force' in psychology. It is a growth-focused approach that trusts each person's natural drive to grow. It centres on how things feel from the inside, on free choice, and on the whole person. The genuine relationship, not clever technique, is what mostly heals.</w:t>
       </w:r>
     </w:p>
     <w:p>
@@ -2282,7 +2288,7 @@
               <w:t>APA Dictionary of Psychology</w:t>
             </w:r>
             <w:r>
-              <w:t xml:space="preserve"> characterises </w:t>
+              <w:t xml:space="preserve"> describes </w:t>
             </w:r>
             <w:r>
               <w:t xml:space="preserve">humanistic therapy </w:t>
@@ -2291,19 +2297,19 @@
               <w:rPr>
                 <w:i/>
               </w:rPr>
-              <w:t>(an approach stressing growth, choice and the whole person)</w:t>
-            </w:r>
-            <w:r>
-              <w:t xml:space="preserve"> as an approach arising from humanistic psychology that emphasises the person's </w:t>
+              <w:t>(an approach that stresses growth, free choice and treating the whole person, not just symptoms)</w:t>
+            </w:r>
+            <w:r>
+              <w:t xml:space="preserve"> as a therapy from humanistic psychology. It emphasises the person's </w:t>
             </w:r>
             <w:r>
               <w:rPr>
                 <w:b/>
               </w:rPr>
-              <w:t>capacity for growth, self-direction and self-actualisation</w:t>
-            </w:r>
-            <w:r>
-              <w:t xml:space="preserve"> and the quality of the therapeutic relationship. </w:t>
+              <w:t>capacity for growth and self-direction</w:t>
+            </w:r>
+            <w:r>
+              <w:t xml:space="preserve"> and the quality of the relationship. </w:t>
             </w:r>
             <w:r>
               <w:rPr>
@@ -2333,7 +2339,7 @@
               <w:t>third force</w:t>
             </w:r>
             <w:r>
-              <w:t xml:space="preserve"> in the 1950s and 1960s, reacting against the determinism of psychoanalysis and the mechanism of behaviourism, and drew figures such as </w:t>
+              <w:t xml:space="preserve"> in the 1950s and 1960s. It pushed back against the determinism of psychoanalysis and the machine-like view of behaviourism, and drew figures like </w:t>
             </w:r>
             <w:r>
               <w:rPr>
@@ -2372,7 +2378,7 @@
               <w:t>Maslow's</w:t>
             </w:r>
             <w:r>
-              <w:t xml:space="preserve"> hierarchy of needs, from physiological and safety needs up to </w:t>
+              <w:t xml:space="preserve"> hierarchy of needs runs from food and safety up to </w:t>
             </w:r>
             <w:r>
               <w:t xml:space="preserve">self-actualisation </w:t>
@@ -2381,10 +2387,10 @@
               <w:rPr>
                 <w:i/>
               </w:rPr>
-              <w:t>(becoming the fullest version of oneself)</w:t>
-            </w:r>
-            <w:r>
-              <w:t xml:space="preserve">, frames distress as what happens when growth needs are blocked. </w:t>
+              <w:t>(becoming the fullest, best version of yourself)</w:t>
+            </w:r>
+            <w:r>
+              <w:t xml:space="preserve">. It frames distress as what happens when growth needs get blocked. </w:t>
             </w:r>
             <w:r>
               <w:rPr>
@@ -2429,7 +2435,7 @@
         <w:t>1950s and 1960s</w:t>
       </w:r>
       <w:r>
-        <w:t xml:space="preserve"> as the self-styled third force, a deliberate reaction against both psychoanalytic determinism and behaviourist mechanism, with the Association for Humanistic Psychology founded in 1961. </w:t>
+        <w:t xml:space="preserve"> as the self-styled third force. It was a deliberate reaction against both psychoanalytic determinism and behaviourist mechanism. The Association for Humanistic Psychology was founded in 1961. </w:t>
       </w:r>
       <w:r>
         <w:rPr>
@@ -2453,7 +2459,7 @@
         <w:t>origin</w:t>
       </w:r>
       <w:r>
-        <w:t xml:space="preserve"> gathers several figures under one banner, since </w:t>
+        <w:t xml:space="preserve"> gathers several figures under one banner. </w:t>
       </w:r>
       <w:r>
         <w:rPr>
@@ -2486,7 +2492,7 @@
         <w:t>inherently good and growth-oriented</w:t>
       </w:r>
       <w:r>
-        <w:t xml:space="preserve">, carrying an </w:t>
+        <w:t xml:space="preserve">. Each person carries an </w:t>
       </w:r>
       <w:r>
         <w:t xml:space="preserve">actualising tendency </w:t>
@@ -2495,10 +2501,10 @@
         <w:rPr>
           <w:i/>
         </w:rPr>
-        <w:t>(an innate drive toward growth and fulfilment)</w:t>
-      </w:r>
-      <w:r>
-        <w:t xml:space="preserve"> that moves them toward fulfilment when conditions allow. </w:t>
+        <w:t>(an inborn drive to grow and become your best self, like a seed that naturally pushes toward the light)</w:t>
+      </w:r>
+      <w:r>
+        <w:t xml:space="preserve"> that moves them forward when conditions allow. </w:t>
       </w:r>
       <w:r>
         <w:rPr>
@@ -2513,16 +2519,16 @@
         <w:pStyle w:val="ListBullet"/>
       </w:pPr>
       <w:r>
-        <w:t xml:space="preserve">A second basis is the emphasis on </w:t>
-      </w:r>
-      <w:r>
-        <w:rPr>
-          <w:b/>
-        </w:rPr>
-        <w:t>subjective experience, free will, choice and responsibility</w:t>
-      </w:r>
-      <w:r>
-        <w:t xml:space="preserve">, treating the person's own point of view and the here-and-now as the proper focus rather than drives or conditioning. </w:t>
+        <w:t xml:space="preserve">A second basis is the stress on </w:t>
+      </w:r>
+      <w:r>
+        <w:rPr>
+          <w:b/>
+        </w:rPr>
+        <w:t>subjective experience, free will and responsibility</w:t>
+      </w:r>
+      <w:r>
+        <w:t xml:space="preserve">. The person's own point of view and the here-and-now are the proper focus, rather than drives or conditioning. </w:t>
       </w:r>
       <w:r>
         <w:rPr>
@@ -2546,7 +2552,7 @@
         <w:t>whole person</w:t>
       </w:r>
       <w:r>
-        <w:t xml:space="preserve"> in context, so the approach resists reducing a human being to symptoms, reflexes or diagnostic labels. </w:t>
+        <w:t xml:space="preserve"> in context. The approach refuses to shrink a human being down to symptoms, reflexes or a diagnostic label. </w:t>
       </w:r>
       <w:r>
         <w:rPr>
@@ -2570,7 +2576,7 @@
         <w:t>Maslow</w:t>
       </w:r>
       <w:r>
-        <w:t xml:space="preserve">, is the hierarchy of needs, in which physiological, safety, belonging and esteem needs build toward self-actualisation, and blocked growth needs produce distress. </w:t>
+        <w:t xml:space="preserve">, is the hierarchy of needs. Physiological, safety, belonging and esteem needs build up toward self-actualisation, and blocked growth needs produce distress. </w:t>
       </w:r>
       <w:r>
         <w:rPr>
@@ -2594,7 +2600,7 @@
         <w:t>formulation</w:t>
       </w:r>
       <w:r>
-        <w:t xml:space="preserve">, distress is understood as </w:t>
+        <w:t xml:space="preserve">, distress is seen as </w:t>
       </w:r>
       <w:r>
         <w:rPr>
@@ -2603,7 +2609,7 @@
         <w:t>natural growth being blocked</w:t>
       </w:r>
       <w:r>
-        <w:t xml:space="preserve"> by a hostile environment, by </w:t>
+        <w:t xml:space="preserve">. It is blocked by a harsh environment, by </w:t>
       </w:r>
       <w:r>
         <w:t xml:space="preserve">conditions of worth </w:t>
@@ -2612,10 +2618,10 @@
         <w:rPr>
           <w:i/>
         </w:rPr>
-        <w:t>(approval given only when a person meets others' standards)</w:t>
-      </w:r>
-      <w:r>
-        <w:t xml:space="preserve">, or by losing touch with one's own experience. </w:t>
+        <w:t>(the feeling that you are only loved or valued when you meet other people's standards)</w:t>
+      </w:r>
+      <w:r>
+        <w:t xml:space="preserve">, or by losing touch with your own feelings. </w:t>
       </w:r>
       <w:r>
         <w:rPr>
@@ -2630,7 +2636,7 @@
         <w:pStyle w:val="ListBullet"/>
       </w:pPr>
       <w:r>
-        <w:t xml:space="preserve">A key formulation idea is that symptoms reflect </w:t>
+        <w:t xml:space="preserve">A key formulation idea is that symptoms show </w:t>
       </w:r>
       <w:r>
         <w:rPr>
@@ -2639,7 +2645,7 @@
         <w:t>disconnection from experience</w:t>
       </w:r>
       <w:r>
-        <w:t xml:space="preserve"> rather than disease, so the aim is to restore awareness and self-direction rather than to correct a defect. </w:t>
+        <w:t xml:space="preserve">, not disease. So the aim is to restore awareness and self-direction, not to fix a defect. In plain terms, the person has drifted away from what they truly feel. </w:t>
       </w:r>
       <w:r>
         <w:rPr>
@@ -2669,10 +2675,10 @@
         <w:rPr>
           <w:b/>
         </w:rPr>
-        <w:t>self-awareness, self-acceptance, authenticity</w:t>
-      </w:r>
-      <w:r>
-        <w:t xml:space="preserve"> and personal growth, helping the person take responsibility and move toward self-actualisation in their own way. </w:t>
+        <w:t>self-awareness, self-acceptance and authenticity</w:t>
+      </w:r>
+      <w:r>
+        <w:t xml:space="preserve">, plus personal growth. Therapy helps the person take responsibility and move toward self-actualisation in their own way. </w:t>
       </w:r>
       <w:r>
         <w:rPr>
@@ -2705,7 +2711,7 @@
         <w:t>relationship itself</w:t>
       </w:r>
       <w:r>
-        <w:t xml:space="preserve"> is the main agent of change, so a genuine, accepting and empathic presence matters more than any specific technique. </w:t>
+        <w:t xml:space="preserve"> is the main healer. A genuine, accepting, empathic presence matters more than any particular technique. </w:t>
       </w:r>
       <w:r>
         <w:rPr>
@@ -2735,10 +2741,10 @@
         <w:rPr>
           <w:b/>
         </w:rPr>
-        <w:t>empathic listening, reflection and unconditional acceptance</w:t>
-      </w:r>
-      <w:r>
-        <w:t xml:space="preserve">, offered in a non-directive, client-led manner that follows the person rather than steering them. </w:t>
+        <w:t>empathic listening, reflection</w:t>
+      </w:r>
+      <w:r>
+        <w:t xml:space="preserve"> and unconditional acceptance. They are offered in a non-directive, client-led way that follows the person rather than steering them. </w:t>
       </w:r>
       <w:r>
         <w:rPr>
@@ -2762,7 +2768,7 @@
         <w:t>techniques</w:t>
       </w:r>
       <w:r>
-        <w:t xml:space="preserve"> are also used, including focusing on the </w:t>
+        <w:t xml:space="preserve"> are also used, like focusing on the </w:t>
       </w:r>
       <w:r>
         <w:rPr>
@@ -2771,7 +2777,7 @@
         <w:t>bodily felt sense</w:t>
       </w:r>
       <w:r>
-        <w:t xml:space="preserve"> and chair work, which help the person contact and process emotion in the present moment. </w:t>
+        <w:t xml:space="preserve"> and chair work. These help the person contact and process emotion in the present moment. For example, noticing a tight chest can open up a feeling the person could not name. </w:t>
       </w:r>
       <w:r>
         <w:rPr>
@@ -2804,7 +2810,7 @@
         <w:t>client-led and unfolding</w:t>
       </w:r>
       <w:r>
-        <w:t xml:space="preserve"> rather than staged by the therapist, moving as the person feels safe enough to explore, deepen awareness and reclaim ownership of their experience. </w:t>
+        <w:t xml:space="preserve">, not staged by the therapist. It moves as the person feels safe enough to explore, deepen awareness and take back ownership of their experience. </w:t>
       </w:r>
       <w:r>
         <w:rPr>
@@ -2825,10 +2831,10 @@
         <w:rPr>
           <w:b/>
         </w:rPr>
-        <w:t>genuine presence and congruence</w:t>
-      </w:r>
-      <w:r>
-        <w:t xml:space="preserve"> from the therapist, which lowers the client's defences and frees the actualising tendency to resume its natural course. </w:t>
+        <w:t>genuine presence</w:t>
+      </w:r>
+      <w:r>
+        <w:t xml:space="preserve"> and congruence from the therapist. This lowers the client's defences and frees the actualising tendency to resume its natural course. </w:t>
       </w:r>
       <w:r>
         <w:rPr>
@@ -2852,16 +2858,16 @@
         <w:t>outcome</w:t>
       </w:r>
       <w:r>
-        <w:t xml:space="preserve"> sought is increased </w:t>
-      </w:r>
-      <w:r>
-        <w:rPr>
-          <w:b/>
-        </w:rPr>
-        <w:t>self-esteem, congruence and emotional awareness</w:t>
-      </w:r>
-      <w:r>
-        <w:t xml:space="preserve">, together with greater relationship satisfaction and a more internal sense of direction. </w:t>
+        <w:t xml:space="preserve"> sought is more </w:t>
+      </w:r>
+      <w:r>
+        <w:rPr>
+          <w:b/>
+        </w:rPr>
+        <w:t>self-esteem and emotional awareness</w:t>
+      </w:r>
+      <w:r>
+        <w:t xml:space="preserve">, together with better relationships and a stronger inner sense of direction. </w:t>
       </w:r>
       <w:r>
         <w:rPr>
@@ -2882,7 +2888,7 @@
         <w:t>Indications</w:t>
       </w:r>
       <w:r>
-        <w:t xml:space="preserve"> cover mild to moderate distress, identity and relationship problems, depression and anxiety and clients seeking growth, while severe psychosis or a need for structured skills training are better served </w:t>
+        <w:t xml:space="preserve"> cover mild to moderate distress, identity and relationship problems, depression and anxiety, and clients seeking growth. Severe psychosis or a need for structured skills training is better served, </w:t>
       </w:r>
       <w:r>
         <w:rPr>
@@ -2891,7 +2897,7 @@
         <w:t>as a contraindication</w:t>
       </w:r>
       <w:r>
-        <w:t xml:space="preserve"> by more directive work. </w:t>
+        <w:t xml:space="preserve">, by more directive work. </w:t>
       </w:r>
       <w:r>
         <w:rPr>
@@ -2924,7 +2930,7 @@
         <w:t>Elliott and colleagues</w:t>
       </w:r>
       <w:r>
-        <w:t xml:space="preserve"> report that humanistic-experiential therapies produce large, stable gains and are broadly equivalent to cognitive-behavioural therapy in many comparisons. </w:t>
+        <w:t xml:space="preserve"> find humanistic-experiential therapies give large, stable gains. They are broadly equal to CBT in many comparisons. </w:t>
       </w:r>
       <w:r>
         <w:rPr>
@@ -2939,7 +2945,7 @@
         <w:pStyle w:val="ListBullet"/>
       </w:pPr>
       <w:r>
-        <w:t xml:space="preserve">The approach remains alive in modern forms such as </w:t>
+        <w:t xml:space="preserve">The approach stays alive in modern forms like </w:t>
       </w:r>
       <w:r>
         <w:rPr>
@@ -2948,7 +2954,7 @@
         <w:t>emotion-focused therapy and motivational interviewing</w:t>
       </w:r>
       <w:r>
-        <w:t xml:space="preserve">, though critics note that its concepts are vague, hard to test and perhaps over-optimistic about human nature. </w:t>
+        <w:t xml:space="preserve">. Critics still say its concepts are vague, hard to test and perhaps too rosy about human nature. </w:t>
       </w:r>
       <w:r>
         <w:rPr>
@@ -3055,7 +3061,7 @@
         <w:rPr>
           <w:i/>
         </w:rPr>
-        <w:t>Existential psychotherapy helps people face the unavoidable givens of existence, death, freedom, isolation and meaninglessness, so that the anxiety these provoke is met honestly and turned into authentic, responsible and meaningful living rather than avoided through symptoms.</w:t>
+        <w:t>Existential psychotherapy helps people face the hard facts of being alive: death, freedom, aloneness and the search for meaning. These facts stir up anxiety. Instead of dodging that anxiety through symptoms, the client meets it honestly and turns it into a more genuine, responsible and meaningful life.</w:t>
       </w:r>
     </w:p>
     <w:p>
@@ -3117,7 +3123,7 @@
               <w:t>Yalom</w:t>
             </w:r>
             <w:r>
-              <w:t xml:space="preserve"> frames existential therapy around four </w:t>
+              <w:t xml:space="preserve"> builds existential therapy around four </w:t>
             </w:r>
             <w:r>
               <w:t xml:space="preserve">ultimate concerns </w:t>
@@ -3126,10 +3132,10 @@
               <w:rPr>
                 <w:i/>
               </w:rPr>
-              <w:t>(the unavoidable givens of existence that provoke anxiety)</w:t>
-            </w:r>
-            <w:r>
-              <w:t xml:space="preserve">, namely </w:t>
+              <w:t>(the unavoidable facts of life that stir up anxiety in everyone)</w:t>
+            </w:r>
+            <w:r>
+              <w:t xml:space="preserve">: </w:t>
             </w:r>
             <w:r>
               <w:rPr>
@@ -3138,7 +3144,7 @@
               <w:t>death, freedom, isolation and meaninglessness</w:t>
             </w:r>
             <w:r>
-              <w:t xml:space="preserve">, and holds that confronting them produces anxiety that avoidance turns into symptoms. </w:t>
+              <w:t xml:space="preserve">. Facing them causes anxiety, and dodging that anxiety is what turns into symptoms. </w:t>
             </w:r>
             <w:r>
               <w:rPr>
@@ -3177,7 +3183,7 @@
               <w:t>will to meaning</w:t>
             </w:r>
             <w:r>
-              <w:t xml:space="preserve">, and his Man's Search for Meaning, formed from his concentration-camp experience, argues that meaning can be found even in unavoidable suffering. </w:t>
+              <w:t xml:space="preserve">. His book Man's Search for Meaning, born from his time in a concentration camp, argues that meaning can be found even in suffering we cannot escape. </w:t>
             </w:r>
             <w:r>
               <w:rPr>
@@ -3198,7 +3204,7 @@
               <w:t xml:space="preserve">Theoretical view: </w:t>
             </w:r>
             <w:r>
-              <w:t xml:space="preserve"> The approach draws on </w:t>
+              <w:t xml:space="preserve"> The approach draws on philosophers </w:t>
             </w:r>
             <w:r>
               <w:rPr>
@@ -3207,7 +3213,7 @@
               <w:t>Kierkegaard, Nietzsche, Heidegger and Sartre</w:t>
             </w:r>
             <w:r>
-              <w:t xml:space="preserve"> and on clinicians such as </w:t>
+              <w:t xml:space="preserve">, and on clinicians like </w:t>
             </w:r>
             <w:r>
               <w:rPr>
@@ -3216,7 +3222,7 @@
               <w:t>Binswanger, Boss and May</w:t>
             </w:r>
             <w:r>
-              <w:t xml:space="preserve">, giving it a strongly philosophical character. </w:t>
+              <w:t xml:space="preserve">. This gives it a strongly philosophical flavour. </w:t>
             </w:r>
             <w:r>
               <w:rPr>
@@ -3261,7 +3267,7 @@
         <w:t>Kierkegaard, Nietzsche, Heidegger and Sartre</w:t>
       </w:r>
       <w:r>
-        <w:t xml:space="preserve"> and clinical roots in Binswanger and Boss's Daseinsanalysis, which applied phenomenology to the suffering person. </w:t>
+        <w:t xml:space="preserve">. Its clinical roots are in Binswanger and Boss's Daseinsanalysis, which applied phenomenology to the suffering person. </w:t>
       </w:r>
       <w:r>
         <w:rPr>
@@ -3303,7 +3309,7 @@
         <w:t>May's</w:t>
       </w:r>
       <w:r>
-        <w:t xml:space="preserve"> Existence in 1958 and </w:t>
+        <w:t xml:space="preserve"> book Existence in 1958, and </w:t>
       </w:r>
       <w:r>
         <w:rPr>
@@ -3327,7 +3333,7 @@
         <w:pStyle w:val="ListBullet"/>
       </w:pPr>
       <w:r>
-        <w:t xml:space="preserve">The first basis is that existence involves unavoidable </w:t>
+        <w:t xml:space="preserve">The first basis is that life brings unavoidable </w:t>
       </w:r>
       <w:r>
         <w:rPr>
@@ -3336,7 +3342,7 @@
         <w:t>ultimate concerns</w:t>
       </w:r>
       <w:r>
-        <w:t xml:space="preserve">, so that death, freedom, isolation and meaninglessness confront everyone and generate an </w:t>
+        <w:t xml:space="preserve">. Death, freedom, isolation and meaninglessness face everyone. They create an </w:t>
       </w:r>
       <w:r>
         <w:t xml:space="preserve">existential anxiety </w:t>
@@ -3345,7 +3351,7 @@
         <w:rPr>
           <w:i/>
         </w:rPr>
-        <w:t>(the dread that arises from facing the basic conditions of existence)</w:t>
+        <w:t>(the deep unease that comes from facing the basic facts of being alive)</w:t>
       </w:r>
       <w:r>
         <w:t xml:space="preserve"> that cannot simply be cured away. </w:t>
@@ -3372,7 +3378,7 @@
         <w:t>existence precedes essence</w:t>
       </w:r>
       <w:r>
-        <w:t xml:space="preserve">, meaning we create ourselves through our choices, so that </w:t>
+        <w:t xml:space="preserve">. In plain words, you are not born with a fixed self; you create yourself through your choices. So </w:t>
       </w:r>
       <w:r>
         <w:t xml:space="preserve">authenticity </w:t>
@@ -3381,10 +3387,10 @@
         <w:rPr>
           <w:i/>
         </w:rPr>
-        <w:t>(living in accordance with one's own values and choices)</w:t>
-      </w:r>
-      <w:r>
-        <w:t xml:space="preserve"> stands against living in bad faith. </w:t>
+        <w:t>(living by your own real values and choices rather than just going along with others)</w:t>
+      </w:r>
+      <w:r>
+        <w:t xml:space="preserve"> stands against living a borrowed life. </w:t>
       </w:r>
       <w:r>
         <w:rPr>
@@ -3408,7 +3414,7 @@
         <w:t>Heidegger</w:t>
       </w:r>
       <w:r>
-        <w:t xml:space="preserve">, is being-in-the-world across the physical, social and personal worlds, together with Frankl's conviction that a </w:t>
+        <w:t xml:space="preserve">, is being-in-the-world across the physical, social and personal worlds. Frankl adds that a </w:t>
       </w:r>
       <w:r>
         <w:rPr>
@@ -3417,7 +3423,7 @@
         <w:t>will to meaning</w:t>
       </w:r>
       <w:r>
-        <w:t xml:space="preserve"> is the deepest human motive. </w:t>
+        <w:t xml:space="preserve"> is the deepest human drive. </w:t>
       </w:r>
       <w:r>
         <w:rPr>
@@ -3441,7 +3447,7 @@
         <w:t>formulation</w:t>
       </w:r>
       <w:r>
-        <w:t xml:space="preserve">, psychopathology is read as </w:t>
+        <w:t xml:space="preserve">, mental trouble is read as </w:t>
       </w:r>
       <w:r>
         <w:rPr>
@@ -3450,7 +3456,7 @@
         <w:t>inauthentic living</w:t>
       </w:r>
       <w:r>
-        <w:t xml:space="preserve">, the avoidance of freedom and responsibility, loss of meaning or failure to cope with death and isolation. </w:t>
+        <w:t xml:space="preserve">. It is the avoidance of freedom and responsibility, the loss of meaning, or the failure to cope with death and aloneness. </w:t>
       </w:r>
       <w:r>
         <w:rPr>
@@ -3474,10 +3480,10 @@
         <w:rPr>
           <w:i/>
         </w:rPr>
-        <w:t>(a sense of emptiness and boredom from loss of meaning)</w:t>
-      </w:r>
-      <w:r>
-        <w:t xml:space="preserve">, an emptiness and boredom arising from lost meaning that he called noogenic neurosis. </w:t>
+        <w:t>(a hollow feeling of emptiness and boredom that comes when life seems to have no meaning)</w:t>
+      </w:r>
+      <w:r>
+        <w:t xml:space="preserve">, which he called noogenic neurosis. </w:t>
       </w:r>
       <w:r>
         <w:rPr>
@@ -3510,7 +3516,7 @@
         <w:t>face life's givens honestly</w:t>
       </w:r>
       <w:r>
-        <w:t xml:space="preserve"> and to increase awareness, responsibility, authenticity and meaning, committing to action even in the presence of anxiety. </w:t>
+        <w:t xml:space="preserve">. Therapy builds awareness, responsibility, authenticity and meaning, and encourages the person to act even while anxiety is present. </w:t>
       </w:r>
       <w:r>
         <w:rPr>
@@ -3543,7 +3549,7 @@
         <w:t>phenomenological exploration</w:t>
       </w:r>
       <w:r>
-        <w:t xml:space="preserve"> of the client's own worldview, with the therapist bracketing assumptions and using Socratic dialogue to examine values, choices and avoidances. </w:t>
+        <w:t xml:space="preserve"> of the client's own world. The therapist sets aside their own assumptions and uses Socratic questioning to examine the client's values, choices and avoidances. </w:t>
       </w:r>
       <w:r>
         <w:rPr>
@@ -3567,7 +3573,7 @@
         <w:t>relationship</w:t>
       </w:r>
       <w:r>
-        <w:t xml:space="preserve"> is used as a laboratory, and encouraging </w:t>
+        <w:t xml:space="preserve"> is used as a testing ground. Encouraging </w:t>
       </w:r>
       <w:r>
         <w:rPr>
@@ -3576,7 +3582,7 @@
         <w:t>'I' statements</w:t>
       </w:r>
       <w:r>
-        <w:t xml:space="preserve"> that own experience helps the client take responsibility rather than treating problems as things that merely happen to them. </w:t>
+        <w:t xml:space="preserve"> that own experience helps the client take responsibility, instead of treating problems as things that just happen to them. </w:t>
       </w:r>
       <w:r>
         <w:rPr>
@@ -3609,10 +3615,10 @@
         <w:rPr>
           <w:i/>
         </w:rPr>
-        <w:t>(deliberately trying to do the very thing one fears)</w:t>
-      </w:r>
-      <w:r>
-        <w:t xml:space="preserve">, in which the client intends the feared symptom, which often loosens the anticipatory anxiety behind phobias and insomnia. </w:t>
+        <w:t>(deliberately trying to do the very thing you fear, which often drains the fear away)</w:t>
+      </w:r>
+      <w:r>
+        <w:t xml:space="preserve">. The client who fears blushing, for example, tries to blush on purpose, and the anticipatory anxiety loosens. </w:t>
       </w:r>
       <w:r>
         <w:rPr>
@@ -3645,10 +3651,10 @@
         <w:rPr>
           <w:i/>
         </w:rPr>
-        <w:t>(shifting attention away from the self toward meaningful activity)</w:t>
-      </w:r>
-      <w:r>
-        <w:t xml:space="preserve">, turning the client's focus from anxious self-monitoring onto meaningful activity and other people. </w:t>
+        <w:t>(taking your attention off yourself and your symptom and putting it onto something meaningful instead)</w:t>
+      </w:r>
+      <w:r>
+        <w:t xml:space="preserve">. The client stops anxiously watching themselves and turns toward meaningful activity and other people. </w:t>
       </w:r>
       <w:r>
         <w:rPr>
@@ -3669,10 +3675,10 @@
         <w:rPr>
           <w:b/>
         </w:rPr>
-        <w:t>attitudinal modification</w:t>
-      </w:r>
-      <w:r>
-        <w:t xml:space="preserve">, helping the client find meaning in unavoidable suffering, which is central when the situation itself cannot be changed. </w:t>
+        <w:t>attitude change</w:t>
+      </w:r>
+      <w:r>
+        <w:t xml:space="preserve">. The therapist helps the client find meaning in suffering that cannot be changed, which matters most when the situation itself is fixed. </w:t>
       </w:r>
       <w:r>
         <w:rPr>
@@ -3696,7 +3702,7 @@
         <w:t>stages and process</w:t>
       </w:r>
       <w:r>
-        <w:t xml:space="preserve"> the work establishes a </w:t>
+        <w:t xml:space="preserve">, the work first builds a </w:t>
       </w:r>
       <w:r>
         <w:rPr>
@@ -3705,7 +3711,7 @@
         <w:t>genuine relationship</w:t>
       </w:r>
       <w:r>
-        <w:t xml:space="preserve"> and explores the worldview, then identifies patterns of avoidance and inauthenticity, deepens awareness of freedom and responsibility, and ends in committed action. </w:t>
+        <w:t xml:space="preserve"> and explores the client's worldview. It then spots patterns of avoidance, deepens awareness of freedom and responsibility, and ends in committed action. </w:t>
       </w:r>
       <w:r>
         <w:rPr>
@@ -3729,7 +3735,7 @@
         <w:t>collaborative and exploratory</w:t>
       </w:r>
       <w:r>
-        <w:t xml:space="preserve"> rather than technique-driven, so the therapist accompanies the client in facing hard truths rather than fixing a defect. </w:t>
+        <w:t xml:space="preserve">, not driven by technique. The therapist walks alongside the client in facing hard truths, rather than repairing a defect. </w:t>
       </w:r>
       <w:r>
         <w:rPr>
@@ -3753,16 +3759,16 @@
         <w:t>outcome</w:t>
       </w:r>
       <w:r>
-        <w:t xml:space="preserve"> sought is greater </w:t>
-      </w:r>
-      <w:r>
-        <w:rPr>
-          <w:b/>
-        </w:rPr>
-        <w:t>meaning, purpose and authenticity</w:t>
-      </w:r>
-      <w:r>
-        <w:t xml:space="preserve"> and an increased ability to tolerate anxiety, so the person lives more deliberately in the face of life's givens. </w:t>
+        <w:t xml:space="preserve"> sought is more </w:t>
+      </w:r>
+      <w:r>
+        <w:rPr>
+          <w:b/>
+        </w:rPr>
+        <w:t>meaning and authenticity</w:t>
+      </w:r>
+      <w:r>
+        <w:t xml:space="preserve"> and a greater ability to tolerate anxiety. The person then lives more deliberately in the face of life's givens. </w:t>
       </w:r>
       <w:r>
         <w:rPr>
@@ -3783,7 +3789,7 @@
         <w:t>Indications</w:t>
       </w:r>
       <w:r>
-        <w:t xml:space="preserve"> include existential crises such as life transitions, midlife and bereavement, terminal or chronic illness, and depression marked by emptiness, while acute psychosis and a wish for quick symptom control are relative </w:t>
+        <w:t xml:space="preserve"> include existential crises such as life transitions, midlife and bereavement, terminal or chronic illness, and depression marked by emptiness. Acute psychosis and a wish for quick symptom control are relative </w:t>
       </w:r>
       <w:r>
         <w:rPr>
@@ -3825,7 +3831,7 @@
         <w:t>moderate</w:t>
       </w:r>
       <w:r>
-        <w:t xml:space="preserve">, with meaning-centred interventions showing benefit for meaning, mood and quality of life, especially in people with cancer, while critics note the concepts are abstract and hard to operationalise. </w:t>
+        <w:t xml:space="preserve">. Meaning-centred interventions help meaning, mood and quality of life, especially in people with cancer. Critics note the concepts are abstract and hard to pin down for testing. </w:t>
       </w:r>
       <w:r>
         <w:rPr>
@@ -3932,7 +3938,7 @@
         <w:rPr>
           <w:i/>
         </w:rPr>
-        <w:t>Gestalt therapy is an experiential, here-and-now approach developed by Fritz and Laura Perls in which awareness itself is curative, the therapist sets up experiments rather than giving interpretations, and the client completes unfinished business and reowns split-off parts to become more whole.</w:t>
+        <w:t>Gestalt therapy is a hands-on, here-and-now approach from Fritz and Laura Perls. Its key idea is that awareness itself heals. The therapist sets up live experiments rather than giving interpretations. The client finishes 'unfinished business' and takes back disowned parts of themselves, so as to become more whole.</w:t>
       </w:r>
     </w:p>
     <w:p>
@@ -3994,7 +4000,7 @@
               <w:t>APA Dictionary of Psychology</w:t>
             </w:r>
             <w:r>
-              <w:t xml:space="preserve"> characterises </w:t>
+              <w:t xml:space="preserve"> describes </w:t>
             </w:r>
             <w:r>
               <w:t xml:space="preserve">gestalt therapy </w:t>
@@ -4003,10 +4009,10 @@
               <w:rPr>
                 <w:i/>
               </w:rPr>
-              <w:t>(an experiential therapy centred on present awareness and the whole person)</w:t>
-            </w:r>
-            <w:r>
-              <w:t xml:space="preserve"> as an experiential approach that emphasises </w:t>
+              <w:t>(a hands-on therapy focused on present-moment awareness and the whole person)</w:t>
+            </w:r>
+            <w:r>
+              <w:t xml:space="preserve"> as an experiential approach. It stresses </w:t>
             </w:r>
             <w:r>
               <w:rPr>
@@ -4015,7 +4021,7 @@
               <w:t>present experience and awareness</w:t>
             </w:r>
             <w:r>
-              <w:t xml:space="preserve">, integrating feelings, perceptions and actions into the whole person. </w:t>
+              <w:t xml:space="preserve"> and brings feelings, perceptions and actions together into the whole person. </w:t>
             </w:r>
             <w:r>
               <w:rPr>
@@ -4045,7 +4051,7 @@
               <w:t>Fritz Perls, Laura Perls and Paul Goodman</w:t>
             </w:r>
             <w:r>
-              <w:t xml:space="preserve"> from psychoanalysis, Gestalt psychology and field theory, and was made popular in the 1960s at the Esalen Institute. </w:t>
+              <w:t xml:space="preserve"> from psychoanalysis, Gestalt psychology and field theory. It became popular in the 1960s at the Esalen Institute. </w:t>
             </w:r>
             <w:r>
               <w:rPr>
@@ -4075,10 +4081,10 @@
               <w:rPr>
                 <w:i/>
               </w:rPr>
-              <w:t>(change happens when a person accepts what they are, not when they force what they are not)</w:t>
-            </w:r>
-            <w:r>
-              <w:t xml:space="preserve">, which Beisser stated as change coming when a person fully becomes what they are. </w:t>
+              <w:t>(the odd truth that you change by fully accepting who you are now, not by forcing yourself to be someone else)</w:t>
+            </w:r>
+            <w:r>
+              <w:t xml:space="preserve">. Beisser put it as change coming when a person fully becomes what they are. </w:t>
             </w:r>
             <w:r>
               <w:rPr>
@@ -4123,7 +4129,7 @@
         <w:t>Fritz and Laura Perls with Paul Goodman</w:t>
       </w:r>
       <w:r>
-        <w:t xml:space="preserve"> in the 1940s and 1950s, drawing on psychoanalysis, Gestalt psychology, Reich's body work and Lewin's field theory. </w:t>
+        <w:t xml:space="preserve"> in the 1940s and 1950s. They drew on psychoanalysis, Gestalt psychology, Reich's body work and Lewin's field theory. </w:t>
       </w:r>
       <w:r>
         <w:rPr>
@@ -4156,7 +4162,7 @@
         <w:t>1960s at Esalen</w:t>
       </w:r>
       <w:r>
-        <w:t xml:space="preserve">, where Perls' charismatic demonstrations made the empty-chair style famous, for better and worse. </w:t>
+        <w:t xml:space="preserve">. There Perls' bold live demonstrations made the empty-chair style famous, for better and worse. </w:t>
       </w:r>
       <w:r>
         <w:rPr>
@@ -4180,7 +4186,7 @@
         <w:t>holism and field theory</w:t>
       </w:r>
       <w:r>
-        <w:t xml:space="preserve">, the view that person and environment form a single field, so behaviour is understood in context rather than in isolation. </w:t>
+        <w:t xml:space="preserve">: person and environment form one single field. So behaviour is understood in its context, not in isolation. </w:t>
       </w:r>
       <w:r>
         <w:rPr>
@@ -4204,7 +4210,7 @@
         <w:t>here-and-now</w:t>
       </w:r>
       <w:r>
-        <w:t xml:space="preserve">, focusing on the </w:t>
+        <w:t xml:space="preserve">. The focus is on the </w:t>
       </w:r>
       <w:r>
         <w:rPr>
@@ -4213,7 +4219,7 @@
         <w:t>what and how</w:t>
       </w:r>
       <w:r>
-        <w:t xml:space="preserve"> of present experience rather than the why, because awareness in the present moment is held to be curative. </w:t>
+        <w:t xml:space="preserve"> of present experience, not the why. This is because awareness in the present moment is what heals. </w:t>
       </w:r>
       <w:r>
         <w:rPr>
@@ -4237,7 +4243,7 @@
         <w:t>figure and ground</w:t>
       </w:r>
       <w:r>
-        <w:t xml:space="preserve">, in which the dominant need becomes the </w:t>
+        <w:t xml:space="preserve">. The strongest need of the moment rises up to become the </w:t>
       </w:r>
       <w:r>
         <w:t xml:space="preserve">figure </w:t>
@@ -4246,10 +4252,10 @@
         <w:rPr>
           <w:i/>
         </w:rPr>
-        <w:t>(the need or interest that stands out from the background at a given moment)</w:t>
-      </w:r>
-      <w:r>
-        <w:t xml:space="preserve"> against the background, guided by organismic self-regulation. </w:t>
+        <w:t>(the one need or interest that stands out from everything else right now, like a craving when you are hungry)</w:t>
+      </w:r>
+      <w:r>
+        <w:t xml:space="preserve"> against the background. </w:t>
       </w:r>
       <w:r>
         <w:rPr>
@@ -4273,10 +4279,10 @@
         <w:rPr>
           <w:i/>
         </w:rPr>
-        <w:t>(unexpressed feelings from the past that intrude on the present)</w:t>
-      </w:r>
-      <w:r>
-        <w:t xml:space="preserve">, the unexpressed feelings that press for attention and interfere with living fully in the present. </w:t>
+        <w:t>(old, unexpressed feelings from the past that keep nagging and spilling into the present)</w:t>
+      </w:r>
+      <w:r>
+        <w:t xml:space="preserve">. These press for attention and stop a person living fully now. </w:t>
       </w:r>
       <w:r>
         <w:rPr>
@@ -4300,7 +4306,7 @@
         <w:t>formulation</w:t>
       </w:r>
       <w:r>
-        <w:t xml:space="preserve">, disturbance arises from </w:t>
+        <w:t xml:space="preserve">, trouble comes from </w:t>
       </w:r>
       <w:r>
         <w:rPr>
@@ -4309,7 +4315,7 @@
         <w:t>interruptions to contact</w:t>
       </w:r>
       <w:r>
-        <w:t xml:space="preserve"> at the boundary, named as introjection, projection, </w:t>
+        <w:t xml:space="preserve"> at the boundary with others. These are named introjection, projection, </w:t>
       </w:r>
       <w:r>
         <w:t xml:space="preserve">retroflection </w:t>
@@ -4318,7 +4324,7 @@
         <w:rPr>
           <w:i/>
         </w:rPr>
-        <w:t>(turning back onto oneself what one would like to do to or get from others)</w:t>
+        <w:t>(turning back on yourself what you really want to do to someone else, like getting angry at yourself instead of them)</w:t>
       </w:r>
       <w:r>
         <w:t xml:space="preserve">, deflection and confluence. </w:t>
@@ -4345,7 +4351,7 @@
         <w:t>Perls' layers of neurosis</w:t>
       </w:r>
       <w:r>
-        <w:t xml:space="preserve">, the phony, phobic, impasse, implosive and explosive layers through which a client passes toward authentic contact. </w:t>
+        <w:t xml:space="preserve">: the phony, phobic, impasse, implosive and explosive layers. A client passes through them on the way to genuine contact. </w:t>
       </w:r>
       <w:r>
         <w:rPr>
@@ -4369,7 +4375,7 @@
         <w:t>top-dog versus underdog</w:t>
       </w:r>
       <w:r>
-        <w:t xml:space="preserve"> split, the inner conflict between the demanding shoulds and the resistant wants that keeps a person stuck. </w:t>
+        <w:t xml:space="preserve"> split. This is the inner tug-of-war between the bossy 'you should' and the stubborn 'I won't', which keeps a person stuck. </w:t>
       </w:r>
       <w:r>
         <w:rPr>
@@ -4402,7 +4408,7 @@
         <w:t>increase awareness</w:t>
       </w:r>
       <w:r>
-        <w:t xml:space="preserve">, take responsibility, integrate split-off parts, complete unfinished business and shift from relying on the environment toward self-support. </w:t>
+        <w:t xml:space="preserve">, take responsibility, join up split-off parts, finish unfinished business and shift from leaning on others toward self-support. </w:t>
       </w:r>
       <w:r>
         <w:rPr>
@@ -4435,10 +4441,10 @@
         <w:rPr>
           <w:i/>
         </w:rPr>
-        <w:t>(speaking to an imagined person or part of oneself placed in an empty chair)</w:t>
-      </w:r>
-      <w:r>
-        <w:t xml:space="preserve">, a dialogue with an absent person or a part of the self that brings a conflict into the room. </w:t>
+        <w:t>(talking to an imagined person, or a part of yourself, pictured sitting in an empty chair)</w:t>
+      </w:r>
+      <w:r>
+        <w:t xml:space="preserve">. This brings an absent person or an inner conflict right into the room. </w:t>
       </w:r>
       <w:r>
         <w:rPr>
@@ -4471,7 +4477,7 @@
         <w:t>exaggerating a gesture</w:t>
       </w:r>
       <w:r>
-        <w:t xml:space="preserve">, reversal and staying with the feeling, each designed as an experiment that heightens awareness rather than as an interpretation. </w:t>
+        <w:t xml:space="preserve">, reversal and staying with the feeling. Each is an experiment meant to heighten awareness, not an interpretation handed down by the therapist. </w:t>
       </w:r>
       <w:r>
         <w:rPr>
@@ -4495,7 +4501,7 @@
         <w:t>techniques</w:t>
       </w:r>
       <w:r>
-        <w:t xml:space="preserve"> matter too, replacing 'it' and 'you' with </w:t>
+        <w:t xml:space="preserve"> matter too. The client swaps 'it' and 'you' for </w:t>
       </w:r>
       <w:r>
         <w:rPr>
@@ -4504,7 +4510,7 @@
         <w:t>'I' statements</w:t>
       </w:r>
       <w:r>
-        <w:t xml:space="preserve"> and 'I can't' with 'I won't', so the client owns experience and choice in the present tense. </w:t>
+        <w:t xml:space="preserve">, and 'I can't' for 'I won't'. This way they own their experience and their choices in the present tense. </w:t>
       </w:r>
       <w:r>
         <w:rPr>
@@ -4525,7 +4531,7 @@
         <w:t>Dream work</w:t>
       </w:r>
       <w:r>
-        <w:t xml:space="preserve"> is distinctive, treating every part of a dream as a projected piece of the dreamer, who then plays each part to reclaim it. </w:t>
+        <w:t xml:space="preserve"> is distinctive. Every part of a dream is treated as a cast-off piece of the dreamer, who then plays each part out loud to reclaim it. </w:t>
       </w:r>
       <w:r>
         <w:rPr>
@@ -4558,7 +4564,7 @@
         <w:t>contact and the I-Thou relationship</w:t>
       </w:r>
       <w:r>
-        <w:t xml:space="preserve">, through awareness work and experiments that heighten contact, to integration and closure of what was unfinished. </w:t>
+        <w:t xml:space="preserve">, through awareness work and experiments that heighten contact, to integration and the closing of what was unfinished. </w:t>
       </w:r>
       <w:r>
         <w:rPr>
@@ -4588,10 +4594,10 @@
         <w:rPr>
           <w:b/>
         </w:rPr>
-        <w:t>authentic, present and non-interpretative</w:t>
-      </w:r>
-      <w:r>
-        <w:t xml:space="preserve">, offering experiments and honest feedback rather than analysing from a distance. </w:t>
+        <w:t>authentic and present</w:t>
+      </w:r>
+      <w:r>
+        <w:t xml:space="preserve">, not interpretative. They offer experiments and honest feedback rather than analysing from a distance. </w:t>
       </w:r>
       <w:r>
         <w:rPr>
@@ -4615,16 +4621,16 @@
         <w:t>outcome</w:t>
       </w:r>
       <w:r>
-        <w:t xml:space="preserve"> sought is greater </w:t>
-      </w:r>
-      <w:r>
-        <w:rPr>
-          <w:b/>
-        </w:rPr>
-        <w:t>awareness, responsibility and emotional expression</w:t>
-      </w:r>
-      <w:r>
-        <w:t xml:space="preserve">, fuller integration and more vital interpersonal functioning. </w:t>
+        <w:t xml:space="preserve"> sought is more </w:t>
+      </w:r>
+      <w:r>
+        <w:rPr>
+          <w:b/>
+        </w:rPr>
+        <w:t>awareness and responsibility</w:t>
+      </w:r>
+      <w:r>
+        <w:t xml:space="preserve">, freer emotional expression, fuller integration and more lively relationships. </w:t>
       </w:r>
       <w:r>
         <w:rPr>
@@ -4645,7 +4651,7 @@
         <w:t>Indications</w:t>
       </w:r>
       <w:r>
-        <w:t xml:space="preserve"> include anxiety, depression, interpersonal and psychosomatic problems and trauma-related unfinished business, while very confrontational experiments are a </w:t>
+        <w:t xml:space="preserve"> include anxiety, depression, relationship and psychosomatic problems, and trauma-related unfinished business. Very confrontational experiments are a </w:t>
       </w:r>
       <w:r>
         <w:rPr>
@@ -4654,7 +4660,7 @@
         <w:t>contraindication</w:t>
       </w:r>
       <w:r>
-        <w:t xml:space="preserve"> for fragile or psychotic clients who may be overwhelmed. </w:t>
+        <w:t xml:space="preserve"> for fragile or psychotic clients, who may be overwhelmed. </w:t>
       </w:r>
       <w:r>
         <w:rPr>
@@ -4678,7 +4684,7 @@
         <w:t>research and current status</w:t>
       </w:r>
       <w:r>
-        <w:t xml:space="preserve">, the empirical base is </w:t>
+        <w:t xml:space="preserve">, the evidence base is </w:t>
       </w:r>
       <w:r>
         <w:rPr>
@@ -4687,7 +4693,7 @@
         <w:t>limited but growing</w:t>
       </w:r>
       <w:r>
-        <w:t xml:space="preserve">, and the strongest support comes through emotion-focused therapy, where Greenberg and colleagues show that empty-chair work for unfinished business is effective. </w:t>
+        <w:t xml:space="preserve">. The strongest support comes through emotion-focused therapy, where Greenberg and colleagues show empty-chair work for unfinished business is effective. </w:t>
       </w:r>
       <w:r>
         <w:rPr>
@@ -4794,7 +4800,7 @@
         <w:rPr>
           <w:i/>
         </w:rPr>
-        <w:t>Person-centred therapy is Carl Rogers' non-directive approach in which the therapist's congruence, unconditional positive regard and empathy are held to be the necessary and sufficient conditions that free the client's actualising tendency, so the client, as the expert on themselves, directs their own change.</w:t>
+        <w:t>Person-centred therapy is Carl Rogers' non-directive approach. The therapist offers three things: being real, accepting the client fully, and truly understanding them. Rogers held that these are enough on their own to free the client's natural drive to grow. The client is the expert on themselves and leads their own change.</w:t>
       </w:r>
     </w:p>
     <w:p>
@@ -4856,7 +4862,7 @@
               <w:t>APA Dictionary of Psychology</w:t>
             </w:r>
             <w:r>
-              <w:t xml:space="preserve"> characterises </w:t>
+              <w:t xml:space="preserve"> describes </w:t>
             </w:r>
             <w:r>
               <w:t xml:space="preserve">person-centered therapy </w:t>
@@ -4865,7 +4871,7 @@
               <w:rPr>
                 <w:i/>
               </w:rPr>
-              <w:t>(Rogers' non-directive therapy built on empathy, congruence and acceptance)</w:t>
+              <w:t>(Rogers' non-directive therapy built on being genuine, accepting and empathic)</w:t>
             </w:r>
             <w:r>
               <w:t xml:space="preserve"> as the non-directive form of therapy developed by </w:t>
@@ -4877,7 +4883,7 @@
               <w:t>Carl Rogers</w:t>
             </w:r>
             <w:r>
-              <w:t xml:space="preserve">, in which the therapist's genuineness, unconditional positive regard and empathic understanding foster the client's growth. </w:t>
+              <w:t xml:space="preserve">. The therapist's genuineness, unconditional positive regard and empathy help the client grow. </w:t>
             </w:r>
             <w:r>
               <w:rPr>
@@ -4907,7 +4913,7 @@
               <w:t>Rogers</w:t>
             </w:r>
             <w:r>
-              <w:t xml:space="preserve"> introduced non-directive counselling in 1942 and set out his </w:t>
+              <w:t xml:space="preserve"> introduced non-directive counselling in 1942. In 1957 he set out his </w:t>
             </w:r>
             <w:r>
               <w:rPr>
@@ -4916,7 +4922,7 @@
               <w:t>six necessary and sufficient conditions</w:t>
             </w:r>
             <w:r>
-              <w:t xml:space="preserve"> of therapeutic change in 1957, grounding the approach in the actualising tendency. </w:t>
+              <w:t xml:space="preserve"> for change, grounding the approach in the actualising tendency. </w:t>
             </w:r>
             <w:r>
               <w:rPr>
@@ -4946,7 +4952,7 @@
               <w:t>humanistic yet distinct</w:t>
             </w:r>
             <w:r>
-              <w:t xml:space="preserve">, since it is Rogers' specific model built on the core conditions, whereas humanistic therapy names the broader third-force movement. </w:t>
+              <w:t xml:space="preserve">. It is Rogers' specific model built on the core conditions, whereas humanistic therapy names the broader third-force movement. </w:t>
             </w:r>
             <w:r>
               <w:rPr>
@@ -4991,7 +4997,7 @@
         <w:t>Carl Rogers</w:t>
       </w:r>
       <w:r>
-        <w:t xml:space="preserve">, whose Counseling and Psychotherapy of 1942 introduced non-directive counselling and whose Client-Centered Therapy of 1951 named the model. </w:t>
+        <w:t xml:space="preserve">. His book Counseling and Psychotherapy in 1942 introduced non-directive counselling, and his Client-Centered Therapy in 1951 named the model. </w:t>
       </w:r>
       <w:r>
         <w:rPr>
@@ -5015,7 +5021,7 @@
         <w:t>person-centred approach</w:t>
       </w:r>
       <w:r>
-        <w:t xml:space="preserve"> applied to education, groups and conflict resolution, and he pioneered recording and studying sessions, which began an empirical tradition in therapy research. </w:t>
+        <w:t xml:space="preserve"> for education, groups and conflict resolution. He also pioneered recording and studying real sessions, which started an empirical tradition in therapy research. </w:t>
       </w:r>
       <w:r>
         <w:rPr>
@@ -5039,10 +5045,10 @@
         <w:rPr>
           <w:i/>
         </w:rPr>
-        <w:t>(the single inbuilt drive of the organism toward growth and fulfilment)</w:t>
-      </w:r>
-      <w:r>
-        <w:t xml:space="preserve">, the single motivating force that moves every organism toward growth and fulfilment when conditions allow. </w:t>
+        <w:t>(the one inbuilt drive in every person to grow and fulfil their potential, like a plant growing toward the sun)</w:t>
+      </w:r>
+      <w:r>
+        <w:t xml:space="preserve">. It moves the person toward growth whenever conditions allow. </w:t>
       </w:r>
       <w:r>
         <w:rPr>
@@ -5066,7 +5072,7 @@
         <w:t>self-concept and the ideal self</w:t>
       </w:r>
       <w:r>
-        <w:t xml:space="preserve">, together with the organismic valuing process by which a healthy person trusts their own experiencing as a guide. </w:t>
+        <w:t xml:space="preserve"> (how you see yourself versus who you wish you were). A healthy person also trusts their own gut sense of experience as a guide. </w:t>
       </w:r>
       <w:r>
         <w:rPr>
@@ -5090,10 +5096,10 @@
         <w:rPr>
           <w:i/>
         </w:rPr>
-        <w:t>(the sense that one is valued only when meeting others' standards)</w:t>
-      </w:r>
-      <w:r>
-        <w:t xml:space="preserve">, formed when love and approval are conditional, which lead the person to distort or deny experiences that conflict with them. </w:t>
+        <w:t>(the belief that you only deserve love and approval when you meet other people's standards)</w:t>
+      </w:r>
+      <w:r>
+        <w:t xml:space="preserve">. They form when love was conditional, and they push the person to deny feelings that clash with them. </w:t>
       </w:r>
       <w:r>
         <w:rPr>
@@ -5117,7 +5123,7 @@
         <w:t>incongruence</w:t>
       </w:r>
       <w:r>
-        <w:t xml:space="preserve">, the gap between self-concept and experience, or between real and ideal self, which produces anxiety and defensiveness, so that restoring congruence is the mark of health. </w:t>
+        <w:t xml:space="preserve">: the gap between how you see yourself and what you actually feel, or between your real and ideal self. This gap produces anxiety and defensiveness. Closing the gap is the mark of health. </w:t>
       </w:r>
       <w:r>
         <w:rPr>
@@ -5141,7 +5147,7 @@
         <w:t>formulation</w:t>
       </w:r>
       <w:r>
-        <w:t xml:space="preserve">, problems are understood as </w:t>
+        <w:t xml:space="preserve">, problems are seen as </w:t>
       </w:r>
       <w:r>
         <w:rPr>
@@ -5150,7 +5156,7 @@
         <w:t>incongruence caused by conditions of worth</w:t>
       </w:r>
       <w:r>
-        <w:t xml:space="preserve">, so therapy is not a technical repair but the provision of conditions in which the actualising tendency can resume. </w:t>
+        <w:t xml:space="preserve">. So therapy is not a technical repair; it provides the conditions in which the growth drive can start up again. </w:t>
       </w:r>
       <w:r>
         <w:rPr>
@@ -5174,7 +5180,7 @@
         <w:t>Rogers' six conditions</w:t>
       </w:r>
       <w:r>
-        <w:t xml:space="preserve">, of which the three therapist-offered core conditions are congruence, unconditional positive regard and empathy. </w:t>
+        <w:t xml:space="preserve">. The three offered by the therapist, the 'core conditions', are congruence, unconditional positive regard and empathy. </w:t>
       </w:r>
       <w:r>
         <w:rPr>
@@ -5198,10 +5204,10 @@
         <w:rPr>
           <w:i/>
         </w:rPr>
-        <w:t>(the therapist being genuine and integrated, not playing a role)</w:t>
-      </w:r>
-      <w:r>
-        <w:t xml:space="preserve">, the therapist being real and integrated in the relationship rather than hiding behind a professional facade. </w:t>
+        <w:t>(the therapist being real and honest, not hiding behind a professional mask)</w:t>
+      </w:r>
+      <w:r>
+        <w:t xml:space="preserve">. The therapist is genuine and whole in the relationship. </w:t>
       </w:r>
       <w:r>
         <w:rPr>
@@ -5225,10 +5231,10 @@
         <w:rPr>
           <w:i/>
         </w:rPr>
-        <w:t>(accepting and prizing the client without conditions)</w:t>
-      </w:r>
-      <w:r>
-        <w:t xml:space="preserve">, a warm, non-judgemental acceptance of the client as a person whatever they bring. </w:t>
+        <w:t>(warmly accepting and valuing the client no matter what they bring, with no strings attached)</w:t>
+      </w:r>
+      <w:r>
+        <w:t xml:space="preserve">. </w:t>
       </w:r>
       <w:r>
         <w:rPr>
@@ -5252,7 +5258,7 @@
         <w:t>empathy</w:t>
       </w:r>
       <w:r>
-        <w:t xml:space="preserve">, an accurate understanding of the client's internal frame of reference that is communicated back so the client feels deeply understood. </w:t>
+        <w:t xml:space="preserve">: accurately grasping the client's inner world and reflecting it back, so the client feels deeply understood. </w:t>
       </w:r>
       <w:r>
         <w:rPr>
@@ -5276,7 +5282,7 @@
         <w:t>goals</w:t>
       </w:r>
       <w:r>
-        <w:t xml:space="preserve"> are greater </w:t>
+        <w:t xml:space="preserve"> are more </w:t>
       </w:r>
       <w:r>
         <w:rPr>
@@ -5285,7 +5291,7 @@
         <w:t>congruence and self-acceptance</w:t>
       </w:r>
       <w:r>
-        <w:t xml:space="preserve">, an internal locus of evaluation and movement toward becoming a fully functioning person who is open to experience. </w:t>
+        <w:t xml:space="preserve">, judging yourself by your own standards rather than others', and becoming a fully functioning person who is open to experience. </w:t>
       </w:r>
       <w:r>
         <w:rPr>
@@ -5318,7 +5324,7 @@
         <w:t>non-directive</w:t>
       </w:r>
       <w:r>
-        <w:t xml:space="preserve">, so the therapist does not interpret, diagnose, advise or reassure, but trusts the client as the expert on themselves. </w:t>
+        <w:t xml:space="preserve">. The therapist does not interpret, diagnose, advise or reassure. Instead they trust the client as the expert on their own life. </w:t>
       </w:r>
       <w:r>
         <w:rPr>
@@ -5342,7 +5348,7 @@
         <w:t>techniques</w:t>
       </w:r>
       <w:r>
-        <w:t xml:space="preserve">, insofar as the model allows them, are </w:t>
+        <w:t xml:space="preserve">, as far as the model allows them, are </w:t>
       </w:r>
       <w:r>
         <w:rPr>
@@ -5351,7 +5357,7 @@
         <w:t>active and reflective listening</w:t>
       </w:r>
       <w:r>
-        <w:t xml:space="preserve">, reflection of feeling, paraphrase, clarification and the acceptance of silences, offered within a genuine relationship. </w:t>
+        <w:t xml:space="preserve">, reflecting feelings, paraphrasing, clarifying and allowing silences, all within a genuine relationship. </w:t>
       </w:r>
       <w:r>
         <w:rPr>
@@ -5384,7 +5390,7 @@
         <w:t>seven-stage continuum</w:t>
       </w:r>
       <w:r>
-        <w:t xml:space="preserve"> along which the client moves from rigid remoteness from feelings toward fluid, immediate and trusted experiencing. </w:t>
+        <w:t xml:space="preserve">. The client moves from being rigid and cut off from feelings toward feelings that flow freely, arrive in the moment, and can be trusted. </w:t>
       </w:r>
       <w:r>
         <w:rPr>
@@ -5408,7 +5414,7 @@
         <w:t>process</w:t>
       </w:r>
       <w:r>
-        <w:t xml:space="preserve"> is that the client talks while the therapist reflects, and as the client feels understood and accepted, defences lower, </w:t>
+        <w:t xml:space="preserve"> is simple: the client talks and the therapist reflects. As the client feels understood and accepted, defences drop, </w:t>
       </w:r>
       <w:r>
         <w:rPr>
@@ -5417,7 +5423,7 @@
         <w:t>self-exploration deepens</w:t>
       </w:r>
       <w:r>
-        <w:t xml:space="preserve"> and self-directed change emerges. </w:t>
+        <w:t xml:space="preserve">, and self-directed change appears. </w:t>
       </w:r>
       <w:r>
         <w:rPr>
@@ -5441,7 +5447,7 @@
         <w:t>outcome</w:t>
       </w:r>
       <w:r>
-        <w:t xml:space="preserve"> sought is increased self-acceptance and congruence, an internal locus of evaluation, reduced anxiety and defensiveness and improved, self-directed relationships. </w:t>
+        <w:t xml:space="preserve"> sought is more self-acceptance and congruence, an inner source of judgement, less anxiety and defensiveness, and better, self-directed relationships. </w:t>
       </w:r>
       <w:r>
         <w:rPr>
@@ -5462,7 +5468,7 @@
         <w:t>Indications</w:t>
       </w:r>
       <w:r>
-        <w:t xml:space="preserve"> are wide, covering mild to moderate emotional, identity and relationship problems, grief, adolescents and student counselling, while clients wanting direct advice, severe disorders or acute crises are relative </w:t>
+        <w:t xml:space="preserve"> are wide: mild to moderate emotional, identity and relationship problems, grief, adolescents and student counselling. Clients wanting direct advice, or with severe disorders or acute crises, are relative </w:t>
       </w:r>
       <w:r>
         <w:rPr>
@@ -5504,7 +5510,7 @@
         <w:t>pioneer of therapy research</w:t>
       </w:r>
       <w:r>
-        <w:t xml:space="preserve">, and meta-analyses by Elliott and colleagues find that empathy, positive regard and congruence correlate modestly but reliably with outcome, though critics challenge the claim that the conditions are sufficient on their own. </w:t>
+        <w:t xml:space="preserve">. Meta-analyses by Elliott and colleagues find empathy, positive regard and congruence link modestly but reliably with good outcome, though critics doubt they are enough on their own. </w:t>
       </w:r>
       <w:r>
         <w:rPr>
@@ -5611,7 +5617,7 @@
         <w:rPr>
           <w:i/>
         </w:rPr>
-        <w:t>Adlerian therapy, or Individual Psychology, is Alfred Adler's approach that views the person as a whole, goal-directed and socially embedded, treats problems as discouragement and mistaken lifestyle beliefs rather than illness, and re-educates the client toward courage, social interest and useful contribution.</w:t>
+        <w:t>Adlerian therapy, or Individual Psychology, is Alfred Adler's approach. It sees the person as a whole, as aiming at goals, and as shaped by their social world. Problems are treated as discouragement and mistaken beliefs about life, not illness. The therapy re-educates the client toward courage, cooperation and useful contribution.</w:t>
       </w:r>
     </w:p>
     <w:p>
@@ -5682,7 +5688,7 @@
               <w:t>Individual Psychology</w:t>
             </w:r>
             <w:r>
-              <w:t xml:space="preserve"> after breaking from Freud's circle in 1911, stressing that the person is an indivisible whole whose behaviour is </w:t>
+              <w:t xml:space="preserve"> after leaving Freud's circle in 1911. He stressed that the person is one indivisible whole, that behaviour is </w:t>
             </w:r>
             <w:r>
               <w:rPr>
@@ -5691,7 +5697,7 @@
               <w:t>goal-directed</w:t>
             </w:r>
             <w:r>
-              <w:t xml:space="preserve"> and shaped by social context. </w:t>
+              <w:t xml:space="preserve">, and that it is shaped by social context. </w:t>
             </w:r>
             <w:r>
               <w:rPr>
@@ -5721,10 +5727,10 @@
               <w:rPr>
                 <w:i/>
               </w:rPr>
-              <w:t>(an innate capacity and willingness to cooperate and contribute to others)</w:t>
-            </w:r>
-            <w:r>
-              <w:t xml:space="preserve">, which Adler treated as the very measure of mental health. </w:t>
+              <w:t>(a built-in capacity and willingness to cooperate with and care about other people)</w:t>
+            </w:r>
+            <w:r>
+              <w:t xml:space="preserve">. Adler treated it as the very measure of mental health. </w:t>
             </w:r>
             <w:r>
               <w:rPr>
@@ -5799,7 +5805,7 @@
         <w:t>Alfred Adler</w:t>
       </w:r>
       <w:r>
-        <w:t xml:space="preserve">, a Viennese physician and early member of Freud's circle who broke away in 1911 to establish Individual Psychology. </w:t>
+        <w:t xml:space="preserve">, a Viennese physician and early member of Freud's circle. He broke away in 1911 to set up Individual Psychology. </w:t>
       </w:r>
       <w:r>
         <w:rPr>
@@ -5832,7 +5838,7 @@
         <w:t>Rudolf Dreikurs</w:t>
       </w:r>
       <w:r>
-        <w:t xml:space="preserve">, who developed Adler's ideas for children, families and the democratic classroom, and Adler's founding of the first child-guidance clinics in 1920s Vienna. </w:t>
+        <w:t xml:space="preserve">, who adapted Adler's ideas for children, families and the democratic classroom. Adler founded the first child-guidance clinics in 1920s Vienna. </w:t>
       </w:r>
       <w:r>
         <w:rPr>
@@ -5856,7 +5862,7 @@
         <w:t>holism and teleology</w:t>
       </w:r>
       <w:r>
-        <w:t xml:space="preserve">, the view that the person is indivisible and that behaviour is pulled toward a future goal, a </w:t>
+        <w:t xml:space="preserve"> (being pulled by future goals). The person is indivisible, and behaviour aims at a self-made goal, a </w:t>
       </w:r>
       <w:r>
         <w:t xml:space="preserve">fictional finalism </w:t>
@@ -5865,10 +5871,10 @@
         <w:rPr>
           <w:i/>
         </w:rPr>
-        <w:t>(a guiding self-created goal that directs a person's striving)</w:t>
-      </w:r>
-      <w:r>
-        <w:t xml:space="preserve"> that organises striving. </w:t>
+        <w:t>(an imagined future goal you invent for yourself that quietly steers all your striving)</w:t>
+      </w:r>
+      <w:r>
+        <w:t xml:space="preserve">. </w:t>
       </w:r>
       <w:r>
         <w:rPr>
@@ -5892,7 +5898,7 @@
         <w:t>inferiority and compensation</w:t>
       </w:r>
       <w:r>
-        <w:t xml:space="preserve">, so that natural feelings of inferiority spur a striving for superiority or significance, which can become either healthy ambition or a self-defeating complex. </w:t>
+        <w:t xml:space="preserve">. Natural feelings of being 'not enough' spur a striving to feel capable and significant. This can grow into healthy ambition or into a self-defeating complex. </w:t>
       </w:r>
       <w:r>
         <w:rPr>
@@ -5916,7 +5922,7 @@
         <w:t>social interest</w:t>
       </w:r>
       <w:r>
-        <w:t xml:space="preserve">, the innate capacity to cooperate and contribute, which Adler made the yardstick of mental health, so that well-being grows with connection to others. </w:t>
+        <w:t xml:space="preserve">: the inborn capacity to cooperate and contribute. Adler made it the yardstick of mental health, so well-being grows as you feel more connected to others. </w:t>
       </w:r>
       <w:r>
         <w:rPr>
@@ -5940,10 +5946,10 @@
         <w:rPr>
           <w:i/>
         </w:rPr>
-        <w:t>(the unique pattern of beliefs and goals formed early in childhood)</w:t>
-      </w:r>
-      <w:r>
-        <w:t xml:space="preserve">, the unique pattern of beliefs and goals formed by about age five from the family constellation and birth order. </w:t>
+        <w:t>(the unique set of beliefs and goals about life that you form very early in childhood and then live by)</w:t>
+      </w:r>
+      <w:r>
+        <w:t xml:space="preserve">. It is shaped by about age five from the family set-up and birth order. </w:t>
       </w:r>
       <w:r>
         <w:rPr>
@@ -5967,7 +5973,7 @@
         <w:t>private logic and common sense</w:t>
       </w:r>
       <w:r>
-        <w:t xml:space="preserve">, where idiosyncratic mistaken beliefs, or basic mistakes, steer a person away from cooperative living. </w:t>
+        <w:t xml:space="preserve">. Private logic is a person's own quirky, mistaken beliefs, their 'basic mistakes', which steer them away from cooperative living. </w:t>
       </w:r>
       <w:r>
         <w:rPr>
@@ -5991,7 +5997,7 @@
         <w:t>formulation</w:t>
       </w:r>
       <w:r>
-        <w:t xml:space="preserve">, problems arise from </w:t>
+        <w:t xml:space="preserve">, problems come from </w:t>
       </w:r>
       <w:r>
         <w:rPr>
@@ -6000,7 +6006,7 @@
         <w:t>discouragement, mistaken beliefs and low social interest</w:t>
       </w:r>
       <w:r>
-        <w:t xml:space="preserve">, so difficulties are seen as problems of living rather than illness, as a way of life that is not working. </w:t>
+        <w:t xml:space="preserve">. Difficulties are seen as problems of living, not illness, in other words a way of life that is not working. </w:t>
       </w:r>
       <w:r>
         <w:rPr>
@@ -6024,7 +6030,7 @@
         <w:t>Dreikurs' four mistaken goals</w:t>
       </w:r>
       <w:r>
-        <w:t xml:space="preserve"> of children's misbehaviour, namely attention, power, revenge and a display of inadequacy. </w:t>
+        <w:t xml:space="preserve"> of a child's misbehaviour: getting attention, seeking power, taking revenge, and showing inadequacy to be left alone. </w:t>
       </w:r>
       <w:r>
         <w:rPr>
@@ -6054,10 +6060,10 @@
         <w:rPr>
           <w:b/>
         </w:rPr>
-        <w:t>increase social interest and belonging</w:t>
-      </w:r>
-      <w:r>
-        <w:t xml:space="preserve">, correct mistaken lifestyle beliefs, build courage and self-worth and replace inferiority striving with useful contribution. </w:t>
+        <w:t>boost social interest and belonging</w:t>
+      </w:r>
+      <w:r>
+        <w:t xml:space="preserve">, correct mistaken lifestyle beliefs, build courage and self-worth, and swap the striving driven by inferiority for useful contribution. </w:t>
       </w:r>
       <w:r>
         <w:rPr>
@@ -6090,7 +6096,7 @@
         <w:t>four-phase structure</w:t>
       </w:r>
       <w:r>
-        <w:t xml:space="preserve"> named by Dreikurs, beginning with establishing an equal, respectful and collaborative relationship. </w:t>
+        <w:t xml:space="preserve"> named by Dreikurs. It begins with building an equal, respectful and collaborative relationship. </w:t>
       </w:r>
       <w:r>
         <w:rPr>
@@ -6114,7 +6120,7 @@
         <w:t>lifestyle assessment</w:t>
       </w:r>
       <w:r>
-        <w:t xml:space="preserve">, analysing the family constellation, birth order and especially </w:t>
+        <w:t xml:space="preserve">. The therapist looks at the family set-up, birth order and especially </w:t>
       </w:r>
       <w:r>
         <w:t xml:space="preserve">early recollections </w:t>
@@ -6123,10 +6129,10 @@
         <w:rPr>
           <w:i/>
         </w:rPr>
-        <w:t>(the earliest memories, read as clues to current beliefs)</w:t>
-      </w:r>
-      <w:r>
-        <w:t xml:space="preserve">, which are read as projective clues to present beliefs. </w:t>
+        <w:t>(your very earliest memories, read as clues to the beliefs you live by now)</w:t>
+      </w:r>
+      <w:r>
+        <w:t xml:space="preserve">, which are treated like projective hints. </w:t>
       </w:r>
       <w:r>
         <w:rPr>
@@ -6150,7 +6156,7 @@
         <w:t>insight</w:t>
       </w:r>
       <w:r>
-        <w:t xml:space="preserve">, in which the therapist discloses and interprets the client's mistaken beliefs, private logic and hidden goals in a warm, tentative way. </w:t>
+        <w:t xml:space="preserve">. The therapist gently and tentatively points out the client's mistaken beliefs, private logic and hidden goals. </w:t>
       </w:r>
       <w:r>
         <w:rPr>
@@ -6174,7 +6180,7 @@
         <w:t>reorientation</w:t>
       </w:r>
       <w:r>
-        <w:t xml:space="preserve">, turning insight into action through new choices, supported by </w:t>
+        <w:t xml:space="preserve">. Insight is turned into action through new choices, supported by </w:t>
       </w:r>
       <w:r>
         <w:rPr>
@@ -6183,7 +6189,7 @@
         <w:t>encouragement</w:t>
       </w:r>
       <w:r>
-        <w:t xml:space="preserve">, the central Adlerian technique. </w:t>
+        <w:t xml:space="preserve">, which is the central Adlerian technique. </w:t>
       </w:r>
       <w:r>
         <w:rPr>
@@ -6216,7 +6222,7 @@
         <w:rPr>
           <w:i/>
         </w:rPr>
-        <w:t>(behaving as though one already had the desired quality)</w:t>
+        <w:t>(behaving as though you already had the quality you want, to try it on for size)</w:t>
       </w:r>
       <w:r>
         <w:t xml:space="preserve">, </w:t>
@@ -6228,7 +6234,7 @@
         <w:t>spitting in the client's soup</w:t>
       </w:r>
       <w:r>
-        <w:t xml:space="preserve"> to make a payoff unattractive, catching oneself, the push-button technique and setting tasks and homework. </w:t>
+        <w:t xml:space="preserve"> (pointing out the hidden payoff of a behaviour to make it less appealing), catching oneself, the push-button technique, and setting homework. </w:t>
       </w:r>
       <w:r>
         <w:rPr>
@@ -6252,7 +6258,7 @@
         <w:t>stages and process</w:t>
       </w:r>
       <w:r>
-        <w:t xml:space="preserve">, the therapist works as an </w:t>
+        <w:t xml:space="preserve">, the therapist works like an </w:t>
       </w:r>
       <w:r>
         <w:rPr>
@@ -6261,7 +6267,7 @@
         <w:t>encouraging teacher or coach</w:t>
       </w:r>
       <w:r>
-        <w:t xml:space="preserve">, treating therapy as an educational and re-educational process rather than a cure of disease. </w:t>
+        <w:t xml:space="preserve">. Therapy is treated as education and re-education, not the cure of a disease. </w:t>
       </w:r>
       <w:r>
         <w:rPr>
@@ -6285,7 +6291,7 @@
         <w:t>outcome</w:t>
       </w:r>
       <w:r>
-        <w:t xml:space="preserve"> sought is reduced inferiority and discouragement, increased courage, greater </w:t>
+        <w:t xml:space="preserve"> sought is less inferiority and discouragement, more courage, greater </w:t>
       </w:r>
       <w:r>
         <w:rPr>
@@ -6294,7 +6300,7 @@
         <w:t>social interest</w:t>
       </w:r>
       <w:r>
-        <w:t xml:space="preserve"> and a more adaptive lifestyle and relationships. </w:t>
+        <w:t xml:space="preserve">, and a more workable lifestyle and relationships. </w:t>
       </w:r>
       <w:r>
         <w:rPr>
@@ -6315,7 +6321,7 @@
         <w:t>Indications</w:t>
       </w:r>
       <w:r>
-        <w:t xml:space="preserve"> are broad, covering children and adolescents, parent education and family therapy, school and career counselling and group work, including collectivist cultures whose values fit social interest, while severe psychopathology needs </w:t>
+        <w:t xml:space="preserve"> are broad: children and adolescents, parent education, family therapy, school and career counselling and group work. It fits collectivist cultures whose values match social interest, while severe psychopathology needs </w:t>
       </w:r>
       <w:r>
         <w:rPr>
@@ -6357,7 +6363,7 @@
         <w:t>limited but positive</w:t>
       </w:r>
       <w:r>
-        <w:t xml:space="preserve">, with support for Adlerian parent education such as STEP, Adlerian play therapy and counselling, and Adler's ideas are recognised as anticipating cognitive, humanistic and family-systems therapies. </w:t>
+        <w:t xml:space="preserve">. There is support for Adlerian parent education such as STEP, for Adlerian play therapy and for counselling. Adler's ideas are recognised as foreshadowing cognitive, humanistic and family-systems therapies. </w:t>
       </w:r>
       <w:r>
         <w:rPr>
@@ -6464,7 +6470,7 @@
         <w:rPr>
           <w:i/>
         </w:rPr>
-        <w:t>Transactional analysis is Eric Berne's social-psychiatry approach that reads personality as three ego states, Parent, Adult and Child, and treats problems as contaminated ego states, repetitive games and a limiting life script, aiming by a clear contract to restore autonomy and game-free intimacy.</w:t>
+        <w:t>Transactional analysis is Eric Berne's down-to-earth approach. It reads personality as three inner 'ego states': Parent, Adult and Child. It sees problems as mixed-up ego states, repeated 'games', and a limiting life story. Using a clear, agreed contract, it works to restore autonomy and honest, game-free closeness.</w:t>
       </w:r>
     </w:p>
     <w:p>
@@ -6526,7 +6532,7 @@
               <w:t>Eric Berne</w:t>
             </w:r>
             <w:r>
-              <w:t xml:space="preserve"> founded transactional analysis in the late 1950s, setting out its theory in Transactional Analysis in Psychotherapy and popularising it in Games People Play, and he defined the aim of therapy as </w:t>
+              <w:t xml:space="preserve"> founded transactional analysis in the late 1950s. He set out the theory in Transactional Analysis in Psychotherapy and made it popular in Games People Play. He defined the goal as </w:t>
             </w:r>
             <w:r>
               <w:rPr>
@@ -6565,10 +6571,10 @@
               <w:rPr>
                 <w:i/>
               </w:rPr>
-              <w:t>(a single exchange of a stimulus and a response between two people)</w:t>
-            </w:r>
-            <w:r>
-              <w:t xml:space="preserve"> is the unit of social interaction, and Berne read every exchange as issuing from one of three </w:t>
+              <w:t>(one back-and-forth exchange between two people: you say something, I respond)</w:t>
+            </w:r>
+            <w:r>
+              <w:t xml:space="preserve"> is the basic unit of social life. Berne saw every exchange as coming from one of three </w:t>
             </w:r>
             <w:r>
               <w:rPr>
@@ -6577,7 +6583,7 @@
               <w:t>ego states</w:t>
             </w:r>
             <w:r>
-              <w:t xml:space="preserve">, the Parent, the Adult and the Child. </w:t>
+              <w:t xml:space="preserve">: the Parent, the Adult or the Child. </w:t>
             </w:r>
             <w:r>
               <w:rPr>
@@ -6652,7 +6658,7 @@
         <w:t>Eric Berne</w:t>
       </w:r>
       <w:r>
-        <w:t xml:space="preserve">, a Canadian-born psychiatrist who broke from psychoanalysis to build a plain-language social psychiatry, publishing Transactional Analysis in Psychotherapy in 1961 and Games People Play in 1964. </w:t>
+        <w:t xml:space="preserve">, a Canadian-born psychiatrist. He broke from psychoanalysis to build a plain-language social psychiatry, publishing Transactional Analysis in Psychotherapy in 1961 and Games People Play in 1964. </w:t>
       </w:r>
       <w:r>
         <w:rPr>
@@ -6685,7 +6691,7 @@
         <w:t>Thomas Harris</w:t>
       </w:r>
       <w:r>
-        <w:t xml:space="preserve">, whose I'm OK, You're OK spread the life positions, </w:t>
+        <w:t xml:space="preserve"> (whose I'm OK, You're OK spread the life positions), </w:t>
       </w:r>
       <w:r>
         <w:rPr>
@@ -6703,7 +6709,7 @@
         <w:t>Stephen Karpman</w:t>
       </w:r>
       <w:r>
-        <w:t xml:space="preserve"> on the drama triangle and the </w:t>
+        <w:t xml:space="preserve"> on the drama triangle, and the </w:t>
       </w:r>
       <w:r>
         <w:rPr>
@@ -6736,10 +6742,10 @@
         <w:rPr>
           <w:i/>
         </w:rPr>
-        <w:t>(consistent patterns of feeling and behaviour, called Parent, Adult and Child)</w:t>
-      </w:r>
-      <w:r>
-        <w:t xml:space="preserve">, where the </w:t>
+        <w:t>(three consistent ways of thinking, feeling and acting that we all switch between, called Parent, Adult and Child)</w:t>
+      </w:r>
+      <w:r>
+        <w:t xml:space="preserve">. The </w:t>
       </w:r>
       <w:r>
         <w:rPr>
@@ -6757,7 +6763,7 @@
         <w:t>Adult</w:t>
       </w:r>
       <w:r>
-        <w:t xml:space="preserve"> is thinking and objective and the </w:t>
+        <w:t xml:space="preserve"> is calm and factual, and the </w:t>
       </w:r>
       <w:r>
         <w:rPr>
@@ -6766,7 +6772,7 @@
         <w:t>Child</w:t>
       </w:r>
       <w:r>
-        <w:t xml:space="preserve"> is feeling and spontaneous. </w:t>
+        <w:t xml:space="preserve"> is feeling and playful. </w:t>
       </w:r>
       <w:r>
         <w:rPr>
@@ -6790,7 +6796,7 @@
         <w:t>transactions</w:t>
       </w:r>
       <w:r>
-        <w:t xml:space="preserve">, which may be </w:t>
+        <w:t xml:space="preserve">. They can be </w:t>
       </w:r>
       <w:r>
         <w:rPr>
@@ -6799,7 +6805,7 @@
         <w:t>complementary</w:t>
       </w:r>
       <w:r>
-        <w:t xml:space="preserve"> and so keep talk flowing, </w:t>
+        <w:t xml:space="preserve"> (so talk flows), </w:t>
       </w:r>
       <w:r>
         <w:rPr>
@@ -6808,7 +6814,7 @@
         <w:t>crossed</w:t>
       </w:r>
       <w:r>
-        <w:t xml:space="preserve"> and so break it off, or </w:t>
+        <w:t xml:space="preserve"> (so talk breaks off), or </w:t>
       </w:r>
       <w:r>
         <w:t xml:space="preserve">ulterior </w:t>
@@ -6817,10 +6823,10 @@
         <w:rPr>
           <w:i/>
         </w:rPr>
-        <w:t>(carrying a hidden psychological message under the social one)</w:t>
-      </w:r>
-      <w:r>
-        <w:t xml:space="preserve"> and so drive games. </w:t>
+        <w:t>(carrying a hidden message underneath the polite surface one, like saying 'nice shirt' to mean the opposite)</w:t>
+      </w:r>
+      <w:r>
+        <w:t xml:space="preserve">, which drives games. </w:t>
       </w:r>
       <w:r>
         <w:rPr>
@@ -6844,7 +6850,7 @@
         <w:t>strokes</w:t>
       </w:r>
       <w:r>
-        <w:t xml:space="preserve">, the units of recognition people hunger for, so that positive and negative strokes, conditional and unconditional, shape how a person structures time from withdrawal through rituals and pastimes to games and intimacy. </w:t>
+        <w:t xml:space="preserve">, the units of recognition we all hunger for. Positive or negative, conditional or not, they shape how a person fills their time, from withdrawal through rituals and pastimes up to games and intimacy. </w:t>
       </w:r>
       <w:r>
         <w:rPr>
@@ -6868,7 +6874,7 @@
         <w:t>games and rackets</w:t>
       </w:r>
       <w:r>
-        <w:t xml:space="preserve">, which are </w:t>
+        <w:t xml:space="preserve">. Games are </w:t>
       </w:r>
       <w:r>
         <w:t xml:space="preserve">games </w:t>
@@ -6877,10 +6883,10 @@
         <w:rPr>
           <w:i/>
         </w:rPr>
-        <w:t>(repetitive ulterior transactions that end in a predictable bad feeling)</w:t>
-      </w:r>
-      <w:r>
-        <w:t xml:space="preserve"> such as 'Why don't you, Yes but', paying off in a familiar racket feeling that props up the script. </w:t>
+        <w:t>(repeated hidden-motive exchanges that always end in the same bad feeling)</w:t>
+      </w:r>
+      <w:r>
+        <w:t xml:space="preserve">, like 'Why don't you, Yes but'. They pay off in a familiar racket feeling that props up the life script. </w:t>
       </w:r>
       <w:r>
         <w:rPr>
@@ -6904,10 +6910,10 @@
         <w:rPr>
           <w:i/>
         </w:rPr>
-        <w:t>(an unconscious life plan decided in childhood from parental messages)</w:t>
-      </w:r>
-      <w:r>
-        <w:t xml:space="preserve">, built from injunctions such as 'don't be close', counter-injunction drivers such as 'be perfect' and the child's own early decisions. </w:t>
+        <w:t>(an unconscious life story you decided on as a child, based on messages from your parents)</w:t>
+      </w:r>
+      <w:r>
+        <w:t xml:space="preserve">. It is built from injunctions like 'don't be close', driver messages like 'be perfect', and the child's own early decisions. </w:t>
       </w:r>
       <w:r>
         <w:rPr>
@@ -6931,7 +6937,7 @@
         <w:t>life positions</w:t>
       </w:r>
       <w:r>
-        <w:t xml:space="preserve"> of the OK Corral, running from the healthy 'I'm OK, you're OK' to the blaming, the depressive and the hopeless positions that colour a person's whole outlook. </w:t>
+        <w:t xml:space="preserve"> of the OK Corral. They run from the healthy 'I'm OK, you're OK' down to the blaming, the self-doubting and the hopeless positions that colour a person's whole outlook. </w:t>
       </w:r>
       <w:r>
         <w:rPr>
@@ -6964,7 +6970,7 @@
         <w:t>contaminated or excluded ego states</w:t>
       </w:r>
       <w:r>
-        <w:t xml:space="preserve">, destructive games, a negative script and an unhealthy life position, so the therapist maps which ego state and game is driving the complaint. </w:t>
+        <w:t xml:space="preserve">, destructive games, a negative script and an unhealthy life position. The therapist maps which ego state and which game is driving the complaint. </w:t>
       </w:r>
       <w:r>
         <w:rPr>
@@ -6988,7 +6994,7 @@
         <w:t>Karpman's drama triangle</w:t>
       </w:r>
       <w:r>
-        <w:t xml:space="preserve">, in which clients switch between the roles of Persecutor, Victim and Rescuer, and the healthier exit is assertiveness, vulnerability and genuine caring. </w:t>
+        <w:t xml:space="preserve">. Clients switch between Persecutor, Victim and Rescuer roles. The healthier exit from each is assertiveness, honest vulnerability and genuine caring. </w:t>
       </w:r>
       <w:r>
         <w:rPr>
@@ -7021,7 +7027,7 @@
         <w:t>autonomy and game-free intimacy</w:t>
       </w:r>
       <w:r>
-        <w:t xml:space="preserve">, a free and uncontaminated Adult, a revised script sometimes called a script cure, better social control and relief of the presenting symptom. </w:t>
+        <w:t xml:space="preserve">: a free, uncontaminated Adult, a revised script (a 'script cure'), better self-control and relief of the presenting symptom. </w:t>
       </w:r>
       <w:r>
         <w:rPr>
@@ -7054,7 +7060,7 @@
         <w:t>contract</w:t>
       </w:r>
       <w:r>
-        <w:t xml:space="preserve">, a clear and mutual agreement on goals and responsibilities that gives TA its collaborative, adult-to-adult, 'OK, OK' stance from the very first session. </w:t>
+        <w:t xml:space="preserve">: a clear, mutual agreement on goals and roles. It gives TA its collaborative, adult-to-adult, 'OK, OK' stance from the very first session. </w:t>
       </w:r>
       <w:r>
         <w:rPr>
@@ -7087,7 +7093,7 @@
         <w:t>four kinds of analysis</w:t>
       </w:r>
       <w:r>
-        <w:t xml:space="preserve">, namely structural analysis of ego states, transactional analysis of exchanges, game analysis of hidden payoffs and script analysis of the life plan. </w:t>
+        <w:t xml:space="preserve">: structural analysis of ego states, transactional analysis of exchanges, game analysis of hidden payoffs, and script analysis of the life story. </w:t>
       </w:r>
       <w:r>
         <w:rPr>
@@ -7102,7 +7108,7 @@
         <w:pStyle w:val="ListBullet"/>
       </w:pPr>
       <w:r>
-        <w:t xml:space="preserve">Berne set out eight </w:t>
+        <w:t xml:space="preserve">Berne listed eight </w:t>
       </w:r>
       <w:r>
         <w:rPr>
@@ -7111,7 +7117,7 @@
         <w:t>therapeutic operations</w:t>
       </w:r>
       <w:r>
-        <w:t xml:space="preserve">, from interrogation, specification and confrontation through explanation, illustration, confirmation and interpretation to </w:t>
+        <w:t xml:space="preserve">, from interrogation, specification and confrontation, through explanation, illustration, confirmation and interpretation, up to </w:t>
       </w:r>
       <w:r>
         <w:t xml:space="preserve">crystallisation </w:t>
@@ -7120,7 +7126,7 @@
         <w:rPr>
           <w:i/>
         </w:rPr>
-        <w:t>(the moment the client can hold a new, freeing position for themselves)</w:t>
+        <w:t>(the moment the client can finally hold a new, freeing view of themselves on their own)</w:t>
       </w:r>
       <w:r>
         <w:t xml:space="preserve">. </w:t>
@@ -7156,7 +7162,7 @@
         <w:t>egogram</w:t>
       </w:r>
       <w:r>
-        <w:t xml:space="preserve">, permissions and protection, </w:t>
+        <w:t xml:space="preserve">, permissions and protection, and </w:t>
       </w:r>
       <w:r>
         <w:rPr>
@@ -7165,7 +7171,7 @@
         <w:t>redecision work</w:t>
       </w:r>
       <w:r>
-        <w:t xml:space="preserve"> that re-experiences and changes early decisions through chair work, stroke work, role play and homework, usually in a group format. </w:t>
+        <w:t xml:space="preserve"> that re-lives and changes early childhood decisions through chair work, plus stroke work, role play and homework, usually in a group. </w:t>
       </w:r>
       <w:r>
         <w:rPr>
@@ -7198,7 +7204,7 @@
         <w:t>contracting and assessment</w:t>
       </w:r>
       <w:r>
-        <w:t xml:space="preserve">, through strengthening and decontaminating the Adult and the deconfusion and redecision of the Child, to relearning new behaviours and finally autonomy and termination. </w:t>
+        <w:t xml:space="preserve">, through strengthening and 'decontaminating' the Adult and freeing the Child, to relearning new behaviours and finally autonomy and termination. </w:t>
       </w:r>
       <w:r>
         <w:rPr>
@@ -7222,7 +7228,7 @@
         <w:t>outcome</w:t>
       </w:r>
       <w:r>
-        <w:t xml:space="preserve"> sought is greater autonomy, clearer communication, an </w:t>
+        <w:t xml:space="preserve"> sought is more autonomy, clearer communication, an </w:t>
       </w:r>
       <w:r>
         <w:rPr>
@@ -7231,7 +7237,7 @@
         <w:t>end to games</w:t>
       </w:r>
       <w:r>
-        <w:t xml:space="preserve">, a revised script and improved self-esteem, with the simple language letting clients keep using the ideas after therapy. </w:t>
+        <w:t xml:space="preserve">, a revised script and better self-esteem. The simple language lets clients keep using the ideas after therapy ends. </w:t>
       </w:r>
       <w:r>
         <w:rPr>
@@ -7252,7 +7258,7 @@
         <w:t>Indications</w:t>
       </w:r>
       <w:r>
-        <w:t xml:space="preserve"> cover neurotic, relationship and communication problems, personality issues, couples and families, groups, education and organisations, while acute psychosis is a </w:t>
+        <w:t xml:space="preserve"> cover neurotic, relationship and communication problems, personality issues, couples and families, groups, education and organisations. Acute psychosis is a </w:t>
       </w:r>
       <w:r>
         <w:rPr>
@@ -7294,7 +7300,7 @@
         <w:t>modest</w:t>
       </w:r>
       <w:r>
-        <w:t xml:space="preserve">, with some reviews reporting positive outcomes but few rigorous trials, yet TA stays widely taught and accredited by the ITAA and EATA despite criticism of its jargon and limited validation. </w:t>
+        <w:t xml:space="preserve">. Some reviews report good outcomes, but few rigorous trials exist. TA stays widely taught and accredited by the ITAA and EATA, despite criticism of its jargon and limited testing. </w:t>
       </w:r>
       <w:r>
         <w:rPr>
@@ -7401,7 +7407,7 @@
         <w:rPr>
           <w:i/>
         </w:rPr>
-        <w:t>Reality therapy is William Glasser's present-focused approach built on choice theory, which holds that all behaviour is chosen to meet five basic needs, and uses the WDEP system within a warm, non-blaming relationship to help clients evaluate and plan more effective, responsible choices.</w:t>
+        <w:t>Reality therapy is William Glasser's present-focused approach, built on choice theory. It holds that we choose almost all of our behaviour to meet five basic needs. Within a warm, non-blaming relationship, it uses the WDEP system to help clients judge their own choices and plan better, more responsible ones.</w:t>
       </w:r>
     </w:p>
     <w:p>
@@ -7463,7 +7469,7 @@
               <w:t>William Glasser</w:t>
             </w:r>
             <w:r>
-              <w:t xml:space="preserve"> developed reality therapy in the 1960s and later grounded it in </w:t>
+              <w:t xml:space="preserve"> developed reality therapy in the 1960s. He later grounded it in </w:t>
             </w:r>
             <w:r>
               <w:t xml:space="preserve">choice theory </w:t>
@@ -7472,10 +7478,10 @@
               <w:rPr>
                 <w:i/>
               </w:rPr>
-              <w:t>(the view that we choose almost all of our behaviour to meet basic needs)</w:t>
-            </w:r>
-            <w:r>
-              <w:t xml:space="preserve">, the idea that we can directly control only our own acting and thinking. </w:t>
+              <w:t>(the idea that we choose nearly all of our behaviour to try to meet our basic needs)</w:t>
+            </w:r>
+            <w:r>
+              <w:t xml:space="preserve">, and that we can directly control only our own acting and thinking. </w:t>
             </w:r>
             <w:r>
               <w:rPr>
@@ -7505,7 +7511,7 @@
               <w:t>most psychological problems are relationship problems</w:t>
             </w:r>
             <w:r>
-              <w:t xml:space="preserve">, rooted in unsatisfying connections, and so he rejected diagnostic labels in favour of helping clients make more effective choices. </w:t>
+              <w:t xml:space="preserve">, rooted in unsatisfying connections. So he rejected diagnostic labels in favour of helping clients make better choices. </w:t>
             </w:r>
             <w:r>
               <w:rPr>
@@ -7535,7 +7541,7 @@
               <w:t>Robert Wubbolding</w:t>
             </w:r>
             <w:r>
-              <w:t xml:space="preserve"> systematised the practice as the </w:t>
+              <w:t xml:space="preserve"> organised the practice into the </w:t>
             </w:r>
             <w:r>
               <w:rPr>
@@ -7544,7 +7550,7 @@
               <w:t>WDEP system</w:t>
             </w:r>
             <w:r>
-              <w:t xml:space="preserve"> set inside a cycle of counselling that first builds a trusting, friendly environment. </w:t>
+              <w:t xml:space="preserve">, set inside a cycle of counselling that first builds a trusting, friendly bond. </w:t>
             </w:r>
             <w:r>
               <w:rPr>
@@ -7589,7 +7595,7 @@
         <w:t>William Glasser</w:t>
       </w:r>
       <w:r>
-        <w:t xml:space="preserve">, an American psychiatrist who, dissatisfied with Freudian therapy, developed his ideas working at the Ventura School for Girls and a veterans' hospital, publishing Reality Therapy in 1965. </w:t>
+        <w:t xml:space="preserve">, an American psychiatrist. Unhappy with Freudian therapy, he developed his ideas at the Ventura School for Girls and a veterans' hospital, publishing Reality Therapy in 1965. </w:t>
       </w:r>
       <w:r>
         <w:rPr>
@@ -7613,7 +7619,7 @@
         <w:t>origin</w:t>
       </w:r>
       <w:r>
-        <w:t xml:space="preserve"> continued as Glasser's control theory of the 1980s was renamed </w:t>
+        <w:t xml:space="preserve"> continued as Glasser's 1980s control theory was renamed </w:t>
       </w:r>
       <w:r>
         <w:rPr>
@@ -7622,7 +7628,7 @@
         <w:t>choice theory</w:t>
       </w:r>
       <w:r>
-        <w:t xml:space="preserve"> in 1998, and </w:t>
+        <w:t xml:space="preserve"> in 1998. </w:t>
       </w:r>
       <w:r>
         <w:rPr>
@@ -7631,7 +7637,7 @@
         <w:t>Robert Wubbolding</w:t>
       </w:r>
       <w:r>
-        <w:t xml:space="preserve"> built the WDEP system and the cycle of counselling that organise practice today. </w:t>
+        <w:t xml:space="preserve"> then built the WDEP system and the cycle of counselling that organise practice today. </w:t>
       </w:r>
       <w:r>
         <w:rPr>
@@ -7655,7 +7661,7 @@
         <w:t>all behaviour is chosen</w:t>
       </w:r>
       <w:r>
-        <w:t xml:space="preserve">, since we can directly control only our acting and thinking, which in turn steer our feeling and physiology, a picture Glasser likened to the four wheels of a car. </w:t>
+        <w:t xml:space="preserve">. We can directly control only our acting and thinking, which in turn steer our feelings and body. Glasser pictured this as the four wheels of a car: thinking and acting are the front wheels that steer. </w:t>
       </w:r>
       <w:r>
         <w:rPr>
@@ -7679,10 +7685,10 @@
         <w:rPr>
           <w:i/>
         </w:rPr>
-        <w:t>(survival, love and belonging, power, freedom and fun)</w:t>
-      </w:r>
-      <w:r>
-        <w:t xml:space="preserve">, which drive all behaviour, with love and belonging treated as the most important for mental health. </w:t>
+        <w:t>(the five needs that drive all of us: survival, love and belonging, power, freedom and fun)</w:t>
+      </w:r>
+      <w:r>
+        <w:t xml:space="preserve">. Love and belonging is treated as the most important for mental health. </w:t>
       </w:r>
       <w:r>
         <w:rPr>
@@ -7706,10 +7712,10 @@
         <w:rPr>
           <w:i/>
         </w:rPr>
-        <w:t>(an inner picture album of the people and things a person most wants)</w:t>
-      </w:r>
-      <w:r>
-        <w:t xml:space="preserve">, against which we compare the perceived world, so that a gap between the two produces frustration and behaviour. </w:t>
+        <w:t>(a private mental picture album of the people and things you most want in your life)</w:t>
+      </w:r>
+      <w:r>
+        <w:t xml:space="preserve">. We compare the real world to it, and a gap between the two drives our behaviour. </w:t>
       </w:r>
       <w:r>
         <w:rPr>
@@ -7733,7 +7739,7 @@
         <w:t>relationships are central</w:t>
       </w:r>
       <w:r>
-        <w:t xml:space="preserve">, so the seven deadly habits of criticising, blaming and complaining damage connection while the seven caring habits of supporting, listening and respecting rebuild it. </w:t>
+        <w:t xml:space="preserve">. The seven deadly habits of criticising, blaming and complaining damage connection; the seven caring habits of supporting, listening and respecting rebuild it. </w:t>
       </w:r>
       <w:r>
         <w:rPr>
@@ -7757,7 +7763,7 @@
         <w:t>responsibility and a present focus</w:t>
       </w:r>
       <w:r>
-        <w:t xml:space="preserve">, meeting one's needs without stopping others from meeting theirs, with no excuses, no blame and no punishment, and almost no attention paid to the past or to symptoms. </w:t>
+        <w:t xml:space="preserve">. You meet your needs without stopping others meeting theirs, with no excuses, no blame and no punishment, and almost no attention to the past or to symptoms. </w:t>
       </w:r>
       <w:r>
         <w:rPr>
@@ -7790,7 +7796,7 @@
         <w:t>unmet need</w:t>
       </w:r>
       <w:r>
-        <w:t xml:space="preserve">, usually love and belonging, and choosing ineffective behaviours such as withdrawing, 'depressing' or blaming to try to satisfy it, forming a failure identity. </w:t>
+        <w:t xml:space="preserve">, usually love and belonging. They then choose ineffective behaviours, like withdrawing, 'depressing' or blaming, to try to meet it, which builds a failure identity. </w:t>
       </w:r>
       <w:r>
         <w:rPr>
@@ -7823,7 +7829,7 @@
         <w:t>take responsibility and make effective choices</w:t>
       </w:r>
       <w:r>
-        <w:t xml:space="preserve">, improve their relationships and meet needs in ways that are responsible, realistic and right, Glasser's three Rs. </w:t>
+        <w:t xml:space="preserve">, improve their relationships, and meet needs in ways that are responsible, realistic and right, Glasser's three Rs. </w:t>
       </w:r>
       <w:r>
         <w:rPr>
@@ -7856,7 +7862,7 @@
         <w:t>Wubbolding's cycle of counselling</w:t>
       </w:r>
       <w:r>
-        <w:t xml:space="preserve">, which first builds the environment, a trusting and friendly bond with humour and good listening while avoiding arguing and criticising. </w:t>
+        <w:t xml:space="preserve">. It first builds the environment: a trusting, friendly bond with humour and good listening, while avoiding arguing and criticising. </w:t>
       </w:r>
       <w:r>
         <w:rPr>
@@ -7889,7 +7895,7 @@
         <w:t>WDEP system</w:t>
       </w:r>
       <w:r>
-        <w:t xml:space="preserve">, where W explores wants and needs and D clarifies current total behaviour and direction. </w:t>
+        <w:t xml:space="preserve">. W explores the client's wants and needs. D clarifies what they are currently doing and the direction it is taking them. </w:t>
       </w:r>
       <w:r>
         <w:rPr>
@@ -7922,7 +7928,7 @@
         <w:t>self-evaluation</w:t>
       </w:r>
       <w:r>
-        <w:t xml:space="preserve"> of whether their behaviour is helping and is realistic, and P, a plan that is committed to and workable. </w:t>
+        <w:t xml:space="preserve"> of whether their behaviour is helping and is realistic. Then P is a plan they commit to and that is workable. </w:t>
       </w:r>
       <w:r>
         <w:rPr>
@@ -7955,10 +7961,10 @@
         <w:rPr>
           <w:i/>
         </w:rPr>
-        <w:t>(a plan that is simple, attainable, measurable, immediate, involving, controlled, committed and consistent)</w:t>
-      </w:r>
-      <w:r>
-        <w:t xml:space="preserve">, which makes the client's commitment concrete and checkable. </w:t>
+        <w:t>(a plan that is Simple, Attainable, Measurable, Immediate, Involving, Controlled, Committed and Consistent)</w:t>
+      </w:r>
+      <w:r>
+        <w:t xml:space="preserve">, which makes the commitment concrete and easy to check. </w:t>
       </w:r>
       <w:r>
         <w:rPr>
@@ -7982,7 +7988,7 @@
         <w:t>techniques</w:t>
       </w:r>
       <w:r>
-        <w:t xml:space="preserve"> include skilful questioning, metaphor and humour, paradox, role play, contracts and self-disclosure, with the gentle confrontation 'Is what you are doing helping?' and a firm refusal to accept excuses. </w:t>
+        <w:t xml:space="preserve"> include skilful questioning, metaphor and humour, paradox, role play, contracts and self-disclosure. A gentle challenge runs through it: 'Is what you are doing helping?', with a firm refusal to accept excuses. </w:t>
       </w:r>
       <w:r>
         <w:rPr>
@@ -8006,7 +8012,7 @@
         <w:t>stages and process</w:t>
       </w:r>
       <w:r>
-        <w:t xml:space="preserve"> the therapist builds the environment, establishes what the client wants, explores current behaviour, guides self-evaluation, helps form and commit to a plan, and then </w:t>
+        <w:t xml:space="preserve"> the therapist builds the environment, finds out what the client wants, explores current behaviour, guides self-evaluation, helps form and commit to a plan, and then </w:t>
       </w:r>
       <w:r>
         <w:rPr>
@@ -8039,7 +8045,7 @@
         <w:t>outcome</w:t>
       </w:r>
       <w:r>
-        <w:t xml:space="preserve"> sought is greater responsibility, a stronger </w:t>
+        <w:t xml:space="preserve"> sought is more responsibility, a stronger </w:t>
       </w:r>
       <w:r>
         <w:rPr>
@@ -8048,7 +8054,7 @@
         <w:t>internal locus of control</w:t>
       </w:r>
       <w:r>
-        <w:t xml:space="preserve">, better relationships, higher self-esteem and more satisfying behaviour, achieved in a short and practical course of work. </w:t>
+        <w:t xml:space="preserve"> (feeling in charge of your own life), better relationships, higher self-esteem and more satisfying behaviour, in a short and practical course. </w:t>
       </w:r>
       <w:r>
         <w:rPr>
@@ -8069,7 +8075,7 @@
         <w:t>Indications</w:t>
       </w:r>
       <w:r>
-        <w:t xml:space="preserve"> are broad, covering schools, adolescents and offenders, corrections, addictions, marital and group counselling and the workplace, while severe mental illness or trauma needing exploration is a </w:t>
+        <w:t xml:space="preserve"> are broad: schools, adolescents and offenders, corrections, addictions, marital and group counselling and the workplace. Severe mental illness or trauma needing exploration is a </w:t>
       </w:r>
       <w:r>
         <w:rPr>
@@ -8111,7 +8117,7 @@
         <w:t>moderate but often quasi-experimental</w:t>
       </w:r>
       <w:r>
-        <w:t xml:space="preserve">, with studies in schools, correctional and cross-cultural settings showing gains in self-esteem, locus of control and relationships, though critics attack its rejection of diagnosis and simple view of choice. </w:t>
+        <w:t xml:space="preserve">. Studies in schools, correctional and cross-cultural settings show gains in self-esteem, locus of control and relationships. Critics attack its rejection of diagnosis and its simple view of choice. </w:t>
       </w:r>
       <w:r>
         <w:rPr>
@@ -8218,7 +8224,7 @@
         <w:rPr>
           <w:i/>
         </w:rPr>
-        <w:t>Supportive psychotherapy is the ego-strengthening end of the supportive-expressive continuum, which aims not to uncover the unconscious but to maintain and restore ego functions, self-esteem and coping through a warm, active relationship, using reassurance, advice, praise and problem solving.</w:t>
+        <w:t>Supportive psychotherapy sits at the ego-strengthening end of therapy. It does not dig into the unconscious. Instead it props up and restores the client's coping, self-esteem and everyday functioning. It does this through a warm, active relationship, using reassurance, advice, praise and practical problem solving.</w:t>
       </w:r>
     </w:p>
     <w:p>
@@ -8280,7 +8286,7 @@
               <w:t>supportive end of Luborsky's supportive-expressive continuum</w:t>
             </w:r>
             <w:r>
-              <w:t xml:space="preserve">, aiming to maintain or improve ego functions and self-esteem rather than to uncover unconscious conflict. </w:t>
+              <w:t xml:space="preserve">. Think of a scale: one end uncovers hidden conflict, the other end strengthens coping. Supportive work aims to keep up or improve ego functions and self-esteem, not to uncover conflict. </w:t>
             </w:r>
             <w:r>
               <w:rPr>
@@ -8310,7 +8316,7 @@
               <w:t>therapeutic relationship</w:t>
             </w:r>
             <w:r>
-              <w:t xml:space="preserve"> as the main agent of change, with the therapist acting as a trusted, caring support or </w:t>
+              <w:t xml:space="preserve"> as the main healer. The therapist is a trusted, caring support, or an </w:t>
             </w:r>
             <w:r>
               <w:t xml:space="preserve">auxiliary ego </w:t>
@@ -8319,7 +8325,7 @@
               <w:rPr>
                 <w:i/>
               </w:rPr>
-              <w:t>(a dependable figure who lends ego strength the client temporarily lacks)</w:t>
+              <w:t>(a dependable stand-in who lends the client the mental strength they temporarily lack, like a crutch for a sprained ankle)</w:t>
             </w:r>
             <w:r>
               <w:t xml:space="preserve">. </w:t>
@@ -8352,7 +8358,7 @@
               <w:t>Wallerstein, Rockland, and Winston, Pinsker and McCullough</w:t>
             </w:r>
             <w:r>
-              <w:t xml:space="preserve"> for patients with limited ego strength who need strengthening rather than insight. </w:t>
+              <w:t xml:space="preserve"> for patients with limited ego strength who need shoring up rather than insight. </w:t>
             </w:r>
             <w:r>
               <w:rPr>
@@ -8397,7 +8403,7 @@
         <w:t>reassurance, advice and moral treatment</w:t>
       </w:r>
       <w:r>
-        <w:t xml:space="preserve">, and from psychodynamic therapy at the supportive end of Luborsky's supportive-expressive continuum. </w:t>
+        <w:t xml:space="preserve">. It also grows from psychodynamic therapy at the supportive end of Luborsky's continuum. </w:t>
       </w:r>
       <w:r>
         <w:rPr>
@@ -8421,7 +8427,7 @@
         <w:t>origin</w:t>
       </w:r>
       <w:r>
-        <w:t xml:space="preserve"> was given shape by </w:t>
+        <w:t xml:space="preserve"> was shaped by </w:t>
       </w:r>
       <w:r>
         <w:rPr>
@@ -8430,7 +8436,7 @@
         <w:t>Wallerstein's Menninger project</w:t>
       </w:r>
       <w:r>
-        <w:t xml:space="preserve">, Rockland, and Winston, Pinsker and McCullough, who formalised it for patients whose fragile personality cannot tolerate uncovering work. </w:t>
+        <w:t xml:space="preserve">, by Rockland, and by Winston, Pinsker and McCullough. They formalised it for patients whose fragile personality cannot handle uncovering work. </w:t>
       </w:r>
       <w:r>
         <w:rPr>
@@ -8445,7 +8451,7 @@
         <w:pStyle w:val="ListBullet"/>
       </w:pPr>
       <w:r>
-        <w:t xml:space="preserve">The first basis is a shift of aim, since the goal is to </w:t>
+        <w:t xml:space="preserve">The first basis is a change of aim. The goal is to </w:t>
       </w:r>
       <w:r>
         <w:rPr>
@@ -8454,7 +8460,7 @@
         <w:t>maintain, restore or improve ego functions</w:t>
       </w:r>
       <w:r>
-        <w:t xml:space="preserve"> and self-esteem and to shore up existing defences and coping rather than to make the unconscious conscious. </w:t>
+        <w:t xml:space="preserve"> and self-esteem, and to shore up existing defences and coping, not to make the unconscious conscious. </w:t>
       </w:r>
       <w:r>
         <w:rPr>
@@ -8478,7 +8484,7 @@
         <w:t>relationship itself heals</w:t>
       </w:r>
       <w:r>
-        <w:t xml:space="preserve">, so a dependable, warm therapist serves as an auxiliary ego, lending the strength and stability the client temporarily lacks. </w:t>
+        <w:t xml:space="preserve">. A dependable, warm therapist acts as an auxiliary ego, lending the strength and steadiness the client temporarily lacks. </w:t>
       </w:r>
       <w:r>
         <w:rPr>
@@ -8502,7 +8508,7 @@
         <w:t>here-and-now focus</w:t>
       </w:r>
       <w:r>
-        <w:t xml:space="preserve">, keeping the work on present stresses, coping and daily functioning rather than on childhood reconstruction or deep transference. </w:t>
+        <w:t xml:space="preserve">. The work stays on present stresses, coping and daily functioning, not on childhood reconstruction or deep transference. </w:t>
       </w:r>
       <w:r>
         <w:rPr>
@@ -8517,16 +8523,16 @@
         <w:pStyle w:val="ListBullet"/>
       </w:pPr>
       <w:r>
-        <w:t xml:space="preserve">A fourth basis is the handling of transference, since </w:t>
-      </w:r>
-      <w:r>
-        <w:rPr>
-          <w:b/>
-        </w:rPr>
-        <w:t>positive transference is used but not interpreted</w:t>
-      </w:r>
-      <w:r>
-        <w:t xml:space="preserve">, and deep interpretation is deliberately avoided so the client is not destabilised. </w:t>
+        <w:t xml:space="preserve">A fourth basis is how transference is handled. </w:t>
+      </w:r>
+      <w:r>
+        <w:rPr>
+          <w:b/>
+        </w:rPr>
+        <w:t>Positive transference is used but not interpreted</w:t>
+      </w:r>
+      <w:r>
+        <w:t xml:space="preserve">, and deep interpretation is deliberately avoided, so the client is not destabilised. In short, the therapist uses the client's trust but does not analyse it. </w:t>
       </w:r>
       <w:r>
         <w:rPr>
@@ -8556,10 +8562,10 @@
         <w:rPr>
           <w:b/>
         </w:rPr>
-        <w:t>stress overwhelms a person's coping resources</w:t>
-      </w:r>
-      <w:r>
-        <w:t xml:space="preserve">, so that an overwhelmed ego or a fragile personality needs its functioning and adaptation strengthened. </w:t>
+        <w:t>stress overwhelms a person's coping</w:t>
+      </w:r>
+      <w:r>
+        <w:t xml:space="preserve">. An overwhelmed ego, or a fragile personality, needs its functioning and adaptation strengthened. </w:t>
       </w:r>
       <w:r>
         <w:rPr>
@@ -8592,7 +8598,7 @@
         <w:t>symptom relief and stabilisation</w:t>
       </w:r>
       <w:r>
-        <w:t xml:space="preserve">, improved adaptation and coping, support through crisis or illness, prevention of relapse and rehospitalisation, and enhanced self-esteem. </w:t>
+        <w:t xml:space="preserve">, better adaptation and coping, support through a crisis or illness, prevention of relapse and rehospitalisation, and higher self-esteem. </w:t>
       </w:r>
       <w:r>
         <w:rPr>
@@ -8622,10 +8628,10 @@
         <w:rPr>
           <w:b/>
         </w:rPr>
-        <w:t>active, warm, flexible and often directive</w:t>
-      </w:r>
-      <w:r>
-        <w:t xml:space="preserve">, meeting the client where they are rather than waiting in silence for associations. </w:t>
+        <w:t>active, warm and flexible</w:t>
+      </w:r>
+      <w:r>
+        <w:t xml:space="preserve">, and often directive. The therapist meets the client where they are, rather than waiting in silence for associations. </w:t>
       </w:r>
       <w:r>
         <w:rPr>
@@ -8658,7 +8664,7 @@
         <w:t>reassurance, encouragement and praise</w:t>
       </w:r>
       <w:r>
-        <w:t xml:space="preserve">, empathic listening and </w:t>
+        <w:t xml:space="preserve">, empathic listening, and </w:t>
       </w:r>
       <w:r>
         <w:t xml:space="preserve">ventilation </w:t>
@@ -8667,10 +8673,10 @@
         <w:rPr>
           <w:i/>
         </w:rPr>
-        <w:t>(letting the client talk out and release pent-up feelings)</w:t>
-      </w:r>
-      <w:r>
-        <w:t xml:space="preserve">, and advice and guidance where the client cannot yet decide alone. </w:t>
+        <w:t>(letting the client talk out and release pent-up feelings, like letting steam out of a pot)</w:t>
+      </w:r>
+      <w:r>
+        <w:t xml:space="preserve">. Advice and guidance are given where the client cannot yet decide alone. </w:t>
       </w:r>
       <w:r>
         <w:rPr>
@@ -8703,7 +8709,7 @@
         <w:t>psychoeducation, explanation and clarification</w:t>
       </w:r>
       <w:r>
-        <w:t xml:space="preserve">, anticipatory guidance that prepares the client for stressful events, and practical problem solving and reality testing. </w:t>
+        <w:t xml:space="preserve">, anticipatory guidance that readies the client for a stressful event, and practical problem solving and reality testing. </w:t>
       </w:r>
       <w:r>
         <w:rPr>
@@ -8718,7 +8724,7 @@
         <w:pStyle w:val="ListBullet"/>
       </w:pPr>
       <w:r>
-        <w:t xml:space="preserve">Additional </w:t>
+        <w:t xml:space="preserve">More </w:t>
       </w:r>
       <w:r>
         <w:rPr>
@@ -8736,7 +8742,7 @@
         <w:t>reframing</w:t>
       </w:r>
       <w:r>
-        <w:t xml:space="preserve">, environmental modification such as involving family or arranging services, modelling, limit-setting, the strengthening of adaptive defences and timely crisis intervention. </w:t>
+        <w:t xml:space="preserve"> (helping the client see a situation in a more helpful light), changing the environment (such as involving family or arranging services), modelling, limit-setting, strengthening good defences and timely crisis intervention. </w:t>
       </w:r>
       <w:r>
         <w:rPr>
@@ -8760,7 +8766,7 @@
         <w:t>frequency and duration</w:t>
       </w:r>
       <w:r>
-        <w:t xml:space="preserve"> are flexible, ranging from weekly to monthly sessions and from brief and time-limited work to long-term maintenance for chronic conditions. </w:t>
+        <w:t xml:space="preserve"> are flexible. Sessions may be weekly or monthly, and the work can be brief and time-limited or long-term maintenance for chronic conditions. </w:t>
       </w:r>
       <w:r>
         <w:rPr>
@@ -8793,7 +8799,7 @@
         <w:t>strengths and ego capacities</w:t>
       </w:r>
       <w:r>
-        <w:t xml:space="preserve">, through building the alliance and defining problems and goals, to selecting and applying supportive techniques. </w:t>
+        <w:t xml:space="preserve">, through building the alliance and defining problems and goals, to choosing and applying supportive techniques. </w:t>
       </w:r>
       <w:r>
         <w:rPr>
@@ -8817,7 +8823,7 @@
         <w:t>process</w:t>
       </w:r>
       <w:r>
-        <w:t xml:space="preserve"> is monitoring progress with a gradual reduction or ongoing maintenance and an open-ended, flexible ending rather than a sharply scheduled termination. </w:t>
+        <w:t xml:space="preserve"> is monitoring progress, with a gradual reduction or ongoing maintenance, and an open-ended, flexible ending rather than a sharply scheduled termination. </w:t>
       </w:r>
       <w:r>
         <w:rPr>
@@ -8850,7 +8856,7 @@
         <w:t>better coping and daily functioning</w:t>
       </w:r>
       <w:r>
-        <w:t xml:space="preserve">, reduced distress and fewer relapses, with stabilisation valued above the deeper personality change pursued by expressive therapy. </w:t>
+        <w:t xml:space="preserve">, less distress and fewer relapses. Stabilisation is valued above the deeper personality change that expressive therapy pursues. </w:t>
       </w:r>
       <w:r>
         <w:rPr>
@@ -8871,7 +8877,7 @@
         <w:t>Indications</w:t>
       </w:r>
       <w:r>
-        <w:t xml:space="preserve"> are wide, covering schizophrenia and other severe mental illness, bipolar and personality disorders with low ego strength, crises and bereavement, chronic or terminal medical illness, the elderly and those with low insight. </w:t>
+        <w:t xml:space="preserve"> are wide: schizophrenia and other severe mental illness, bipolar and personality disorders with low ego strength, crises and bereavement, chronic or terminal medical illness, the elderly and those with low insight. </w:t>
       </w:r>
       <w:r>
         <w:rPr>
@@ -8904,7 +8910,7 @@
         <w:t>Wallerstein's Menninger study</w:t>
       </w:r>
       <w:r>
-        <w:t xml:space="preserve"> found supportive therapy produced more lasting change than expected, and later work shows it comparable to other therapies, yet it is under-researched and often used only as a control condition, and critics warn it may foster dependency. </w:t>
+        <w:t xml:space="preserve"> found supportive therapy gave more lasting change than expected. Later work shows it comparable to other therapies, yet it is under-researched and often used only as a control condition, and critics warn it may foster dependency. </w:t>
       </w:r>
       <w:r>
         <w:rPr>
@@ -9011,7 +9017,7 @@
         <w:rPr>
           <w:i/>
         </w:rPr>
-        <w:t>Clinical hypnotherapy uses hypnosis, a state of focused attention and heightened responsiveness to suggestion, to help clients modify perception, emotion and behaviour, moving through pre-induction, induction, deepening, a therapeutic phase and re-alerting to treat pain, anxiety and habit problems, usually as an adjunct.</w:t>
+        <w:t>Clinical hypnotherapy uses hypnosis, a state of narrow, focused attention in which a person responds more readily to suggestion. In that state the therapist helps change how the client perceives, feels and behaves. A session moves through five steps and is mostly used as an add-on to treat pain, anxiety and habits.</w:t>
       </w:r>
     </w:p>
     <w:p>
@@ -9073,7 +9079,7 @@
               <w:t>American Psychological Association (Division 30)</w:t>
             </w:r>
             <w:r>
-              <w:t xml:space="preserve"> characterises </w:t>
+              <w:t xml:space="preserve"> describes </w:t>
             </w:r>
             <w:r>
               <w:t xml:space="preserve">hypnosis </w:t>
@@ -9082,10 +9088,10 @@
               <w:rPr>
                 <w:i/>
               </w:rPr>
-              <w:t>(a state of focused attention with reduced peripheral awareness and heightened response to suggestion)</w:t>
-            </w:r>
-            <w:r>
-              <w:t xml:space="preserve"> as a state of consciousness involving focused attention and reduced peripheral awareness, marked by an enhanced capacity for response to suggestion. </w:t>
+              <w:t>(a state of narrowly focused attention, less awareness of surroundings, and a greater readiness to respond to suggestion)</w:t>
+            </w:r>
+            <w:r>
+              <w:t xml:space="preserve">. It is a state of consciousness, not sleep. </w:t>
             </w:r>
             <w:r>
               <w:rPr>
@@ -9121,10 +9127,10 @@
               <w:rPr>
                 <w:b/>
               </w:rPr>
-              <w:t>permissive, indirect and utilisation</w:t>
-            </w:r>
-            <w:r>
-              <w:t xml:space="preserve"> approach, using the client's own imagery and language rather than authoritarian commands. </w:t>
+              <w:t>permissive, indirect</w:t>
+            </w:r>
+            <w:r>
+              <w:t xml:space="preserve"> style. He used the client's own imagery and words rather than giving bossy commands. </w:t>
             </w:r>
             <w:r>
               <w:rPr>
@@ -9145,7 +9151,7 @@
               <w:t xml:space="preserve">Theoretical view: </w:t>
             </w:r>
             <w:r>
-              <w:t xml:space="preserve"> Theories divide into </w:t>
+              <w:t xml:space="preserve"> Theories split into </w:t>
             </w:r>
             <w:r>
               <w:rPr>
@@ -9154,7 +9160,7 @@
               <w:t>state views</w:t>
             </w:r>
             <w:r>
-              <w:t xml:space="preserve">, such as Hilgard's neodissociation, and </w:t>
+              <w:t xml:space="preserve">, like Hilgard's neodissociation (hypnosis is a real altered state), and </w:t>
             </w:r>
             <w:r>
               <w:rPr>
@@ -9208,7 +9214,7 @@
         <w:t>Mesmer's animal magnetism</w:t>
       </w:r>
       <w:r>
-        <w:t xml:space="preserve"> in the 1770s, through Puysegur's artificial somnambulism and James Braid, who in 1843 coined the word hypnosis from the Greek for sleep. </w:t>
+        <w:t xml:space="preserve"> in the 1770s, through Puysegur's artificial somnambulism, and James Braid, who in 1843 coined 'hypnosis' from the Greek for sleep. </w:t>
       </w:r>
       <w:r>
         <w:rPr>
@@ -9241,7 +9247,7 @@
         <w:t>Nancy school of Liebeault and Bernheim</w:t>
       </w:r>
       <w:r>
-        <w:t xml:space="preserve">, who saw hypnosis as suggestion, Charcot and Janet on hysteria and dissociation, and Breuer and Freud's early catharsis under hypnosis, which Freud later abandoned. </w:t>
+        <w:t xml:space="preserve"> (who saw hypnosis as suggestion), Charcot and Janet on hysteria and dissociation, and Breuer and Freud's early catharsis under hypnosis, which Freud later gave up. </w:t>
       </w:r>
       <w:r>
         <w:rPr>
@@ -9274,7 +9280,7 @@
         <w:t>Milton Erickson's</w:t>
       </w:r>
       <w:r>
-        <w:t xml:space="preserve"> permissive and indirect method and by Hilgard's neodissociation theory with the Stanford scales, alongside socio-cognitive theorists such as Barber, Sarbin, Spanos and Kirsch. </w:t>
+        <w:t xml:space="preserve"> permissive, indirect method, by Hilgard's neodissociation theory with the Stanford scales, and by socio-cognitive theorists like Barber, Sarbin, Spanos and Kirsch. </w:t>
       </w:r>
       <w:r>
         <w:rPr>
@@ -9289,7 +9295,7 @@
         <w:pStyle w:val="ListBullet"/>
       </w:pPr>
       <w:r>
-        <w:t xml:space="preserve">The first basis is the nature of the hypnotic state, marked by </w:t>
+        <w:t xml:space="preserve">The first basis is the nature of the hypnotic state: </w:t>
       </w:r>
       <w:r>
         <w:rPr>
@@ -9298,7 +9304,7 @@
         <w:t>absorption, focused attention and suggestibility</w:t>
       </w:r>
       <w:r>
-        <w:t xml:space="preserve"> with reduced critical analysis, and it is important that hypnosis is </w:t>
+        <w:t xml:space="preserve"> with reduced critical judgement. Importantly, hypnosis is </w:t>
       </w:r>
       <w:r>
         <w:rPr>
@@ -9331,7 +9337,7 @@
         <w:t>state and non-state theories</w:t>
       </w:r>
       <w:r>
-        <w:t xml:space="preserve">, where one camp sees an altered state of dissociation and the other sees role-taking, expectancy and imagination, with neuroimaging showing changes in attention and default-mode networks. </w:t>
+        <w:t xml:space="preserve">. One camp sees a real altered state of dissociation; the other sees role-taking, expectancy and imagination. Brain imaging shows changes in attention and default-mode networks. </w:t>
       </w:r>
       <w:r>
         <w:rPr>
@@ -9355,10 +9361,10 @@
         <w:rPr>
           <w:i/>
         </w:rPr>
-        <w:t>(a stable trait describing how readily a person responds to hypnotic suggestion)</w:t>
-      </w:r>
-      <w:r>
-        <w:t xml:space="preserve">, a fairly stable trait that varies across people and is measured by scales such as the Stanford and Harvard group scales. </w:t>
+        <w:t>(how easily a given person responds to hypnotic suggestion, which stays fairly fixed, like a stable trait)</w:t>
+      </w:r>
+      <w:r>
+        <w:t xml:space="preserve">. It varies across people and is measured by scales like the Stanford and Harvard group scales. </w:t>
       </w:r>
       <w:r>
         <w:rPr>
@@ -9382,7 +9388,7 @@
         <w:t>formulation</w:t>
       </w:r>
       <w:r>
-        <w:t xml:space="preserve">, symptoms, habits, pain and anxiety are seen as maintained by </w:t>
+        <w:t xml:space="preserve">, symptoms, habits, pain and anxiety are seen as kept going by </w:t>
       </w:r>
       <w:r>
         <w:rPr>
@@ -9391,7 +9397,7 @@
         <w:t>automatic learned responses</w:t>
       </w:r>
       <w:r>
-        <w:t xml:space="preserve"> and by negative beliefs and imagery, which focused attention and suggestion can be used to modify. </w:t>
+        <w:t xml:space="preserve"> and by negative beliefs and imagery. Focused attention and suggestion can be used to change them. </w:t>
       </w:r>
       <w:r>
         <w:rPr>
@@ -9424,7 +9430,7 @@
         <w:t>symptom control</w:t>
       </w:r>
       <w:r>
-        <w:t xml:space="preserve">, especially of pain and anxiety, habit change, relaxation, increased self-efficacy and ego-strength, and the teaching of self-hypnosis so the client can manage symptoms alone. </w:t>
+        <w:t xml:space="preserve">, especially of pain and anxiety, habit change, relaxation, more self-efficacy and ego-strength, and teaching self-hypnosis so the client can manage symptoms alone. </w:t>
       </w:r>
       <w:r>
         <w:rPr>
@@ -9457,7 +9463,7 @@
         <w:t>pre-induction phase</w:t>
       </w:r>
       <w:r>
-        <w:t xml:space="preserve">, which secures consent, takes a history, explains hypnosis and dispels the myths of lost control or revealed secrets, and builds expectancy and rapport. </w:t>
+        <w:t xml:space="preserve">. It secures consent, takes a history, explains hypnosis, and clears up the myths of lost control or revealed secrets, while building expectancy and rapport. </w:t>
       </w:r>
       <w:r>
         <w:rPr>
@@ -9481,7 +9487,7 @@
         <w:t>induction technique</w:t>
       </w:r>
       <w:r>
-        <w:t xml:space="preserve"> then narrows attention through eye fixation, progressive relaxation, breathing or imagery, with Ericksonian inductions using </w:t>
+        <w:t xml:space="preserve"> then narrows attention through eye fixation, progressive relaxation, breathing or imagery. Ericksonian inductions use </w:t>
       </w:r>
       <w:r>
         <w:rPr>
@@ -9523,10 +9529,10 @@
         <w:rPr>
           <w:i/>
         </w:rPr>
-        <w:t>(repeatedly lifting and re-inducing trance to deepen it)</w:t>
-      </w:r>
-      <w:r>
-        <w:t xml:space="preserve">, which intensify the hypnotic experience before therapeutic work begins. </w:t>
+        <w:t>(lifting the person out of trance and taking them back in again, repeatedly, so each dip goes deeper)</w:t>
+      </w:r>
+      <w:r>
+        <w:t xml:space="preserve">, to intensify the experience before therapeutic work. </w:t>
       </w:r>
       <w:r>
         <w:rPr>
@@ -9559,7 +9565,7 @@
         <w:t>direct and indirect suggestions, metaphors and ego-strengthening</w:t>
       </w:r>
       <w:r>
-        <w:t xml:space="preserve">, together with imagery and rehearsal and, where indicated, hypnotic analgesia such as glove anaesthesia. </w:t>
+        <w:t xml:space="preserve">, plus imagery and rehearsal. Where helpful, hypnotic analgesia such as glove anaesthesia is used for pain. </w:t>
       </w:r>
       <w:r>
         <w:rPr>
@@ -9592,10 +9598,10 @@
         <w:rPr>
           <w:i/>
         </w:rPr>
-        <w:t>(uncovering and working through buried material under hypnosis)</w:t>
-      </w:r>
-      <w:r>
-        <w:t xml:space="preserve">, post-hypnotic suggestions and anchoring, desensitisation and parts therapy, all used with caution. </w:t>
+        <w:t>(uncovering and working through buried memories or feelings while the person is under hypnosis)</w:t>
+      </w:r>
+      <w:r>
+        <w:t xml:space="preserve">, post-hypnotic suggestions and anchoring, desensitisation and parts therapy, all used with care. </w:t>
       </w:r>
       <w:r>
         <w:rPr>
@@ -9619,7 +9625,7 @@
         <w:t>technique</w:t>
       </w:r>
       <w:r>
-        <w:t xml:space="preserve"> is termination, a careful </w:t>
+        <w:t xml:space="preserve"> is termination: a careful </w:t>
       </w:r>
       <w:r>
         <w:rPr>
@@ -9628,7 +9634,7 @@
         <w:t>re-alerting or dehypnosis</w:t>
       </w:r>
       <w:r>
-        <w:t xml:space="preserve"> by counting up and reorienting the client, followed by discussion and the teaching of self-hypnosis for ongoing practice. </w:t>
+        <w:t xml:space="preserve"> by counting up and reorienting the client, followed by discussion and teaching self-hypnosis for ongoing practice. </w:t>
       </w:r>
       <w:r>
         <w:rPr>
@@ -9652,7 +9658,7 @@
         <w:t>stages and process</w:t>
       </w:r>
       <w:r>
-        <w:t xml:space="preserve"> the session therefore moves through the fixed sequence of </w:t>
+        <w:t xml:space="preserve"> the session therefore follows the fixed order of </w:t>
       </w:r>
       <w:r>
         <w:rPr>
@@ -9661,7 +9667,7 @@
         <w:t>pre-induction, induction, deepening, therapeutic phase and termination</w:t>
       </w:r>
       <w:r>
-        <w:t xml:space="preserve">, each step prepared before the next is attempted. </w:t>
+        <w:t xml:space="preserve">, each step set up before the next is tried. </w:t>
       </w:r>
       <w:r>
         <w:rPr>
@@ -9685,7 +9691,7 @@
         <w:t>outcome</w:t>
       </w:r>
       <w:r>
-        <w:t xml:space="preserve"> sought is reduced pain and anxiety, changed habits and greater self-efficacy, and gains are strengthened when the client practises </w:t>
+        <w:t xml:space="preserve"> sought is less pain and anxiety, changed habits and greater self-efficacy. Gains are stronger when the client practises </w:t>
       </w:r>
       <w:r>
         <w:rPr>
@@ -9715,13 +9721,13 @@
         <w:t>Indications</w:t>
       </w:r>
       <w:r>
-        <w:t xml:space="preserve"> include chronic and procedural pain, labour and dental pain, anxiety and phobias, irritable bowel syndrome, insomnia, habit disorders and psychosomatic problems, while </w:t>
-      </w:r>
-      <w:r>
-        <w:rPr>
-          <w:b/>
-        </w:rPr>
-        <w:t>contraindications and cautions</w:t>
+        <w:t xml:space="preserve"> include chronic and procedural pain, labour and dental pain, anxiety and phobias, irritable bowel syndrome, insomnia, habit disorders and psychosomatic problems. </w:t>
+      </w:r>
+      <w:r>
+        <w:rPr>
+          <w:b/>
+        </w:rPr>
+        <w:t>Contraindications and cautions</w:t>
       </w:r>
       <w:r>
         <w:t xml:space="preserve"> cover psychosis, severe personality disorder and the risk of false memory in forensic use. </w:t>
@@ -9754,10 +9760,10 @@
         <w:rPr>
           <w:b/>
         </w:rPr>
-        <w:t>adding hypnosis to cognitive-behavioural therapy improves outcomes</w:t>
-      </w:r>
-      <w:r>
-        <w:t xml:space="preserve">, with strong evidence for pain, irritable bowel syndrome and procedural distress, moderate evidence for anxiety and weaker or inconclusive evidence for smoking and weight loss. </w:t>
+        <w:t>adding hypnosis to CBT improves outcomes</w:t>
+      </w:r>
+      <w:r>
+        <w:t xml:space="preserve">. Evidence is strong for pain, irritable bowel syndrome and procedural distress, moderate for anxiety, and weaker or unclear for smoking and weight loss. </w:t>
       </w:r>
       <w:r>
         <w:rPr>
@@ -9864,7 +9870,7 @@
         <w:rPr>
           <w:i/>
         </w:rPr>
-        <w:t>Play therapy treats play as the child's natural language, so that toys become words and play becomes speech, and it uses a safe playroom and a trained therapist, in directive or non-directive form, to help children express and master emotions, trauma and relationship difficulties.</w:t>
+        <w:t>Play therapy treats play as the child's natural language. In it, toys become the child's words and play becomes the child's speech. Using a safe playroom and a trained therapist, in either directive or non-directive form, it helps children express and work through emotions, trauma and relationship difficulties.</w:t>
       </w:r>
     </w:p>
     <w:p>
@@ -9926,7 +9932,7 @@
               <w:t>play is the child's natural language</w:t>
             </w:r>
             <w:r>
-              <w:t xml:space="preserve">, so that, in Landreth's phrase, toys are the child's words and play is the child's speech. </w:t>
+              <w:t xml:space="preserve">. As Landreth put it, toys are the child's words and play is the child's speech. Children show in play what they cannot yet say in words. </w:t>
             </w:r>
             <w:r>
               <w:rPr>
@@ -9965,7 +9971,7 @@
               <w:t>non-directive, child-centred</w:t>
             </w:r>
             <w:r>
-              <w:t xml:space="preserve"> form in 1947 and its eight guiding principles, applying Rogerian conditions to children. </w:t>
+              <w:t xml:space="preserve"> form in 1947, with its eight guiding principles. She applied Rogers' conditions to children. </w:t>
             </w:r>
             <w:r>
               <w:rPr>
@@ -9995,7 +10001,7 @@
               <w:t>Anna Freud and Melanie Klein</w:t>
             </w:r>
             <w:r>
-              <w:t xml:space="preserve">, who first used play analytically, and forward to Landreth's child-centred play therapy and Knell's cognitive-behavioural play therapy. </w:t>
+              <w:t xml:space="preserve">, who first used play in analysis, and forward to Landreth's child-centred play therapy and Knell's cognitive-behavioural play therapy. </w:t>
             </w:r>
             <w:r>
               <w:rPr>
@@ -10040,7 +10046,7 @@
         <w:t>Freud's case of Little Hans</w:t>
       </w:r>
       <w:r>
-        <w:t xml:space="preserve"> in 1909 and Hermine Hug-Hellmuth, the first to use play with children, before </w:t>
+        <w:t xml:space="preserve"> in 1909 and Hermine Hug-Hellmuth, the first to use play with children. Then </w:t>
       </w:r>
       <w:r>
         <w:rPr>
@@ -10082,7 +10088,7 @@
         <w:t>Virginia Axline's</w:t>
       </w:r>
       <w:r>
-        <w:t xml:space="preserve"> non-directive play therapy in 1947 and her book Dibs: In Search of Self, and on to the Guerneys' filial therapy, Landreth's child-centred play therapy and Schaefer's founding of the Association for Play Therapy. </w:t>
+        <w:t xml:space="preserve"> non-directive play therapy in 1947 and her book Dibs: In Search of Self. It moves on to the Guerneys' filial therapy, Landreth's child-centred play therapy and Schaefer's founding of the Association for Play Therapy. </w:t>
       </w:r>
       <w:r>
         <w:rPr>
@@ -10106,7 +10112,7 @@
         <w:t>play is the child's natural language</w:t>
       </w:r>
       <w:r>
-        <w:t xml:space="preserve">, since children cannot easily put abstract thoughts and feelings into words and so express them through symbolic play with toys. </w:t>
+        <w:t xml:space="preserve">. Children cannot easily put abstract thoughts and feelings into words, so they express them through symbolic play with toys. </w:t>
       </w:r>
       <w:r>
         <w:rPr>
@@ -10130,10 +10136,10 @@
         <w:rPr>
           <w:i/>
         </w:rPr>
-        <w:t>(the specific ways play heals, such as communication, catharsis and relationship building)</w:t>
-      </w:r>
-      <w:r>
-        <w:t xml:space="preserve">, named by Schaefer as communication, emotional wellness, stronger relationships and increased personal strengths. </w:t>
+        <w:t>(the specific ways play actually heals, such as helping a child communicate, release feelings and build relationships)</w:t>
+      </w:r>
+      <w:r>
+        <w:t xml:space="preserve">, which Schaefer named as communication, emotional wellness, stronger relationships and increased personal strengths. </w:t>
       </w:r>
       <w:r>
         <w:rPr>
@@ -10157,7 +10163,7 @@
         <w:t>several theories</w:t>
       </w:r>
       <w:r>
-        <w:t xml:space="preserve">, the psychoanalytic, the humanistic and child-centred, the attachment, the cognitive-behavioural and the developmental, so it can be directive or non-directive. </w:t>
+        <w:t xml:space="preserve">: psychoanalytic, humanistic and child-centred, attachment, cognitive-behavioural and developmental. So it can be directive or non-directive. </w:t>
       </w:r>
       <w:r>
         <w:rPr>
@@ -10181,7 +10187,7 @@
         <w:t>Axline's eight principles</w:t>
       </w:r>
       <w:r>
-        <w:t xml:space="preserve">, which include building a warm relationship, accepting the child exactly as they are, reflecting feelings and respecting the child's own capacity to solve problems. </w:t>
+        <w:t xml:space="preserve">. These include building a warm relationship, accepting the child exactly as they are, reflecting feelings, and respecting the child's own ability to solve problems. </w:t>
       </w:r>
       <w:r>
         <w:rPr>
@@ -10214,7 +10220,7 @@
         <w:t>blocked emotions</w:t>
       </w:r>
       <w:r>
-        <w:t xml:space="preserve">, trauma, insecure attachment or unmet needs, which play lets them express and master safely at a symbolic distance from the real event. </w:t>
+        <w:t xml:space="preserve">, trauma, insecure attachment or unmet needs. Play lets the child express and master these safely, at a symbolic distance from the real event. For example, a scared child may make dolls act out a frightening scene. </w:t>
       </w:r>
       <w:r>
         <w:rPr>
@@ -10247,7 +10253,7 @@
         <w:t>emotional expression and regulation</w:t>
       </w:r>
       <w:r>
-        <w:t xml:space="preserve">, a better self-concept and self-esteem, social skills and coping, the resolution of trauma or conflict and a strengthened parent-child attachment. </w:t>
+        <w:t xml:space="preserve">, a better self-concept and self-esteem, social skills and coping, the resolution of trauma or conflict, and a stronger parent-child attachment. </w:t>
       </w:r>
       <w:r>
         <w:rPr>
@@ -10280,7 +10286,7 @@
         <w:t>playroom and its toys</w:t>
       </w:r>
       <w:r>
-        <w:t xml:space="preserve">, sorted into real-life toys such as a doll house, acting-out and aggressive toys such as puppets and a bop bag, and creative media such as sand, clay and paint. </w:t>
+        <w:t xml:space="preserve">, sorted into three kinds: real-life toys like a doll house, acting-out and aggressive toys like puppets and a bop bag, and creative media like sand, clay and paint. </w:t>
       </w:r>
       <w:r>
         <w:rPr>
@@ -10313,7 +10319,7 @@
         <w:t>tracking</w:t>
       </w:r>
       <w:r>
-        <w:t xml:space="preserve"> the child's play aloud, reflecting feelings, returning responsibility with phrases such as 'you can decide' and encouragement that follows rather than steers the child. </w:t>
+        <w:t xml:space="preserve"> the child's play aloud, reflecting feelings, returning responsibility with phrases like 'you can decide', and encouragement that follows rather than steers the child. </w:t>
       </w:r>
       <w:r>
         <w:rPr>
@@ -10346,7 +10352,7 @@
         <w:rPr>
           <w:i/>
         </w:rPr>
-        <w:t>(acknowledge the feeling, communicate the limit, target an alternative)</w:t>
+        <w:t>(a three-step way to set a limit: Acknowledge the feeling, Communicate the limit, Target an acceptable alternative)</w:t>
       </w:r>
       <w:r>
         <w:t xml:space="preserve">, which keeps the playroom safe without shaming the child. </w:t>
@@ -10382,7 +10388,7 @@
         <w:t>puppets, sandplay, drawing and storytelling</w:t>
       </w:r>
       <w:r>
-        <w:t xml:space="preserve">, Gardner's mutual storytelling, bibliotherapy, role play, therapeutic games and cognitive-behavioural play that uses modelling and exposure. </w:t>
+        <w:t xml:space="preserve">, Gardner's mutual storytelling, bibliotherapy, role play, therapeutic games, and cognitive-behavioural play that uses modelling and exposure. </w:t>
       </w:r>
       <w:r>
         <w:rPr>
@@ -10406,7 +10412,7 @@
         <w:t>techniques</w:t>
       </w:r>
       <w:r>
-        <w:t xml:space="preserve"> are distinctive, since </w:t>
+        <w:t xml:space="preserve"> are distinctive. In </w:t>
       </w:r>
       <w:r>
         <w:rPr>
@@ -10415,7 +10421,7 @@
         <w:t>filial therapy and child-parent relationship therapy</w:t>
       </w:r>
       <w:r>
-        <w:t xml:space="preserve"> train parents to hold play sessions at home, and Theraplay builds structure, engagement, nurture and challenge. </w:t>
+        <w:t xml:space="preserve"> the therapist trains parents to run play sessions at home. Theraplay builds structure, engagement, nurture and challenge. </w:t>
       </w:r>
       <w:r>
         <w:rPr>
@@ -10481,7 +10487,7 @@
         <w:t>working-through phase</w:t>
       </w:r>
       <w:r>
-        <w:t xml:space="preserve"> of aggression, regression, limit-testing and dramatic play toward mastery, and then a termination for which the child is prepared early, usually across about twelve to twenty weekly sessions. </w:t>
+        <w:t xml:space="preserve"> of aggression, regression, limit-testing and dramatic play toward mastery. Then comes a termination that the child is prepared for early, usually across about twelve to twenty weekly sessions. </w:t>
       </w:r>
       <w:r>
         <w:rPr>
@@ -10514,7 +10520,7 @@
         <w:t>better emotional expression, behaviour and self-esteem</w:t>
       </w:r>
       <w:r>
-        <w:t xml:space="preserve">, improved social skills and a stronger parent-child relationship, especially when parents are actively involved. </w:t>
+        <w:t xml:space="preserve">, improved social skills and a stronger parent-child relationship, especially when parents take an active part. </w:t>
       </w:r>
       <w:r>
         <w:rPr>
@@ -10535,13 +10541,13 @@
         <w:t>Indications</w:t>
       </w:r>
       <w:r>
-        <w:t xml:space="preserve"> are children of about three to twelve years with anxiety, fears, trauma and abuse, bereavement, parental divorce, adjustment and behaviour problems and selective mutism, while </w:t>
-      </w:r>
-      <w:r>
-        <w:rPr>
-          <w:b/>
-        </w:rPr>
-        <w:t>adolescents</w:t>
+        <w:t xml:space="preserve"> are children of about three to twelve years with anxiety, fears, trauma and abuse, bereavement, parental divorce, adjustment and behaviour problems, and selective mutism. </w:t>
+      </w:r>
+      <w:r>
+        <w:rPr>
+          <w:b/>
+        </w:rPr>
+        <w:t>Adolescents</w:t>
       </w:r>
       <w:r>
         <w:t xml:space="preserve"> may need talk, art or drama instead. </w:t>
@@ -10577,7 +10583,7 @@
         <w:t>Bratton and colleagues'</w:t>
       </w:r>
       <w:r>
-        <w:t xml:space="preserve"> 2005 meta-analysis of ninety-three studies reported a large mean effect, larger when parents took part, and later child-centred play therapy reviews show moderate to large effects, though critics note methodological weaknesses. </w:t>
+        <w:t xml:space="preserve"> 2005 meta-analysis of ninety-three studies reported a large mean effect, larger when parents took part. Later child-centred play therapy reviews show moderate to large effects, though critics note methodological weaknesses. </w:t>
       </w:r>
       <w:r>
         <w:rPr>
@@ -10684,7 +10690,7 @@
         <w:rPr>
           <w:i/>
         </w:rPr>
-        <w:t>Psychodrama is J. L. Moreno's action-based group therapy in which a protagonist enacts rather than merely describes their conflicts, using a director, auxiliary egos, an audience and a stage, so that spontaneity and new roles are restored through warm-up, action and sharing.</w:t>
+        <w:t>Psychodrama is J. L. Moreno's action-based group therapy. One group member, the protagonist, acts out their conflict instead of just talking about it. A director, helpers playing other people, an audience and a stage make this possible. The work restores spontaneity and new roles through three phases: warm-up, action and sharing.</w:t>
       </w:r>
     </w:p>
     <w:p>
@@ -10746,7 +10752,7 @@
               <w:t>Jacob L. Moreno</w:t>
             </w:r>
             <w:r>
-              <w:t xml:space="preserve"> created psychodrama from his Theatre of Spontaneity, coined the term </w:t>
+              <w:t xml:space="preserve"> created psychodrama out of his Theatre of Spontaneity. He coined the term </w:t>
             </w:r>
             <w:r>
               <w:rPr>
@@ -10755,7 +10761,7 @@
               <w:t>group psychotherapy</w:t>
             </w:r>
             <w:r>
-              <w:t xml:space="preserve"> and developed sociometry, the measurement of relationships within a group. </w:t>
+              <w:t xml:space="preserve"> and developed sociometry, a way of measuring the relationships within a group. </w:t>
             </w:r>
             <w:r>
               <w:rPr>
@@ -10785,10 +10791,10 @@
               <w:rPr>
                 <w:i/>
               </w:rPr>
-              <w:t>(a fresh, adequate response to a new or old situation)</w:t>
-            </w:r>
-            <w:r>
-              <w:t xml:space="preserve"> and creativity are the basis of mental health, so that pathology is a loss of spontaneity and rigid roles. </w:t>
+              <w:t>(the ability to respond freshly and well to a situation, old or new, instead of on autopilot)</w:t>
+            </w:r>
+            <w:r>
+              <w:t xml:space="preserve"> and creativity are the basis of mental health. So trouble is a loss of spontaneity and getting stuck in rigid roles. </w:t>
             </w:r>
             <w:r>
               <w:rPr>
@@ -10818,7 +10824,7 @@
               <w:t>five instruments</w:t>
             </w:r>
             <w:r>
-              <w:t xml:space="preserve">, the protagonist, the director, the auxiliary egos, the audience and the stage, that together make enactment possible. </w:t>
+              <w:t xml:space="preserve">: the protagonist, the director, the auxiliary egos, the audience and the stage. Together they make the enactment possible. </w:t>
             </w:r>
             <w:r>
               <w:rPr>
@@ -10863,7 +10869,7 @@
         <w:t>Jacob L. Moreno</w:t>
       </w:r>
       <w:r>
-        <w:t xml:space="preserve"> in Vienna, whose Theatre of Spontaneity in 1921 led, after he moved to the United States, to the Beacon sanatorium and the systematic method of action-based group therapy. </w:t>
+        <w:t xml:space="preserve"> in Vienna. His Theatre of Spontaneity in 1921 led, after he moved to the United States, to the Beacon sanatorium and a systematic method of action-based group therapy. </w:t>
       </w:r>
       <w:r>
         <w:rPr>
@@ -10896,7 +10902,7 @@
         <w:t>Zerka Moreno</w:t>
       </w:r>
       <w:r>
-        <w:t xml:space="preserve"> as a key developer, and the method went on to influence Gestalt therapy, drama therapy, role play and the behavioural rehearsal used in cognitive-behavioural work. </w:t>
+        <w:t xml:space="preserve"> as a key developer. The method went on to influence Gestalt therapy, drama therapy, role play and the behavioural rehearsal used in CBT. </w:t>
       </w:r>
       <w:r>
         <w:rPr>
@@ -10920,7 +10926,7 @@
         <w:t>spontaneity and creativity</w:t>
       </w:r>
       <w:r>
-        <w:t xml:space="preserve"> are the foundations of mental health, so that distress is understood as a loss of spontaneity, rigid role patterns and unfinished action. </w:t>
+        <w:t xml:space="preserve"> are the foundations of mental health. So distress is understood as lost spontaneity, rigid role patterns and unfinished action. </w:t>
       </w:r>
       <w:r>
         <w:rPr>
@@ -10944,7 +10950,7 @@
         <w:t>role theory</w:t>
       </w:r>
       <w:r>
-        <w:t xml:space="preserve">, covering role-taking, role-playing and role-creating, so that role conflict and role rigidity are seen as central to psychological problems. </w:t>
+        <w:t xml:space="preserve">, covering role-taking, role-playing and role-creating. Role conflict and role rigidity are seen as central to psychological problems. </w:t>
       </w:r>
       <w:r>
         <w:rPr>
@@ -10968,10 +10974,10 @@
         <w:rPr>
           <w:i/>
         </w:rPr>
-        <w:t>(a two-way flow of genuine feeling and understanding between people)</w:t>
-      </w:r>
-      <w:r>
-        <w:t xml:space="preserve">, Moreno's term for the mutual empathy that binds a group, distinct from one-way transference. </w:t>
+        <w:t>(a genuine two-way flow of feeling and understanding between people, unlike one-sided transference)</w:t>
+      </w:r>
+      <w:r>
+        <w:t xml:space="preserve">. Moreno used the word for the real mutual empathy that binds a group. </w:t>
       </w:r>
       <w:r>
         <w:rPr>
@@ -10995,7 +11001,7 @@
         <w:t>catharsis, encounter and surplus reality</w:t>
       </w:r>
       <w:r>
-        <w:t xml:space="preserve">, the last letting a client enact what never happened or what is feared or wished, all worked in the here-and-now moment. </w:t>
+        <w:t xml:space="preserve">. Surplus reality lets a client act out what never happened, or what is feared or wished, all worked in the here-and-now. </w:t>
       </w:r>
       <w:r>
         <w:rPr>
@@ -11025,10 +11031,10 @@
         <w:rPr>
           <w:b/>
         </w:rPr>
-        <w:t>limited or conflicting role repertoire</w:t>
-      </w:r>
-      <w:r>
-        <w:t xml:space="preserve">, blocked spontaneity and unresolved relationships and events, which enactment brings into the open to be experienced and changed. </w:t>
+        <w:t>limited or conflicting set of roles</w:t>
+      </w:r>
+      <w:r>
+        <w:t xml:space="preserve">, blocked spontaneity and unresolved relationships and events. Enactment brings these into the open to be experienced and changed. </w:t>
       </w:r>
       <w:r>
         <w:rPr>
@@ -11061,7 +11067,7 @@
         <w:t>catharsis and release</w:t>
       </w:r>
       <w:r>
-        <w:t xml:space="preserve">, insight and a wider role repertoire, renewed spontaneity, better interpersonal skills, the resolution of unfinished business and group cohesion and support. </w:t>
+        <w:t xml:space="preserve">, insight and a wider range of roles, renewed spontaneity, better interpersonal skills, the resolution of unfinished business, and group cohesion and support. </w:t>
       </w:r>
       <w:r>
         <w:rPr>
@@ -11094,7 +11100,7 @@
         <w:t>five instruments</w:t>
       </w:r>
       <w:r>
-        <w:t xml:space="preserve">, the protagonist whose issue is explored, the director who guides, the auxiliary egos who play significant others, the audience who witness and the stage. </w:t>
+        <w:t xml:space="preserve">: the protagonist whose issue is explored, the director who guides, the auxiliary egos who play significant others, the audience who witness, and the stage. </w:t>
       </w:r>
       <w:r>
         <w:rPr>
@@ -11127,10 +11133,10 @@
         <w:rPr>
           <w:i/>
         </w:rPr>
-        <w:t>(the protagonist plays the other person to see through their eyes)</w:t>
-      </w:r>
-      <w:r>
-        <w:t xml:space="preserve">, which builds empathy and insight by letting the protagonist experience the other's position. </w:t>
+        <w:t>(the protagonist swaps and plays the other person, so as to see the situation through their eyes)</w:t>
+      </w:r>
+      <w:r>
+        <w:t xml:space="preserve">. It builds empathy and insight by letting the protagonist feel the other's position. </w:t>
       </w:r>
       <w:r>
         <w:rPr>
@@ -11163,7 +11169,7 @@
         <w:t>doubling</w:t>
       </w:r>
       <w:r>
-        <w:t xml:space="preserve">, in which an auxiliary voices the protagonist's unspoken feelings, and </w:t>
+        <w:t xml:space="preserve">, where a helper voices the protagonist's unspoken feelings. There is also </w:t>
       </w:r>
       <w:r>
         <w:rPr>
@@ -11172,7 +11178,7 @@
         <w:t>mirroring</w:t>
       </w:r>
       <w:r>
-        <w:t xml:space="preserve">, in which the protagonist watches an auxiliary portray them from the outside. </w:t>
+        <w:t xml:space="preserve">, where the protagonist watches a helper play them from the outside, like seeing themselves on film. </w:t>
       </w:r>
       <w:r>
         <w:rPr>
@@ -11205,7 +11211,7 @@
         <w:t>soliloquy, the empty chair and future projection</w:t>
       </w:r>
       <w:r>
-        <w:t xml:space="preserve">, together with concretisation, sculpting, the social atom and the magic shop, which make abstract feelings concrete. </w:t>
+        <w:t xml:space="preserve">, plus concretisation, sculpting, the social atom and the magic shop, which make abstract feelings concrete and visible. </w:t>
       </w:r>
       <w:r>
         <w:rPr>
@@ -11238,7 +11244,7 @@
         <w:t>sociodrama</w:t>
       </w:r>
       <w:r>
-        <w:t xml:space="preserve">, which turns the same action methods onto shared group or social issues rather than one person's private conflict. </w:t>
+        <w:t xml:space="preserve">, which turns the same action methods onto shared group or social issues, rather than one person's private conflict. </w:t>
       </w:r>
       <w:r>
         <w:rPr>
@@ -11271,7 +11277,7 @@
         <w:t>warm-up</w:t>
       </w:r>
       <w:r>
-        <w:t xml:space="preserve"> in which the director builds trust and a protagonist emerges, so the group is ready for action. </w:t>
+        <w:t xml:space="preserve">. The director builds trust and a protagonist emerges, so the group is ready for action. </w:t>
       </w:r>
       <w:r>
         <w:rPr>
@@ -11295,7 +11301,7 @@
         <w:t>action phase</w:t>
       </w:r>
       <w:r>
-        <w:t xml:space="preserve"> then sets and enacts the scene, often moving from the present into the past, using role reversal, doubling and mirroring to reach a peak of emotion and new solutions before the scene is closed. </w:t>
+        <w:t xml:space="preserve"> then sets and acts out the scene, often moving from the present into the past. It uses role reversal, doubling and mirroring to reach a peak of emotion and new solutions before the scene is closed. </w:t>
       </w:r>
       <w:r>
         <w:rPr>
@@ -11328,7 +11334,7 @@
         <w:t>sharing and integration</w:t>
       </w:r>
       <w:r>
-        <w:t xml:space="preserve">, in which the audience offer their own similar experiences rather than analysis or advice, reducing the protagonist's isolation and supporting re-entry. </w:t>
+        <w:t xml:space="preserve">. The audience offer their own similar experiences, rather than analysis or advice. This reduces the protagonist's sense of isolation and helps them re-enter daily life. </w:t>
       </w:r>
       <w:r>
         <w:rPr>
@@ -11361,7 +11367,7 @@
         <w:t>emotional release and insight</w:t>
       </w:r>
       <w:r>
-        <w:t xml:space="preserve">, improved relationships and role flexibility and the support of the group, achieved through doing rather than only talking. </w:t>
+        <w:t xml:space="preserve">, better relationships and role flexibility, and the support of the group, all reached through doing rather than only talking. </w:t>
       </w:r>
       <w:r>
         <w:rPr>
@@ -11382,7 +11388,7 @@
         <w:t>Indications</w:t>
       </w:r>
       <w:r>
-        <w:t xml:space="preserve"> are group settings for trauma, grief, addictions, family and relationship issues, adolescents, social-skills training and psychiatric inpatients, while acute psychosis or a very fragile client without containment is a </w:t>
+        <w:t xml:space="preserve"> are group settings for trauma, grief, addictions, family and relationship issues, adolescents, social-skills training and psychiatric inpatients. Acute psychosis, or a very fragile client without containment, is a </w:t>
       </w:r>
       <w:r>
         <w:rPr>
@@ -11424,7 +11430,7 @@
         <w:t>Kipper and Ritchie's 2003 meta-analysis</w:t>
       </w:r>
       <w:r>
-        <w:t xml:space="preserve"> reported a large effect with role reversal and doubling the most effective techniques, and later reviews show moderate positive evidence, though rigorous randomised trials remain few. </w:t>
+        <w:t xml:space="preserve"> reported a large effect, with role reversal and doubling the most effective techniques. Later reviews show moderate positive evidence, though rigorous randomised trials remain few. </w:t>
       </w:r>
       <w:r>
         <w:rPr>
@@ -11531,7 +11537,7 @@
         <w:rPr>
           <w:i/>
         </w:rPr>
-        <w:t>Oriental approaches are Asian mind-body practices used for mental health, among them yoga, meditation, shavasana, pranic healing, reiki and tai chi, which share a focus on attention, breath and relaxation, but whose evidence ranges from genuine support for mindfulness, yoga and tai chi down to weak and inconclusive findings for energy healing.</w:t>
+        <w:t>Oriental approaches are Asian mind-body practices used for mental health. They include yoga, meditation, shavasana, pranic healing, reiki and tai chi. They all work with attention, breath and relaxation. But their evidence varies a lot: genuine support for mindfulness, yoga and tai chi, down to weak and unclear findings for energy healing.</w:t>
       </w:r>
     </w:p>
     <w:p>
@@ -11593,7 +11599,7 @@
               <w:t>Patanjali's Yoga Sutras</w:t>
             </w:r>
             <w:r>
-              <w:t xml:space="preserve"> characterise </w:t>
+              <w:t xml:space="preserve"> describe </w:t>
             </w:r>
             <w:r>
               <w:t xml:space="preserve">yoga </w:t>
@@ -11602,10 +11608,10 @@
               <w:rPr>
                 <w:i/>
               </w:rPr>
-              <w:t>(the union of body, mind and spirit through an eight-limbed discipline)</w:t>
-            </w:r>
-            <w:r>
-              <w:t xml:space="preserve"> as the cessation of the fluctuations of the mind, achieved through the eight limbs from ethical restraints to absorption. </w:t>
+              <w:t>(the joining of body, mind and spirit through an eight-part discipline)</w:t>
+            </w:r>
+            <w:r>
+              <w:t xml:space="preserve"> as calming the restless chatter of the mind. This is reached through the eight limbs, from ethical rules to deep absorption. </w:t>
             </w:r>
             <w:r>
               <w:rPr>
@@ -11635,7 +11641,7 @@
               <w:t>mindfulness meditation</w:t>
             </w:r>
             <w:r>
-              <w:t xml:space="preserve"> is characterised as non-judgemental, present-moment awareness, adapted by Kabat-Zinn as Mindfulness-Based Stress Reduction and recommended within the World Health Organization's wider promotion of self-care for mental health. </w:t>
+              <w:t xml:space="preserve"> is described as non-judgemental, present-moment awareness. Kabat-Zinn adapted it as Mindfulness-Based Stress Reduction. It sits within the World Health Organization's wider promotion of self-care for mental health. </w:t>
             </w:r>
             <w:r>
               <w:rPr>
@@ -11665,7 +11671,7 @@
               <w:t>Energy-healing</w:t>
             </w:r>
             <w:r>
-              <w:t xml:space="preserve"> practices such as pranic healing and reiki are characterised by their own traditions as the clearing or channelling of a life energy, prana or ki, a claim for which there is </w:t>
+              <w:t xml:space="preserve"> practices like pranic healing and reiki claim to clear or channel a life energy, prana or ki. Their own traditions describe it this way, but there is </w:t>
             </w:r>
             <w:r>
               <w:rPr>
@@ -11674,7 +11680,7 @@
               <w:t>no credible scientific evidence</w:t>
             </w:r>
             <w:r>
-              <w:t xml:space="preserve">. </w:t>
+              <w:t xml:space="preserve"> that such an energy exists. </w:t>
             </w:r>
             <w:r>
               <w:rPr>
@@ -11719,7 +11725,7 @@
         <w:t>Asian philosophical and healing traditions</w:t>
       </w:r>
       <w:r>
-        <w:t xml:space="preserve">, chiefly the Indian, Buddhist, Taoist and Japanese, and many have since been adapted as structured, sometimes evidence-based, interventions. </w:t>
+        <w:t xml:space="preserve">, chiefly Indian, Buddhist, Taoist and Japanese. Many have since been adapted into structured, sometimes evidence-based, interventions. </w:t>
       </w:r>
       <w:r>
         <w:rPr>
@@ -11740,7 +11746,7 @@
         <w:t>Yoga</w:t>
       </w:r>
       <w:r>
-        <w:t xml:space="preserve"> originates in ancient India and was systematised by </w:t>
+        <w:t xml:space="preserve"> comes from ancient India and was systematised by </w:t>
       </w:r>
       <w:r>
         <w:rPr>
@@ -11749,7 +11755,7 @@
         <w:t>Patanjali</w:t>
       </w:r>
       <w:r>
-        <w:t xml:space="preserve"> in the Yoga Sutras as Ashtanga or eight-limbed yoga, with later Hatha yoga and types such as Raja, Karma, Bhakti and Jnana yoga. </w:t>
+        <w:t xml:space="preserve"> in the Yoga Sutras as Ashtanga, or eight-limbed yoga. Later came Hatha yoga and types such as Raja, Karma, Bhakti and Jnana yoga. </w:t>
       </w:r>
       <w:r>
         <w:rPr>
@@ -11782,10 +11788,10 @@
         <w:rPr>
           <w:i/>
         </w:rPr>
-        <w:t>(the joining of body, mind and spirit, the literal meaning of the word yoga)</w:t>
-      </w:r>
-      <w:r>
-        <w:t xml:space="preserve">, reached through the eight limbs of ethical restraints, observances, postures, breath control, sense withdrawal, concentration, meditation and absorption. </w:t>
+        <w:t>(the joining of body, mind and spirit, which is the literal meaning of the word yoga)</w:t>
+      </w:r>
+      <w:r>
+        <w:t xml:space="preserve">. It is reached through the eight limbs: ethical restraints, observances, postures, breath control, sense withdrawal, concentration, meditation and absorption. </w:t>
       </w:r>
       <w:r>
         <w:rPr>
@@ -11818,7 +11824,7 @@
         <w:t>asanas, pranayama breathing and relaxation</w:t>
       </w:r>
       <w:r>
-        <w:t xml:space="preserve">, and well-known studies at NIMHANS and meta-analyses report real benefit as an adjunct for mild to moderate depression and anxiety. </w:t>
+        <w:t xml:space="preserve">. Well-known studies at NIMHANS and meta-analyses report real benefit as an add-on for mild to moderate depression and anxiety. </w:t>
       </w:r>
       <w:r>
         <w:rPr>
@@ -11839,7 +11845,7 @@
         <w:t>Meditation</w:t>
       </w:r>
       <w:r>
-        <w:t xml:space="preserve"> originates in Hindu, Buddhist and Taoist contemplative traditions, and was adapted clinically as </w:t>
+        <w:t xml:space="preserve"> comes from Hindu, Buddhist and Taoist contemplative traditions. It was adapted clinically as </w:t>
       </w:r>
       <w:r>
         <w:rPr>
@@ -11848,7 +11854,7 @@
         <w:t>Mindfulness-Based Stress Reduction</w:t>
       </w:r>
       <w:r>
-        <w:t xml:space="preserve"> by Jon Kabat-Zinn in 1979 and Mindfulness-Based Cognitive Therapy by Segal, Williams and Teasdale. </w:t>
+        <w:t xml:space="preserve"> by Jon Kabat-Zinn in 1979, and as Mindfulness-Based Cognitive Therapy by Segal, Williams and Teasdale. </w:t>
       </w:r>
       <w:r>
         <w:rPr>
@@ -11881,7 +11887,7 @@
         <w:t>training attention and decentring</w:t>
       </w:r>
       <w:r>
-        <w:t xml:space="preserve">, learning to observe thoughts as passing mental events rather than facts, which lowers rumination and increases acceptance and emotion regulation. </w:t>
+        <w:t xml:space="preserve">. Decentring means learning to watch your thoughts as passing mental events, not facts, like watching clouds drift by. This lowers rumination and raises acceptance and emotion control. </w:t>
       </w:r>
       <w:r>
         <w:rPr>
@@ -11905,7 +11911,7 @@
         <w:t>meditation</w:t>
       </w:r>
       <w:r>
-        <w:t xml:space="preserve"> is genuine, since mindfulness-based cognitive therapy is </w:t>
+        <w:t xml:space="preserve"> is genuine. Mindfulness-based cognitive therapy is </w:t>
       </w:r>
       <w:r>
         <w:rPr>
@@ -11914,7 +11920,7 @@
         <w:t>recommended for preventing relapse</w:t>
       </w:r>
       <w:r>
-        <w:t xml:space="preserve"> in recurrent depression and a major review by Goyal and colleagues in 2014 found moderate evidence for anxiety, depression and pain. </w:t>
+        <w:t xml:space="preserve"> in recurrent depression. A major review by Goyal and colleagues in 2014 found moderate evidence for anxiety, depression and pain. </w:t>
       </w:r>
       <w:r>
         <w:rPr>
@@ -11935,7 +11941,7 @@
         <w:t>Shavasana</w:t>
       </w:r>
       <w:r>
-        <w:t xml:space="preserve">, the corpse pose, is the final relaxation posture of a yoga session, and the related </w:t>
+        <w:t xml:space="preserve">, the corpse pose, is the final relaxation posture of a yoga session. The related </w:t>
       </w:r>
       <w:r>
         <w:t xml:space="preserve">Yoga Nidra </w:t>
@@ -11944,7 +11950,7 @@
         <w:rPr>
           <w:i/>
         </w:rPr>
-        <w:t>(a guided deep relaxation also called yogic sleep)</w:t>
+        <w:t>(a guided deep relaxation, sometimes called 'yogic sleep', where you stay aware while the body fully rests)</w:t>
       </w:r>
       <w:r>
         <w:t xml:space="preserve"> was popularised by Swami Satyananda Saraswati. </w:t>
@@ -11980,7 +11986,7 @@
         <w:t>relaxation response</w:t>
       </w:r>
       <w:r>
-        <w:t xml:space="preserve"> like Benson's, which lowers sympathetic arousal, heart rate, blood pressure and muscle tension, resembling Jacobson's progressive muscle relaxation, with small trials showing reduced anxiety and better sleep. </w:t>
+        <w:t xml:space="preserve"> like Benson's. It lowers sympathetic arousal, heart rate, blood pressure and muscle tension, much like Jacobson's progressive muscle relaxation. Small trials show less anxiety and better sleep. </w:t>
       </w:r>
       <w:r>
         <w:rPr>
@@ -12010,7 +12016,7 @@
         <w:t>Master Choa Kok Sui</w:t>
       </w:r>
       <w:r>
-        <w:t xml:space="preserve"> in 1987 and holds that disease results from depleted or congested prana in an energy body, treated by scanning, cleansing and energising the field, usually without touch. </w:t>
+        <w:t xml:space="preserve"> in 1987. It holds that disease comes from depleted or congested prana in an energy body, treated by scanning, cleansing and energising the field, usually without touch. </w:t>
       </w:r>
       <w:r>
         <w:rPr>
@@ -12043,7 +12049,7 @@
         <w:t>very limited and poorly controlled</w:t>
       </w:r>
       <w:r>
-        <w:t xml:space="preserve">, with no credible evidence for a detectable energy field, so any benefit is probably relaxation, attention and expectancy, and it must not replace evidence-based treatment. </w:t>
+        <w:t xml:space="preserve">. There is no credible evidence for a detectable energy field. Any benefit is probably relaxation, attention and expectancy, and it must not replace evidence-based treatment. </w:t>
       </w:r>
       <w:r>
         <w:rPr>
@@ -12064,7 +12070,7 @@
         <w:t>Reiki</w:t>
       </w:r>
       <w:r>
-        <w:t xml:space="preserve"> originates with </w:t>
+        <w:t xml:space="preserve"> comes from </w:t>
       </w:r>
       <w:r>
         <w:rPr>
@@ -12073,7 +12079,7 @@
         <w:t>Mikao Usui</w:t>
       </w:r>
       <w:r>
-        <w:t xml:space="preserve"> in Japan in 1922 and has the practitioner channel a universal life energy through the hands to the client, who lies clothed while the practitioner uses set hand positions. </w:t>
+        <w:t xml:space="preserve"> in Japan in 1922. The practitioner channels a universal life energy through the hands to the client, who lies clothed while set hand positions are used. </w:t>
       </w:r>
       <w:r>
         <w:rPr>
@@ -12106,7 +12112,7 @@
         <w:t>weak and at high risk of bias</w:t>
       </w:r>
       <w:r>
-        <w:t xml:space="preserve">, with reviews such as the Cochrane review for anxiety and depression finding insufficient evidence, so it is best regarded as a complementary comfort measure that should not delay treatment. </w:t>
+        <w:t xml:space="preserve">. Reviews such as the Cochrane review for anxiety and depression find insufficient evidence. So it is best seen as a complementary comfort measure that should not delay treatment. </w:t>
       </w:r>
       <w:r>
         <w:rPr>
@@ -12127,7 +12133,7 @@
         <w:t>Tai chi</w:t>
       </w:r>
       <w:r>
-        <w:t xml:space="preserve"> originates in seventeenth-century China from Taoist philosophy and martial arts and is often called </w:t>
+        <w:t xml:space="preserve"> comes from seventeenth-century China, from Taoist philosophy and martial arts. It is often called </w:t>
       </w:r>
       <w:r>
         <w:rPr>
@@ -12136,7 +12142,7 @@
         <w:t>meditation in motion</w:t>
       </w:r>
       <w:r>
-        <w:t xml:space="preserve">, using slow, flowing, coordinated movements with diaphragmatic breathing and focused attention. </w:t>
+        <w:t xml:space="preserve">, using slow, flowing, coordinated movements with deep breathing and focused attention. </w:t>
       </w:r>
       <w:r>
         <w:rPr>
@@ -12169,7 +12175,7 @@
         <w:t>reasonably good</w:t>
       </w:r>
       <w:r>
-        <w:t xml:space="preserve">, with meta-analyses reporting reduced stress, anxiety and depression, benefit as an adjunct in late-life depression and value for fall prevention, chronic pain and cardiac rehabilitation. </w:t>
+        <w:t xml:space="preserve">. Meta-analyses report less stress, anxiety and depression, benefit as an add-on in late-life depression, and value for fall prevention, chronic pain and cardiac rehabilitation. </w:t>
       </w:r>
       <w:r>
         <w:rPr>
@@ -12193,7 +12199,7 @@
         <w:t>Morita and Naikan therapy</w:t>
       </w:r>
       <w:r>
-        <w:t xml:space="preserve"> from Japan and qigong, where Morita teaches accepting one's feelings and doing what needs to be done and Naikan uses structured introspection to build gratitude. </w:t>
+        <w:t xml:space="preserve"> from Japan and qigong. Morita teaches accepting your feelings and doing what needs to be done; Naikan uses structured introspection to build gratitude. </w:t>
       </w:r>
       <w:r>
         <w:rPr>
@@ -12217,7 +12223,7 @@
         <w:t>basis and mechanism</w:t>
       </w:r>
       <w:r>
-        <w:t xml:space="preserve"> across these practices is improved </w:t>
+        <w:t xml:space="preserve"> across these practices is better </w:t>
       </w:r>
       <w:r>
         <w:rPr>
@@ -12226,7 +12232,7 @@
         <w:t>self-regulation</w:t>
       </w:r>
       <w:r>
-        <w:t xml:space="preserve">, raised parasympathetic and vagal tone, lowered cortisol and arousal and better attention and emotion regulation, which explains much of their benefit. </w:t>
+        <w:t xml:space="preserve">: raised parasympathetic and vagal tone, lowered cortisol and arousal, and better attention and emotion control. This explains much of their benefit. </w:t>
       </w:r>
       <w:r>
         <w:rPr>
@@ -12250,7 +12256,7 @@
         <w:t>outcome and indications</w:t>
       </w:r>
       <w:r>
-        <w:t xml:space="preserve"> are that mindfulness, yoga and tai chi have a </w:t>
+        <w:t xml:space="preserve"> are clear. Mindfulness, yoga and tai chi have a </w:t>
       </w:r>
       <w:r>
         <w:rPr>
@@ -12259,7 +12265,7 @@
         <w:t>real evidence base</w:t>
       </w:r>
       <w:r>
-        <w:t xml:space="preserve"> as adjuncts for stress, anxiety, depression and chronic pain, while reiki and pranic healing have </w:t>
+        <w:t xml:space="preserve"> as add-ons for stress, anxiety, depression and chronic pain. Reiki and pranic healing have </w:t>
       </w:r>
       <w:r>
         <w:rPr>
@@ -12292,7 +12298,7 @@
         <w:t>research and current status</w:t>
       </w:r>
       <w:r>
-        <w:t xml:space="preserve">, these approaches fit Indian and Asian clients' cultural beliefs and are low in cost and side effects, but their evidence is of </w:t>
+        <w:t xml:space="preserve">, these approaches fit Indian and Asian clients' cultural beliefs and are low in cost and side effects. But their evidence is of </w:t>
       </w:r>
       <w:r>
         <w:rPr>
@@ -12301,7 +12307,7 @@
         <w:t>variable quality</w:t>
       </w:r>
       <w:r>
-        <w:t xml:space="preserve">, strongest for mindfulness-based therapies and weakest for energy-healing claims that remain untestable. </w:t>
+        <w:t xml:space="preserve">: strongest for mindfulness-based therapies and weakest for energy-healing claims that remain untestable. </w:t>
       </w:r>
       <w:r>
         <w:rPr>
@@ -12416,7 +12422,7 @@
         <w:pStyle w:val="ListBullet"/>
       </w:pPr>
       <w:r>
-        <w:t>Professional-body characterisations of the therapies (for example the APA Dictionary of Psychology entries for psychotherapy, psychodynamic psychotherapy, person-centered therapy and gestalt therapy) are given as characterisations drawn from standard reference wording, not as verbatim quotations, and no page numbers are attached.</w:t>
+        <w:t>Professional-body characterisations of the therapies (for example the APA Dictionary of Psychology entries for psychotherapy, psychodynamic psychotherapy, person-centered therapy and gestalt therapy) are given as characterisations drawn from standard reference wording, not as word-for-word quotations, and no page numbers are attached.</w:t>
       </w:r>
     </w:p>
     <w:p>
@@ -12424,7 +12430,7 @@
         <w:pStyle w:val="ListBullet"/>
       </w:pPr>
       <w:r>
-        <w:t>Foundational claims are attributed to the author and classic work that introduced them (Freud, Rogers, Perls, May, Yalom, Frankl, Adler); where research is summarised, only well-known findings and named authors are given, and the strength of evidence is stated honestly rather than dressed up with invented numbers.</w:t>
+        <w:t>Foundational claims are attributed to the author and classic work that introduced them (Freud, Rogers, Perls, May, Yalom, Frankl, Adler). Where research is summarised, only well-known findings and named authors are given, and the strength of evidence is stated honestly rather than dressed up with invented numbers.</w:t>
       </w:r>
     </w:p>
     <w:p>

</xml_diff>

<commit_message>
Deepen Psychotherapy Unit IV notes: fuller techniques, main-focus and how-it-works per therapy, plus an affective-psychotherapy introduction
Expand all 14 topics with a clear main-focus statement, a plain how-it-works (mechanism of change) explanation and detailed, well-explained techniques (what/how/why + examples), in the simplest language with concepts unpacked. Add a new 'Introduction to Affective Psychotherapies' section (wired into the TOC and both deliverables). Keep structure, one flowchart + one mnemonic per topic, amber glosses, short key-word bolding, full book+author citations, exact cover title and credit. Rebuild HTML and DOCX.
</commit_message>
<xml_diff>
--- a/Psychotherapy_Unit_IV_Comprehensive_Notes.docx
+++ b/Psychotherapy_Unit_IV_Comprehensive_Notes.docx
@@ -456,6 +456,532 @@
         <w:pStyle w:val="Heading1"/>
       </w:pPr>
       <w:r>
+        <w:t>Introduction to Affective Psychotherapies</w:t>
+      </w:r>
+    </w:p>
+    <w:p>
+      <w:r>
+        <w:rPr>
+          <w:i/>
+        </w:rPr>
+      </w:r>
+      <w:r>
+        <w:rPr>
+          <w:i/>
+        </w:rPr>
+        <w:t>Before the fourteen therapies, here is a simple map of the whole area. Read this once and the rest of the unit will make much more sense, because you will see what all these therapies are trying to do and how they differ.</w:t>
+      </w:r>
+    </w:p>
+    <w:p>
+      <w:pPr>
+        <w:pStyle w:val="Heading2"/>
+      </w:pPr>
+      <w:r>
+        <w:t>What 'affective psychotherapies' means here</w:t>
+      </w:r>
+    </w:p>
+    <w:p>
+      <w:pPr>
+        <w:pStyle w:val="ListBullet"/>
+      </w:pPr>
+      <w:r>
+        <w:t xml:space="preserve">The word </w:t>
+      </w:r>
+      <w:r>
+        <w:t xml:space="preserve">affective </w:t>
+      </w:r>
+      <w:r>
+        <w:rPr>
+          <w:i/>
+        </w:rPr>
+        <w:t>(to do with feelings and emotions)</w:t>
+      </w:r>
+      <w:r>
+        <w:t xml:space="preserve"> simply points to the heart of these therapies. They work mainly through </w:t>
+      </w:r>
+      <w:r>
+        <w:rPr>
+          <w:b/>
+        </w:rPr>
+        <w:t>emotion, insight, the relationship and lived experience</w:t>
+      </w:r>
+      <w:r>
+        <w:t>, by talking and relating, not by giving medicines and not mainly by drilling new habits. In plain words, they help you by changing how you feel, how you understand yourself, and how you relate to others.</w:t>
+      </w:r>
+    </w:p>
+    <w:p>
+      <w:pPr>
+        <w:pStyle w:val="ListBullet"/>
+      </w:pPr>
+      <w:r>
+        <w:t xml:space="preserve">So an </w:t>
+      </w:r>
+      <w:r>
+        <w:rPr>
+          <w:b/>
+        </w:rPr>
+        <w:t>affective (talk-and-relationship) therapy</w:t>
+      </w:r>
+      <w:r>
+        <w:t xml:space="preserve"> is a planned, caring conversation. A trained therapist and a client meet regularly, and the healing comes from understanding feelings, from facing them, and from a trusting bond, rather than from a pill or a reward chart.</w:t>
+      </w:r>
+    </w:p>
+    <w:p>
+      <w:pPr>
+        <w:pStyle w:val="ListBullet"/>
+      </w:pPr>
+      <w:r>
+        <w:t xml:space="preserve">These therapies sit apart from two neighbours. They differ from the </w:t>
+      </w:r>
+      <w:r>
+        <w:rPr>
+          <w:b/>
+        </w:rPr>
+        <w:t>purely behavioural</w:t>
+      </w:r>
+      <w:r>
+        <w:t xml:space="preserve"> approach, which changes behaviour through conditioning and rewards, and from the </w:t>
+      </w:r>
+      <w:r>
+        <w:rPr>
+          <w:b/>
+        </w:rPr>
+        <w:t>medical</w:t>
+      </w:r>
+      <w:r>
+        <w:t xml:space="preserve"> approach, which treats the brain with drugs. In practice the lines blur, and many therapists mix ideas, but the affective group leads with feeling, meaning and relationship.</w:t>
+      </w:r>
+    </w:p>
+    <w:p>
+      <w:pPr>
+        <w:pStyle w:val="Heading2"/>
+      </w:pPr>
+      <w:r>
+        <w:t>What the fourteen therapies share</w:t>
+      </w:r>
+    </w:p>
+    <w:p>
+      <w:pPr>
+        <w:pStyle w:val="ListBullet"/>
+      </w:pPr>
+      <w:r>
+        <w:t xml:space="preserve">They all rely on the </w:t>
+      </w:r>
+      <w:r>
+        <w:t xml:space="preserve">therapeutic relationship </w:t>
+      </w:r>
+      <w:r>
+        <w:rPr>
+          <w:i/>
+        </w:rPr>
+        <w:t>(the trusting, caring bond between client and therapist, which is itself part of the cure)</w:t>
+      </w:r>
+      <w:r>
+        <w:t>. Decades of research show this bond, called the working alliance, is one of the strongest predictors of whether therapy helps, whatever the method. Think of it as the soil: the technique is the seed, but without good soil little grows.</w:t>
+      </w:r>
+    </w:p>
+    <w:p>
+      <w:pPr>
+        <w:pStyle w:val="ListBullet"/>
+      </w:pPr>
+      <w:r>
+        <w:t xml:space="preserve">They all treat </w:t>
+      </w:r>
+      <w:r>
+        <w:rPr>
+          <w:b/>
+        </w:rPr>
+        <w:t>emotion as information, not noise</w:t>
+      </w:r>
+      <w:r>
+        <w:t>. A feeling is read as a message about an unmet need, a hidden conflict or a blocked goal, so the work is to feel it, understand it and let it change, instead of just switching it off.</w:t>
+      </w:r>
+    </w:p>
+    <w:p>
+      <w:pPr>
+        <w:pStyle w:val="ListBullet"/>
+      </w:pPr>
+      <w:r>
+        <w:t xml:space="preserve">They all aim at </w:t>
+      </w:r>
+      <w:r>
+        <w:rPr>
+          <w:b/>
+        </w:rPr>
+        <w:t>lasting inner change</w:t>
+      </w:r>
+      <w:r>
+        <w:t>, not only quick symptom relief. The hope is more self-understanding, more freedom to choose, and healthier ways of relating, so the gains keep working after therapy ends.</w:t>
+      </w:r>
+    </w:p>
+    <w:p>
+      <w:pPr>
+        <w:pStyle w:val="ListBullet"/>
+      </w:pPr>
+      <w:r>
+        <w:t>They all give the client an active part. The client is a partner who explores, chooses and practises, not a passive patient who is simply 'treated'.</w:t>
+      </w:r>
+    </w:p>
+    <w:p>
+      <w:pPr>
+        <w:pStyle w:val="Heading2"/>
+      </w:pPr>
+      <w:r>
+        <w:t>How the fourteen broadly group</w:t>
+      </w:r>
+    </w:p>
+    <w:p>
+      <w:pPr>
+        <w:pStyle w:val="ListBullet"/>
+      </w:pPr>
+      <w:r>
+        <w:t>The fourteen fall into a few natural families. Knowing the family tells you, at a glance, what a therapy will emphasise:</w:t>
+      </w:r>
+    </w:p>
+    <w:p>
+      <w:pPr>
+        <w:pStyle w:val="ListBullet2"/>
+      </w:pPr>
+      <w:r>
+        <w:rPr>
+          <w:b/>
+        </w:rPr>
+        <w:t>Insight / depth</w:t>
+      </w:r>
+      <w:r>
+        <w:t xml:space="preserve"> therapies look inward and backward to uncover hidden conflict: </w:t>
+      </w:r>
+      <w:r>
+        <w:rPr>
+          <w:b/>
+        </w:rPr>
+        <w:t>psychodynamic</w:t>
+      </w:r>
+      <w:r>
+        <w:t xml:space="preserve"> therapy (and its briefer offshoots).</w:t>
+      </w:r>
+    </w:p>
+    <w:p>
+      <w:pPr>
+        <w:pStyle w:val="ListBullet2"/>
+      </w:pPr>
+      <w:r>
+        <w:rPr>
+          <w:b/>
+        </w:rPr>
+        <w:t>Humanistic-experiential</w:t>
+      </w:r>
+      <w:r>
+        <w:t xml:space="preserve"> therapies trust the person's drive to grow and work in the here-and-now: </w:t>
+      </w:r>
+      <w:r>
+        <w:rPr>
+          <w:b/>
+        </w:rPr>
+        <w:t>humanistic, person-centred, existential and gestalt</w:t>
+      </w:r>
+      <w:r>
+        <w:t xml:space="preserve"> therapy.</w:t>
+      </w:r>
+    </w:p>
+    <w:p>
+      <w:pPr>
+        <w:pStyle w:val="ListBullet2"/>
+      </w:pPr>
+      <w:r>
+        <w:t xml:space="preserve">The </w:t>
+      </w:r>
+      <w:r>
+        <w:rPr>
+          <w:b/>
+        </w:rPr>
+        <w:t>Adlerian</w:t>
+      </w:r>
+      <w:r>
+        <w:t xml:space="preserve"> approach stands a little apart, mixing early insight with practical encouragement and a strong social focus.</w:t>
+      </w:r>
+    </w:p>
+    <w:p>
+      <w:pPr>
+        <w:pStyle w:val="ListBullet2"/>
+      </w:pPr>
+      <w:r>
+        <w:rPr>
+          <w:b/>
+        </w:rPr>
+        <w:t>Brief and integrative</w:t>
+      </w:r>
+      <w:r>
+        <w:t xml:space="preserve"> therapies are short, focused and practical: </w:t>
+      </w:r>
+      <w:r>
+        <w:rPr>
+          <w:b/>
+        </w:rPr>
+        <w:t>brief psychotherapy</w:t>
+      </w:r>
+      <w:r>
+        <w:t>, which borrows from many schools around one agreed problem.</w:t>
+      </w:r>
+    </w:p>
+    <w:p>
+      <w:pPr>
+        <w:pStyle w:val="ListBullet2"/>
+      </w:pPr>
+      <w:r>
+        <w:rPr>
+          <w:b/>
+        </w:rPr>
+        <w:t>Supportive</w:t>
+      </w:r>
+      <w:r>
+        <w:t xml:space="preserve"> therapy strengthens coping and steadies the person, rather than digging deep: </w:t>
+      </w:r>
+      <w:r>
+        <w:rPr>
+          <w:b/>
+        </w:rPr>
+        <w:t>supportive psychotherapy</w:t>
+      </w:r>
+      <w:r>
+        <w:t>.</w:t>
+      </w:r>
+    </w:p>
+    <w:p>
+      <w:pPr>
+        <w:pStyle w:val="ListBullet2"/>
+      </w:pPr>
+      <w:r>
+        <w:rPr>
+          <w:b/>
+        </w:rPr>
+        <w:t>Action and expressive</w:t>
+      </w:r>
+      <w:r>
+        <w:t xml:space="preserve"> therapies heal through doing, playing and enacting: </w:t>
+      </w:r>
+      <w:r>
+        <w:rPr>
+          <w:b/>
+        </w:rPr>
+        <w:t>play therapy</w:t>
+      </w:r>
+      <w:r>
+        <w:t xml:space="preserve"> (for children) and </w:t>
+      </w:r>
+      <w:r>
+        <w:rPr>
+          <w:b/>
+        </w:rPr>
+        <w:t>psychodrama</w:t>
+      </w:r>
+      <w:r>
+        <w:t xml:space="preserve"> (acting out conflicts in a group).</w:t>
+      </w:r>
+    </w:p>
+    <w:p>
+      <w:pPr>
+        <w:pStyle w:val="ListBullet2"/>
+      </w:pPr>
+      <w:r>
+        <w:rPr>
+          <w:b/>
+        </w:rPr>
+        <w:t>Altered-state and mind-body</w:t>
+      </w:r>
+      <w:r>
+        <w:t xml:space="preserve"> approaches work through focused attention, relaxation and the body: </w:t>
+      </w:r>
+      <w:r>
+        <w:rPr>
+          <w:b/>
+        </w:rPr>
+        <w:t>clinical hypnotherapy</w:t>
+      </w:r>
+      <w:r>
+        <w:t xml:space="preserve"> and the </w:t>
+      </w:r>
+      <w:r>
+        <w:rPr>
+          <w:b/>
+        </w:rPr>
+        <w:t>oriental approaches</w:t>
+      </w:r>
+      <w:r>
+        <w:t xml:space="preserve"> such as yoga, meditation and tai chi.</w:t>
+      </w:r>
+    </w:p>
+    <w:tbl>
+      <w:tblPr>
+        <w:tblStyle w:val="TableGrid"/>
+        <w:tblW w:type="auto" w:w="0"/>
+        <w:tblLook w:firstColumn="1" w:firstRow="1" w:lastColumn="0" w:lastRow="0" w:noHBand="0" w:noVBand="1" w:val="04A0"/>
+      </w:tblPr>
+      <w:tblGrid>
+        <w:gridCol w:w="8640"/>
+      </w:tblGrid>
+      <w:tr>
+        <w:tc>
+          <w:tcPr>
+            <w:tcW w:type="dxa" w:w="8640"/>
+            <w:shd w:val="clear" w:color="auto" w:fill="F1F3F5"/>
+          </w:tcPr>
+          <w:p>
+            <w:r/>
+            <w:r>
+              <w:rPr>
+                <w:b/>
+              </w:rPr>
+              <w:t>The one idea to carry through the whole unit</w:t>
+            </w:r>
+          </w:p>
+          <w:p>
+            <w:r>
+              <w:t xml:space="preserve">• </w:t>
+            </w:r>
+            <w:r>
+              <w:t xml:space="preserve">Across all fourteen, two engines do the real work: a </w:t>
+            </w:r>
+            <w:r>
+              <w:rPr>
+                <w:b/>
+              </w:rPr>
+              <w:t>genuine, trusting relationship</w:t>
+            </w:r>
+            <w:r>
+              <w:t xml:space="preserve"> and some form of </w:t>
+            </w:r>
+            <w:r>
+              <w:rPr>
+                <w:b/>
+              </w:rPr>
+              <w:t>emotional change</w:t>
+            </w:r>
+            <w:r>
+              <w:t xml:space="preserve"> (feeling, understanding or re-living an emotion so it loosens its grip). Every technique in this unit is, in the end, a particular way of switching on one of these two engines.</w:t>
+            </w:r>
+          </w:p>
+          <w:p>
+            <w:r>
+              <w:t xml:space="preserve">• </w:t>
+            </w:r>
+            <w:r>
+              <w:t xml:space="preserve">So as you read each therapy, keep asking three questions: </w:t>
+            </w:r>
+            <w:r>
+              <w:rPr>
+                <w:b/>
+              </w:rPr>
+              <w:t>what is its main focus</w:t>
+            </w:r>
+            <w:r>
+              <w:t xml:space="preserve"> (its central idea), </w:t>
+            </w:r>
+            <w:r>
+              <w:rPr>
+                <w:b/>
+              </w:rPr>
+              <w:t>what are its techniques</w:t>
+            </w:r>
+            <w:r>
+              <w:t xml:space="preserve"> (what the therapist actually does in the room), and </w:t>
+            </w:r>
+            <w:r>
+              <w:rPr>
+                <w:b/>
+              </w:rPr>
+              <w:t>how does it work</w:t>
+            </w:r>
+            <w:r>
+              <w:t xml:space="preserve"> (why that changes the client). Those three threads run through every topic below.</w:t>
+            </w:r>
+          </w:p>
+        </w:tc>
+      </w:tr>
+    </w:tbl>
+    <w:p/>
+    <w:p>
+      <w:pPr>
+        <w:pStyle w:val="Heading2"/>
+      </w:pPr>
+      <w:r>
+        <w:t>How to use this unit</w:t>
+      </w:r>
+    </w:p>
+    <w:p>
+      <w:pPr>
+        <w:pStyle w:val="ListBullet"/>
+      </w:pPr>
+      <w:r>
+        <w:t>Each of the fourteen numbered topics is a self-contained study note on one therapy. You can revise any one on its own, because each gives the main focus, the basis, how a case is understood, the goals, the techniques in detail, the process or stages, the outcome, who it suits, and its research standing.</w:t>
+      </w:r>
+    </w:p>
+    <w:p>
+      <w:pPr>
+        <w:pStyle w:val="ListBullet"/>
+      </w:pPr>
+      <w:r>
+        <w:t xml:space="preserve">For every therapy, spend most of your effort on three things: its </w:t>
+      </w:r>
+      <w:r>
+        <w:rPr>
+          <w:b/>
+        </w:rPr>
+        <w:t>main focus</w:t>
+      </w:r>
+      <w:r>
+        <w:t xml:space="preserve">, its </w:t>
+      </w:r>
+      <w:r>
+        <w:rPr>
+          <w:b/>
+        </w:rPr>
+        <w:t>techniques</w:t>
+      </w:r>
+      <w:r>
+        <w:t xml:space="preserve"> (what is done and why), and </w:t>
+      </w:r>
+      <w:r>
+        <w:rPr>
+          <w:b/>
+        </w:rPr>
+        <w:t>how it works</w:t>
+      </w:r>
+      <w:r>
+        <w:t>. History is included but kept short, because it carries the fewest marks and matters least for understanding the therapy.</w:t>
+      </w:r>
+    </w:p>
+    <w:p>
+      <w:pPr>
+        <w:pStyle w:val="ListBullet"/>
+      </w:pPr>
+      <w:r>
+        <w:t xml:space="preserve">Use the </w:t>
+      </w:r>
+      <w:r>
+        <w:rPr>
+          <w:b/>
+        </w:rPr>
+        <w:t>flowchart</w:t>
+      </w:r>
+      <w:r>
+        <w:t xml:space="preserve"> to picture the core idea and the </w:t>
+      </w:r>
+      <w:r>
+        <w:rPr>
+          <w:b/>
+        </w:rPr>
+        <w:t>mnemonic</w:t>
+      </w:r>
+      <w:r>
+        <w:t xml:space="preserve"> to lock the key points into memory. Read the coloured brackets for the plain meaning of every hard term, so no piece of jargon ever leaves you stuck.</w:t>
+      </w:r>
+    </w:p>
+    <w:p>
+      <w:pPr>
+        <w:pStyle w:val="Heading1"/>
+      </w:pPr>
+      <w:r>
         <w:t>1. Psychodynamic psychotherapy</w:t>
       </w:r>
     </w:p>
@@ -659,6 +1185,113 @@
       </w:tr>
     </w:tbl>
     <w:p/>
+    <w:tbl>
+      <w:tblPr>
+        <w:tblStyle w:val="TableGrid"/>
+        <w:tblW w:type="auto" w:w="0"/>
+        <w:tblLook w:firstColumn="1" w:firstRow="1" w:lastColumn="0" w:lastRow="0" w:noHBand="0" w:noVBand="1" w:val="04A0"/>
+      </w:tblPr>
+      <w:tblGrid>
+        <w:gridCol w:w="8640"/>
+      </w:tblGrid>
+      <w:tr>
+        <w:tc>
+          <w:tcPr>
+            <w:tcW w:type="dxa" w:w="8640"/>
+            <w:shd w:val="clear" w:color="auto" w:fill="F1F3F5"/>
+          </w:tcPr>
+          <w:p>
+            <w:r/>
+            <w:r>
+              <w:rPr>
+                <w:b/>
+              </w:rPr>
+              <w:t>Main focus (the central idea)</w:t>
+            </w:r>
+          </w:p>
+          <w:p>
+            <w:r>
+              <w:t xml:space="preserve">• </w:t>
+            </w:r>
+            <w:r>
+              <w:t xml:space="preserve">The </w:t>
+            </w:r>
+            <w:r>
+              <w:rPr>
+                <w:b/>
+              </w:rPr>
+              <w:t>main focus</w:t>
+            </w:r>
+            <w:r>
+              <w:t xml:space="preserve"> is the hidden, unconscious part of the mind. Psychodynamic therapy holds that much of what drives us sits below awareness, like the bulk of an iceberg under the water. Old conflicts and feelings we pushed away still pull the strings today and show up as symptoms.</w:t>
+            </w:r>
+          </w:p>
+          <w:p>
+            <w:r>
+              <w:t xml:space="preserve">• </w:t>
+            </w:r>
+            <w:r>
+              <w:t xml:space="preserve">So the whole therapy aims at one thing: bring the hidden into the open. When a buried conflict is understood and felt in words, it loses its grip, and the person is freed to choose instead of being driven. Freud summed it up as </w:t>
+            </w:r>
+            <w:r>
+              <w:rPr>
+                <w:b/>
+              </w:rPr>
+              <w:t>'where id was, there ego shall be'</w:t>
+            </w:r>
+            <w:r>
+              <w:t xml:space="preserve"> — the sensible, choosing self takes charge of the blind, wanting part.</w:t>
+            </w:r>
+          </w:p>
+        </w:tc>
+      </w:tr>
+    </w:tbl>
+    <w:p/>
+    <w:p>
+      <w:pPr>
+        <w:pStyle w:val="Heading2"/>
+      </w:pPr>
+      <w:r>
+        <w:t>How it actually works (the mechanism of change)</w:t>
+      </w:r>
+    </w:p>
+    <w:p>
+      <w:pPr>
+        <w:pStyle w:val="ListBullet"/>
+      </w:pPr>
+      <w:r>
+        <w:t xml:space="preserve">The change engine is </w:t>
+      </w:r>
+      <w:r>
+        <w:t xml:space="preserve">insight </w:t>
+      </w:r>
+      <w:r>
+        <w:rPr>
+          <w:i/>
+        </w:rPr>
+        <w:t>(the 'aha' moment of seeing a hidden pattern or feeling in yourself clearly for the first time)</w:t>
+      </w:r>
+      <w:r>
+        <w:t xml:space="preserve"> plus a safe relationship. When a client finally sees and feels what was buried — say, that their constant people-pleasing hides a fear of being abandoned — the old pattern can relax.</w:t>
+      </w:r>
+    </w:p>
+    <w:p>
+      <w:pPr>
+        <w:pStyle w:val="ListBullet"/>
+      </w:pPr>
+      <w:r>
+        <w:t xml:space="preserve">Crucially, insight is not just understanding in the head. The client must </w:t>
+      </w:r>
+      <w:r>
+        <w:rPr>
+          <w:b/>
+        </w:rPr>
+        <w:t>re-live the old feeling in the room</w:t>
+      </w:r>
+      <w:r>
+        <w:t>, usually toward the therapist, and have it meet a new, accepting response. That gap between the dreaded reaction and the real, kind one is what loosens the knot.</w:t>
+      </w:r>
+    </w:p>
     <w:p>
       <w:pPr>
         <w:pStyle w:val="Heading2"/>
@@ -723,7 +1356,7 @@
         <w:t>Jung, Adler and Klein</w:t>
       </w:r>
       <w:r>
-        <w:t xml:space="preserve">, plus Anna Freud, Winnicott, Kohut and Bowlby. Object relations, self psychology and attachment all grew from this one root into today's briefer forms. </w:t>
+        <w:t xml:space="preserve">, plus Anna Freud, Winnicott, Kohut and Bowlby. Object relations, self psychology and attachment all grew from this one root into today's briefer, face-to-face forms. </w:t>
       </w:r>
       <w:r>
         <w:rPr>
@@ -792,7 +1425,7 @@
         <w:t>id, ego and superego</w:t>
       </w:r>
       <w:r>
-        <w:t xml:space="preserve"> that chase pleasure, reality and conscience. In short: the id wants, the superego judges, and the ego keeps the peace between them. </w:t>
+        <w:t xml:space="preserve">. The id is the blind 'I want it now' part; the superego is the strict inner parent that judges; the ego is the referee that keeps peace between the two and the real world. </w:t>
       </w:r>
       <w:r>
         <w:rPr>
@@ -852,16 +1485,43 @@
         <w:t>defence mechanisms</w:t>
       </w:r>
       <w:r>
-        <w:t xml:space="preserve"> are another basis. Tricks like </w:t>
-      </w:r>
-      <w:r>
-        <w:rPr>
-          <w:b/>
-        </w:rPr>
-        <w:t>repression, denial, projection</w:t>
-      </w:r>
-      <w:r>
-        <w:t xml:space="preserve"> and sublimation push unwanted wishes out of awareness while quietly steering how you act. For example, projection means seeing your own anger in someone else instead of in yourself. </w:t>
+        <w:t xml:space="preserve"> are another basis. A defence is an automatic mental trick that keeps a painful feeling out of awareness. </w:t>
+      </w:r>
+      <w:r>
+        <w:rPr>
+          <w:b/>
+        </w:rPr>
+        <w:t>Repression</w:t>
+      </w:r>
+      <w:r>
+        <w:t xml:space="preserve"> buries it, </w:t>
+      </w:r>
+      <w:r>
+        <w:rPr>
+          <w:b/>
+        </w:rPr>
+        <w:t>denial</w:t>
+      </w:r>
+      <w:r>
+        <w:t xml:space="preserve"> refuses it, </w:t>
+      </w:r>
+      <w:r>
+        <w:rPr>
+          <w:b/>
+        </w:rPr>
+        <w:t>projection</w:t>
+      </w:r>
+      <w:r>
+        <w:t xml:space="preserve"> sees your own anger in someone else, and </w:t>
+      </w:r>
+      <w:r>
+        <w:rPr>
+          <w:b/>
+        </w:rPr>
+        <w:t>sublimation</w:t>
+      </w:r>
+      <w:r>
+        <w:t xml:space="preserve"> channels it into something useful like sport. </w:t>
       </w:r>
       <w:r>
         <w:rPr>
@@ -897,7 +1557,7 @@
         <w:t>(a symptom that half-satisfies a hidden wish and half-hides it, like a nervous habit that both shows and masks a worry)</w:t>
       </w:r>
       <w:r>
-        <w:t xml:space="preserve">. It balances a buried wish, the demands of reality and the conscience, and so stands for an inner conflict. </w:t>
+        <w:t xml:space="preserve">. Picture a tug-of-war between a forbidden wish, the conscience that forbids it, and reality; the symptom is the knot where the rope stops moving. </w:t>
       </w:r>
       <w:r>
         <w:rPr>
@@ -930,7 +1590,7 @@
         <w:t>unconscious conscious</w:t>
       </w:r>
       <w:r>
-        <w:t xml:space="preserve">. The client gains insight into hidden conflicts and patterns, the ego grows stronger, and defences mature. This brings lasting change, not just the quick removal of a symptom. </w:t>
+        <w:t xml:space="preserve">. The client gains insight into hidden conflicts and patterns, the ego grows stronger, and rigid defences mature into flexible ones. This brings lasting change, not just the quick removal of one symptom. </w:t>
       </w:r>
       <w:r>
         <w:rPr>
@@ -966,7 +1626,7 @@
         <w:t>(not taking sides between the client's wishes, defences and conscience)</w:t>
       </w:r>
       <w:r>
-        <w:t xml:space="preserve">, restraint and staying fairly private. The therapist acts as a </w:t>
+        <w:t xml:space="preserve">, restraint and staying fairly private. The therapist acts partly as a </w:t>
       </w:r>
       <w:r>
         <w:rPr>
@@ -975,7 +1635,7 @@
         <w:t>blank screen</w:t>
       </w:r>
       <w:r>
-        <w:t xml:space="preserve"> onto which the client's patterns can be projected. </w:t>
+        <w:t xml:space="preserve">, so the client's old relationship patterns show up clearly in the room. </w:t>
       </w:r>
       <w:r>
         <w:rPr>
@@ -990,7 +1650,7 @@
         <w:pStyle w:val="ListBullet"/>
       </w:pPr>
       <w:r>
-        <w:t xml:space="preserve">The basic </w:t>
+        <w:t xml:space="preserve">The foundational </w:t>
       </w:r>
       <w:r>
         <w:rPr>
@@ -1008,10 +1668,10 @@
         <w:rPr>
           <w:i/>
         </w:rPr>
-        <w:t>(saying whatever comes to mind without filtering it, even if it feels silly or rude)</w:t>
-      </w:r>
-      <w:r>
-        <w:t xml:space="preserve">. The client voices every passing thought, because the pauses and detours show where the real conflict hides. </w:t>
+        <w:t>(saying whatever comes to mind without filtering it, even if it feels silly, rude or random)</w:t>
+      </w:r>
+      <w:r>
+        <w:t xml:space="preserve">. How it is done: the client lies back or sits and simply reports each passing thought. Why it helps: the mind cannot wander freely for long before it bumps into the very conflict it is avoiding, and the pauses, jokes and sudden topic-changes mark exactly where it hides. </w:t>
       </w:r>
       <w:r>
         <w:rPr>
@@ -1032,7 +1692,7 @@
         <w:t>Dream analysis</w:t>
       </w:r>
       <w:r>
-        <w:t xml:space="preserve"> is a classic technique. Dreams are treated as the royal road to the unconscious. The therapist separates the remembered </w:t>
+        <w:t xml:space="preserve"> is a classic technique, called the royal road to the unconscious. How it is done: the client tells the dream, then free-associates to each part of it. The therapist separates the remembered </w:t>
       </w:r>
       <w:r>
         <w:rPr>
@@ -1050,7 +1710,7 @@
         <w:t>latent content</w:t>
       </w:r>
       <w:r>
-        <w:t xml:space="preserve"> (the real meaning behind it). </w:t>
+        <w:t xml:space="preserve"> (the real wish behind it). Example: a dream of missing a train may, on association, lead to a fear of missing out on life. </w:t>
       </w:r>
       <w:r>
         <w:rPr>
@@ -1071,7 +1731,7 @@
         <w:t>Interpretation</w:t>
       </w:r>
       <w:r>
-        <w:t xml:space="preserve"> is the therapist's main tool. At the right moment, the therapist gently explains the hidden meaning of a client's words, dreams or symptoms. What was pushed away is put into words and understood. </w:t>
+        <w:t xml:space="preserve"> is the therapist's main tool. How it is done: at the right moment, gently and tentatively, the therapist puts into words a hidden meaning the client is near to seeing — never a clever lecture, always a well-timed nudge. Why it helps: naming the buried feeling lets the thinking ego take hold of it instead of being secretly ruled by it. </w:t>
       </w:r>
       <w:r>
         <w:rPr>
@@ -1086,28 +1746,25 @@
         <w:pStyle w:val="ListBullet"/>
       </w:pPr>
       <w:r>
-        <w:t xml:space="preserve">Two more techniques are the </w:t>
-      </w:r>
-      <w:r>
-        <w:rPr>
-          <w:b/>
-        </w:rPr>
-        <w:t>analysis of resistance</w:t>
-      </w:r>
-      <w:r>
-        <w:t xml:space="preserve"> (noticing lateness, silence or over-thinking that block the work) and the </w:t>
-      </w:r>
-      <w:r>
-        <w:t xml:space="preserve">analysis of transference </w:t>
+        <w:rPr>
+          <w:b/>
+        </w:rPr>
+        <w:t>Analysis of resistance</w:t>
+      </w:r>
+      <w:r>
+        <w:t xml:space="preserve"> is a technique in its own right. </w:t>
+      </w:r>
+      <w:r>
+        <w:t xml:space="preserve">Resistance </w:t>
       </w:r>
       <w:r>
         <w:rPr>
           <w:i/>
         </w:rPr>
-        <w:t>(studying how the client treats the therapist like an important person from their past)</w:t>
-      </w:r>
-      <w:r>
-        <w:t xml:space="preserve">. Old patterns are relived in the room, so they can be understood. </w:t>
+        <w:t>(anything the client does, often without meaning to, that blocks the therapy — arriving late, going blank, changing the subject)</w:t>
+      </w:r>
+      <w:r>
+        <w:t xml:space="preserve"> is not a nuisance but a signpost. How it is done: the therapist points out the block gently and wonders aloud what feeling it is guarding, because the strongest resistance usually sits right on top of the most important material. </w:t>
       </w:r>
       <w:r>
         <w:rPr>
@@ -1122,43 +1779,25 @@
         <w:pStyle w:val="ListBullet"/>
       </w:pPr>
       <w:r>
-        <w:t xml:space="preserve">In </w:t>
-      </w:r>
-      <w:r>
-        <w:rPr>
-          <w:b/>
-        </w:rPr>
-        <w:t>stages and process</w:t>
-      </w:r>
-      <w:r>
-        <w:t xml:space="preserve"> the work moves through three phases. It starts with an </w:t>
-      </w:r>
-      <w:r>
-        <w:rPr>
-          <w:b/>
-        </w:rPr>
-        <w:t>opening phase</w:t>
-      </w:r>
-      <w:r>
-        <w:t xml:space="preserve"> of assessment, contract and building trust. Then transference and resistance appear and are </w:t>
-      </w:r>
-      <w:r>
-        <w:rPr>
-          <w:b/>
-        </w:rPr>
-        <w:t>worked through</w:t>
-      </w:r>
-      <w:r>
-        <w:t xml:space="preserve">. Finally a planned </w:t>
-      </w:r>
-      <w:r>
-        <w:rPr>
-          <w:b/>
-        </w:rPr>
-        <w:t>termination</w:t>
-      </w:r>
-      <w:r>
-        <w:t xml:space="preserve"> reviews and locks in the gains. </w:t>
+        <w:rPr>
+          <w:b/>
+        </w:rPr>
+        <w:t>Working with transference</w:t>
+      </w:r>
+      <w:r>
+        <w:t xml:space="preserve"> is the deepest technique. </w:t>
+      </w:r>
+      <w:r>
+        <w:t xml:space="preserve">Transference </w:t>
+      </w:r>
+      <w:r>
+        <w:rPr>
+          <w:i/>
+        </w:rPr>
+        <w:t>(reacting to the therapist as if they were an important figure from your past, such as a parent)</w:t>
+      </w:r>
+      <w:r>
+        <w:t xml:space="preserve"> turns the session into a live replay of the client's old relationships. How it is done: the therapist notices the client treating them as, say, a critical father, names it kindly, and links it to the past; the client then gets a different, accepting response in place of the dreaded one. Why it helps: the old pattern is corrected in real feeling, not just in talk. </w:t>
       </w:r>
       <w:r>
         <w:rPr>
@@ -1173,19 +1812,13 @@
         <w:pStyle w:val="ListBullet"/>
       </w:pPr>
       <w:r>
-        <w:t xml:space="preserve">A key process idea is </w:t>
-      </w:r>
-      <w:r>
-        <w:t xml:space="preserve">working through </w:t>
-      </w:r>
-      <w:r>
-        <w:rPr>
-          <w:i/>
-        </w:rPr>
-        <w:t>(going over the same insight again and again until it really changes how you live)</w:t>
-      </w:r>
-      <w:r>
-        <w:t xml:space="preserve">. One clever interpretation rarely shifts a deep pattern, so the work is slow and repeated across many sessions. </w:t>
+        <w:rPr>
+          <w:b/>
+        </w:rPr>
+        <w:t>Working-through</w:t>
+      </w:r>
+      <w:r>
+        <w:t xml:space="preserve"> is the technique that makes change stick. How it is done: the same insight is returned to again and again, in many situations, over many sessions. Why it is needed: a single 'aha' rarely shifts a lifelong habit, just as understanding why you bite your nails does not stop you the first time — only patient repetition rewrites the pattern. </w:t>
       </w:r>
       <w:r>
         <w:rPr>
@@ -1200,32 +1833,50 @@
         <w:pStyle w:val="ListBullet"/>
       </w:pPr>
       <w:r>
-        <w:t xml:space="preserve">The </w:t>
-      </w:r>
-      <w:r>
-        <w:rPr>
-          <w:b/>
-        </w:rPr>
-        <w:t>outcome</w:t>
-      </w:r>
-      <w:r>
-        <w:t xml:space="preserve"> sought is fewer symptoms, more insight, more flexible defences and healthier relationships. Gains often keep growing even after therapy ends, which is called a </w:t>
-      </w:r>
-      <w:r>
-        <w:rPr>
-          <w:b/>
-        </w:rPr>
-        <w:t>sleeper effect</w:t>
-      </w:r>
-      <w:r>
-        <w:t xml:space="preserve">. </w:t>
+        <w:t xml:space="preserve">In </w:t>
+      </w:r>
+      <w:r>
+        <w:rPr>
+          <w:b/>
+        </w:rPr>
+        <w:t>stages and process</w:t>
+      </w:r>
+      <w:r>
+        <w:t xml:space="preserve"> the work moves through three phases. It starts with an </w:t>
+      </w:r>
+      <w:r>
+        <w:rPr>
+          <w:b/>
+        </w:rPr>
+        <w:t>opening phase</w:t>
+      </w:r>
+      <w:r>
+        <w:t xml:space="preserve"> of assessment, agreeing the frame (times, fee, rules) and building trust. Then transference and resistance appear and are </w:t>
+      </w:r>
+      <w:r>
+        <w:rPr>
+          <w:b/>
+        </w:rPr>
+        <w:t>worked through</w:t>
+      </w:r>
+      <w:r>
+        <w:t xml:space="preserve"> in a long middle phase. Finally a planned </w:t>
+      </w:r>
+      <w:r>
+        <w:rPr>
+          <w:b/>
+        </w:rPr>
+        <w:t>termination</w:t>
+      </w:r>
+      <w:r>
+        <w:t xml:space="preserve"> reviews and locks in the gains and handles the feelings about ending. </w:t>
       </w:r>
       <w:r>
         <w:rPr>
           <w:i/>
           <w:color w:val="555555"/>
         </w:rPr>
-        <w:t>[Gerald Corey, Theory and Practice of Counseling and Psychotherapy]</w:t>
+        <w:t>[Glen O. Gabbard, Long-Term Psychodynamic Psychotherapy: A Basic Text]</w:t>
       </w:r>
     </w:p>
     <w:p>
@@ -1233,28 +1884,61 @@
         <w:pStyle w:val="ListBullet"/>
       </w:pPr>
       <w:r>
-        <w:rPr>
-          <w:b/>
-        </w:rPr>
-        <w:t>Indications</w:t>
-      </w:r>
-      <w:r>
-        <w:t xml:space="preserve"> favour clients with good ego strength, curiosity about their own mind and motivation, facing neurotic, personality or relationship problems. Acute psychosis, high suicide risk and crisis states are </w:t>
-      </w:r>
-      <w:r>
-        <w:rPr>
-          <w:b/>
-        </w:rPr>
-        <w:t>contraindications</w:t>
-      </w:r>
-      <w:r>
-        <w:t xml:space="preserve"> better met by supportive work. </w:t>
+        <w:t xml:space="preserve">The </w:t>
+      </w:r>
+      <w:r>
+        <w:rPr>
+          <w:b/>
+        </w:rPr>
+        <w:t>outcome</w:t>
+      </w:r>
+      <w:r>
+        <w:t xml:space="preserve"> sought is fewer symptoms, more insight, more flexible defences and healthier relationships. A striking finding is the </w:t>
+      </w:r>
+      <w:r>
+        <w:rPr>
+          <w:b/>
+        </w:rPr>
+        <w:t>sleeper effect</w:t>
+      </w:r>
+      <w:r>
+        <w:t xml:space="preserve">: gains often keep growing even after therapy ends, because the client carries on self-analysing. </w:t>
       </w:r>
       <w:r>
         <w:rPr>
           <w:i/>
           <w:color w:val="555555"/>
         </w:rPr>
+        <w:t>[Gerald Corey, Theory and Practice of Counseling and Psychotherapy]</w:t>
+      </w:r>
+    </w:p>
+    <w:p>
+      <w:pPr>
+        <w:pStyle w:val="ListBullet"/>
+      </w:pPr>
+      <w:r>
+        <w:rPr>
+          <w:b/>
+        </w:rPr>
+        <w:t>Indications</w:t>
+      </w:r>
+      <w:r>
+        <w:t xml:space="preserve"> favour clients with good ego strength, curiosity about their own mind and real motivation, facing neurotic, personality or relationship problems. Acute psychosis, high suicide risk and raw crisis states are </w:t>
+      </w:r>
+      <w:r>
+        <w:rPr>
+          <w:b/>
+        </w:rPr>
+        <w:t>contraindications</w:t>
+      </w:r>
+      <w:r>
+        <w:t xml:space="preserve"> better met first by supportive work. </w:t>
+      </w:r>
+      <w:r>
+        <w:rPr>
+          <w:i/>
+          <w:color w:val="555555"/>
+        </w:rPr>
         <w:t>[Glen O. Gabbard, Long-Term Psychodynamic Psychotherapy: A Basic Text]</w:t>
       </w:r>
     </w:p>
@@ -1272,7 +1956,7 @@
         <w:t>research and current status</w:t>
       </w:r>
       <w:r>
-        <w:t xml:space="preserve">, well-known reviews find psychodynamic therapy gives </w:t>
+        <w:t xml:space="preserve">, well-known reviews (for example Shedler's) find psychodynamic therapy gives </w:t>
       </w:r>
       <w:r>
         <w:rPr>
@@ -1281,7 +1965,7 @@
         <w:t>substantial, lasting benefit</w:t>
       </w:r>
       <w:r>
-        <w:t xml:space="preserve">. Short-term forms help depression and anxiety, and specialised forms help borderline personality disorder, while classical long analysis stays hard to study. </w:t>
+        <w:t xml:space="preserve">. Short-term forms help depression and anxiety, and specialised forms such as transference-focused and mentalisation-based therapy help borderline personality disorder, while classical long analysis stays hard to study with trials. </w:t>
       </w:r>
       <w:r>
         <w:rPr>
@@ -1533,6 +2217,119 @@
       </w:tr>
     </w:tbl>
     <w:p/>
+    <w:tbl>
+      <w:tblPr>
+        <w:tblStyle w:val="TableGrid"/>
+        <w:tblW w:type="auto" w:w="0"/>
+        <w:tblLook w:firstColumn="1" w:firstRow="1" w:lastColumn="0" w:lastRow="0" w:noHBand="0" w:noVBand="1" w:val="04A0"/>
+      </w:tblPr>
+      <w:tblGrid>
+        <w:gridCol w:w="8640"/>
+      </w:tblGrid>
+      <w:tr>
+        <w:tc>
+          <w:tcPr>
+            <w:tcW w:type="dxa" w:w="8640"/>
+            <w:shd w:val="clear" w:color="auto" w:fill="F1F3F5"/>
+          </w:tcPr>
+          <w:p>
+            <w:r/>
+            <w:r>
+              <w:rPr>
+                <w:b/>
+              </w:rPr>
+              <w:t>Main focus (the central idea)</w:t>
+            </w:r>
+          </w:p>
+          <w:p>
+            <w:r>
+              <w:t xml:space="preserve">• </w:t>
+            </w:r>
+            <w:r>
+              <w:t xml:space="preserve">The </w:t>
+            </w:r>
+            <w:r>
+              <w:rPr>
+                <w:b/>
+              </w:rPr>
+              <w:t>main focus</w:t>
+            </w:r>
+            <w:r>
+              <w:t xml:space="preserve"> is one problem, worked on fast, against a clock. Brief therapy does not try to remake the whole personality. It picks a single agreed theme — a loss, a stuck role, a current conflict — and keeps every session pointed at it.</w:t>
+            </w:r>
+          </w:p>
+          <w:p>
+            <w:r>
+              <w:t xml:space="preserve">• </w:t>
+            </w:r>
+            <w:r>
+              <w:t xml:space="preserve">Its boldest idea is that the </w:t>
+            </w:r>
+            <w:r>
+              <w:rPr>
+                <w:b/>
+              </w:rPr>
+              <w:t>deadline itself heals</w:t>
+            </w:r>
+            <w:r>
+              <w:t>. A fixed end date is not a limitation forced by money or waiting lists; it is used on purpose, like a deadline that makes you finally finish an essay. It concentrates the mind, raises motivation and stops therapy drifting.</w:t>
+            </w:r>
+          </w:p>
+        </w:tc>
+      </w:tr>
+    </w:tbl>
+    <w:p/>
+    <w:p>
+      <w:pPr>
+        <w:pStyle w:val="Heading2"/>
+      </w:pPr>
+      <w:r>
+        <w:t>How it actually works (the mechanism of change)</w:t>
+      </w:r>
+    </w:p>
+    <w:p>
+      <w:pPr>
+        <w:pStyle w:val="ListBullet"/>
+      </w:pPr>
+      <w:r>
+        <w:t xml:space="preserve">The engine is </w:t>
+      </w:r>
+      <w:r>
+        <w:rPr>
+          <w:b/>
+        </w:rPr>
+        <w:t>focus plus pressure plus hope</w:t>
+      </w:r>
+      <w:r>
+        <w:t xml:space="preserve">. By refusing to wander, the therapist lets the client make real progress on one thing; the looming end date keeps urgency high; and in the solution-focused versions, the belief that </w:t>
+      </w:r>
+      <w:r>
+        <w:rPr>
+          <w:b/>
+        </w:rPr>
+        <w:t>small changes snowball</w:t>
+      </w:r>
+      <w:r>
+        <w:t xml:space="preserve"> gives the client confidence to start.</w:t>
+      </w:r>
+    </w:p>
+    <w:p>
+      <w:pPr>
+        <w:pStyle w:val="ListBullet"/>
+      </w:pPr>
+      <w:r>
+        <w:t xml:space="preserve">There is also a practical truth behind it, called the </w:t>
+      </w:r>
+      <w:r>
+        <w:rPr>
+          <w:b/>
+        </w:rPr>
+        <w:t>dose-response curve</w:t>
+      </w:r>
+      <w:r>
+        <w:t>: most of the improvement people ever get from therapy happens in the first handful of sessions. Brief therapy simply builds its whole design around that fact instead of fighting it.</w:t>
+      </w:r>
+    </w:p>
     <w:p>
       <w:pPr>
         <w:pStyle w:val="Heading2"/>
@@ -1708,7 +2505,7 @@
         <w:t>active and directive</w:t>
       </w:r>
       <w:r>
-        <w:t xml:space="preserve">, steering sessions back to the one theme instead of chasing every new worry. </w:t>
+        <w:t xml:space="preserve">, steering sessions back to the one theme instead of chasing every new worry the client raises. </w:t>
       </w:r>
       <w:r>
         <w:rPr>
@@ -1732,7 +2529,7 @@
         <w:t>here-and-now and the client's strengths</w:t>
       </w:r>
       <w:r>
-        <w:t xml:space="preserve">. It assumes a small change can set off bigger ones, especially in the solution-focused models. </w:t>
+        <w:t xml:space="preserve">. It assumes a small change can set off bigger ones — like one tidy shelf prompting you to tidy a whole room — especially in the solution-focused models. </w:t>
       </w:r>
       <w:r>
         <w:rPr>
@@ -1789,7 +2586,7 @@
         <w:t>interpersonal therapy's four problem areas</w:t>
       </w:r>
       <w:r>
-        <w:t xml:space="preserve">: grief, role disputes, role transitions and interpersonal deficits. One of these is picked as the focus. </w:t>
+        <w:t xml:space="preserve">: grief, role disputes (an ongoing clash in a key relationship), role transitions (a hard life change) and interpersonal deficits (few or poor relationships). One of these is picked as the single focus. </w:t>
       </w:r>
       <w:r>
         <w:rPr>
@@ -1855,7 +2652,7 @@
         <w:t>patient selection</w:t>
       </w:r>
       <w:r>
-        <w:t xml:space="preserve">. Sifneos' criteria look for one clear complaint, at least one meaningful past relationship, curiosity about the mind, motivation and the ability to bear some anxiety. </w:t>
+        <w:t xml:space="preserve">, because brief work does not suit everyone. Sifneos' criteria look for one clear complaint, at least one meaningful past relationship, curiosity about the mind, motivation and the ability to bear some anxiety. </w:t>
       </w:r>
       <w:r>
         <w:rPr>
@@ -1879,16 +2676,16 @@
         <w:t>contract</w:t>
       </w:r>
       <w:r>
-        <w:t xml:space="preserve"> is itself a technique. It is usually </w:t>
-      </w:r>
-      <w:r>
-        <w:rPr>
-          <w:b/>
-        </w:rPr>
-        <w:t>6 to 20 sessions</w:t>
-      </w:r>
-      <w:r>
-        <w:t xml:space="preserve">, often around twelve to sixteen, with a fixed end date set at the start, so both people work against the clock. </w:t>
+        <w:t xml:space="preserve"> is itself a technique. How it is done: at the very first meeting, therapist and client fix the number of sessions (usually </w:t>
+      </w:r>
+      <w:r>
+        <w:rPr>
+          <w:b/>
+        </w:rPr>
+        <w:t>6 to 20</w:t>
+      </w:r>
+      <w:r>
+        <w:t xml:space="preserve">, often twelve to sixteen) and the exact end date. Why it helps: naming the finish line turns time into a shared tool both people work against. </w:t>
       </w:r>
       <w:r>
         <w:rPr>
@@ -1903,16 +2700,13 @@
         <w:pStyle w:val="ListBullet"/>
       </w:pPr>
       <w:r>
-        <w:t xml:space="preserve">Dynamic </w:t>
-      </w:r>
-      <w:r>
-        <w:rPr>
-          <w:b/>
-        </w:rPr>
-        <w:t>techniques</w:t>
-      </w:r>
-      <w:r>
-        <w:t xml:space="preserve"> include focused interpretation and choosing what to notice and what to let pass. The therapist gently challenges defences and uses the client's warm feelings toward the therapist to keep them engaged with the focus. </w:t>
+        <w:rPr>
+          <w:b/>
+        </w:rPr>
+        <w:t>Maintaining the focus</w:t>
+      </w:r>
+      <w:r>
+        <w:t xml:space="preserve"> is a constant technique. How it is done: whenever the client drifts to a new worry, the therapist gently and repeatedly brings the talk back to the agreed theme. Why it helps: depth on one problem in a short time beats shallow coverage of many. </w:t>
       </w:r>
       <w:r>
         <w:rPr>
@@ -1927,16 +2721,37 @@
         <w:pStyle w:val="ListBullet"/>
       </w:pPr>
       <w:r>
-        <w:t xml:space="preserve">Solution-focused </w:t>
-      </w:r>
-      <w:r>
-        <w:rPr>
-          <w:b/>
-        </w:rPr>
-        <w:t>techniques</w:t>
-      </w:r>
-      <w:r>
-        <w:t xml:space="preserve"> are distinctive. They include the </w:t>
+        <w:rPr>
+          <w:b/>
+        </w:rPr>
+        <w:t>Focused interpretation and selective attention</w:t>
+      </w:r>
+      <w:r>
+        <w:t xml:space="preserve"> are the dynamic techniques. How it is done: the therapist comments only on material that touches the focus, lets the rest pass, and gently challenges the client's defences around that one theme while using their warm feelings toward the therapist to keep them engaged. </w:t>
+      </w:r>
+      <w:r>
+        <w:rPr>
+          <w:i/>
+          <w:color w:val="555555"/>
+        </w:rPr>
+        <w:t>[Richard S. Sharf, Theories of Psychotherapy and Counseling]</w:t>
+      </w:r>
+    </w:p>
+    <w:p>
+      <w:pPr>
+        <w:pStyle w:val="ListBullet"/>
+      </w:pPr>
+      <w:r>
+        <w:t xml:space="preserve">The </w:t>
+      </w:r>
+      <w:r>
+        <w:rPr>
+          <w:b/>
+        </w:rPr>
+        <w:t>miracle question</w:t>
+      </w:r>
+      <w:r>
+        <w:t xml:space="preserve"> is the signature solution-focused technique. How it is done: the therapist asks, </w:t>
       </w:r>
       <w:r>
         <w:t xml:space="preserve">miracle question </w:t>
@@ -1945,10 +2760,31 @@
         <w:rPr>
           <w:i/>
         </w:rPr>
-        <w:t>(asking: if you woke up and the problem had vanished overnight, what would be different?)</w:t>
-      </w:r>
-      <w:r>
-        <w:t xml:space="preserve">, scaling questions, hunting for times the problem was absent, and praising the client's existing strengths. </w:t>
+        <w:t>('Suppose you woke tomorrow and the problem had vanished overnight — what would be the first small sign that told you?')</w:t>
+      </w:r>
+      <w:r>
+        <w:t xml:space="preserve">. Why it helps: it quietly moves the client from staring at the problem to picturing the solution in concrete, doable steps. </w:t>
+      </w:r>
+      <w:r>
+        <w:rPr>
+          <w:i/>
+          <w:color w:val="555555"/>
+        </w:rPr>
+        <w:t>[Richard S. Sharf, Theories of Psychotherapy and Counseling]</w:t>
+      </w:r>
+    </w:p>
+    <w:p>
+      <w:pPr>
+        <w:pStyle w:val="ListBullet"/>
+      </w:pPr>
+      <w:r>
+        <w:rPr>
+          <w:b/>
+        </w:rPr>
+        <w:t>Scaling and exception questions</w:t>
+      </w:r>
+      <w:r>
+        <w:t xml:space="preserve"> complete the solution-focused kit. Scaling asks 'on a scale of 0 to 10, where are you today, and what would 1 point up look like?', making progress measurable. Exception-hunting asks 'when was the problem a little less — what was different then?', so the client's own past successes become the blueprint. </w:t>
       </w:r>
       <w:r>
         <w:rPr>
@@ -2404,6 +3240,110 @@
       </w:tr>
     </w:tbl>
     <w:p/>
+    <w:tbl>
+      <w:tblPr>
+        <w:tblStyle w:val="TableGrid"/>
+        <w:tblW w:type="auto" w:w="0"/>
+        <w:tblLook w:firstColumn="1" w:firstRow="1" w:lastColumn="0" w:lastRow="0" w:noHBand="0" w:noVBand="1" w:val="04A0"/>
+      </w:tblPr>
+      <w:tblGrid>
+        <w:gridCol w:w="8640"/>
+      </w:tblGrid>
+      <w:tr>
+        <w:tc>
+          <w:tcPr>
+            <w:tcW w:type="dxa" w:w="8640"/>
+            <w:shd w:val="clear" w:color="auto" w:fill="F1F3F5"/>
+          </w:tcPr>
+          <w:p>
+            <w:r/>
+            <w:r>
+              <w:rPr>
+                <w:b/>
+              </w:rPr>
+              <w:t>Main focus (the central idea)</w:t>
+            </w:r>
+          </w:p>
+          <w:p>
+            <w:r>
+              <w:t xml:space="preserve">• </w:t>
+            </w:r>
+            <w:r>
+              <w:t xml:space="preserve">The </w:t>
+            </w:r>
+            <w:r>
+              <w:rPr>
+                <w:b/>
+              </w:rPr>
+              <w:t>main focus</w:t>
+            </w:r>
+            <w:r>
+              <w:t xml:space="preserve"> is the person's own drive to grow. Humanistic therapy trusts that, given the right conditions, every person naturally moves toward becoming their fullest, healthiest self — much as a plant grows toward the light when it has soil, water and sun.</w:t>
+            </w:r>
+          </w:p>
+          <w:p>
+            <w:r>
+              <w:t xml:space="preserve">• </w:t>
+            </w:r>
+            <w:r>
+              <w:t xml:space="preserve">So the therapist does not diagnose and fix a broken machine. The focus is on the </w:t>
+            </w:r>
+            <w:r>
+              <w:rPr>
+                <w:b/>
+              </w:rPr>
+              <w:t>whole person</w:t>
+            </w:r>
+            <w:r>
+              <w:t xml:space="preserve"> — their inner point of view, their freedom and the here-and-now — and on providing a warm, honest relationship in which the stalled growth can start up again.</w:t>
+            </w:r>
+          </w:p>
+        </w:tc>
+      </w:tr>
+    </w:tbl>
+    <w:p/>
+    <w:p>
+      <w:pPr>
+        <w:pStyle w:val="Heading2"/>
+      </w:pPr>
+      <w:r>
+        <w:t>How it actually works (the mechanism of change)</w:t>
+      </w:r>
+    </w:p>
+    <w:p>
+      <w:pPr>
+        <w:pStyle w:val="ListBullet"/>
+      </w:pPr>
+      <w:r>
+        <w:t xml:space="preserve">Change works through a </w:t>
+      </w:r>
+      <w:r>
+        <w:rPr>
+          <w:b/>
+        </w:rPr>
+        <w:t>safe, genuine relationship</w:t>
+      </w:r>
+      <w:r>
+        <w:t xml:space="preserve"> that releases the blocked growth drive. When a person feels truly accepted and understood, their defences drop, they dare to look at feelings they had hidden, and the natural push toward growth resumes on its own.</w:t>
+      </w:r>
+    </w:p>
+    <w:p>
+      <w:pPr>
+        <w:pStyle w:val="ListBullet"/>
+      </w:pPr>
+      <w:r>
+        <w:t xml:space="preserve">There is no clever technique doing the work; the relationship </w:t>
+      </w:r>
+      <w:r>
+        <w:rPr>
+          <w:b/>
+        </w:rPr>
+        <w:t>is</w:t>
+      </w:r>
+      <w:r>
+        <w:t xml:space="preserve"> the technique. It is like thawing — warmth does not force the ice to melt, it simply removes what was keeping it frozen, and the natural process takes over.</w:t>
+      </w:r>
+    </w:p>
     <w:p>
       <w:pPr>
         <w:pStyle w:val="Heading2"/>
@@ -2528,7 +3468,7 @@
         <w:t>subjective experience, free will and responsibility</w:t>
       </w:r>
       <w:r>
-        <w:t xml:space="preserve">. The person's own point of view and the here-and-now are the proper focus, rather than drives or conditioning. </w:t>
+        <w:t xml:space="preserve">. The person's own point of view and the here-and-now are the proper focus, rather than drives or conditioning. Put simply, it matters more how life feels from the inside to this person than how it looks on a test sheet. </w:t>
       </w:r>
       <w:r>
         <w:rPr>
@@ -2576,7 +3516,7 @@
         <w:t>Maslow</w:t>
       </w:r>
       <w:r>
-        <w:t xml:space="preserve">, is the hierarchy of needs. Physiological, safety, belonging and esteem needs build up toward self-actualisation, and blocked growth needs produce distress. </w:t>
+        <w:t xml:space="preserve">, is the hierarchy of needs. Physiological, safety, belonging and esteem needs build up toward self-actualisation. A blocked lower need stalls the climb — it is hard to chase your dreams when you feel unsafe or unloved — and that stalling is what shows up as distress. </w:t>
       </w:r>
       <w:r>
         <w:rPr>
@@ -2645,7 +3585,7 @@
         <w:t>disconnection from experience</w:t>
       </w:r>
       <w:r>
-        <w:t xml:space="preserve">, not disease. So the aim is to restore awareness and self-direction, not to fix a defect. In plain terms, the person has drifted away from what they truly feel. </w:t>
+        <w:t xml:space="preserve">, not disease. So the aim is to restore awareness and self-direction, not to fix a defect. In plain terms, the person has drifted away from what they truly feel, and the symptom is the alarm bell. </w:t>
       </w:r>
       <w:r>
         <w:rPr>
@@ -2726,25 +3666,13 @@
         <w:pStyle w:val="ListBullet"/>
       </w:pPr>
       <w:r>
-        <w:t xml:space="preserve">Core </w:t>
-      </w:r>
-      <w:r>
-        <w:rPr>
-          <w:b/>
-        </w:rPr>
-        <w:t>techniques</w:t>
-      </w:r>
-      <w:r>
-        <w:t xml:space="preserve"> are </w:t>
-      </w:r>
-      <w:r>
-        <w:rPr>
-          <w:b/>
-        </w:rPr>
-        <w:t>empathic listening, reflection</w:t>
-      </w:r>
-      <w:r>
-        <w:t xml:space="preserve"> and unconditional acceptance. They are offered in a non-directive, client-led way that follows the person rather than steering them. </w:t>
+        <w:rPr>
+          <w:b/>
+        </w:rPr>
+        <w:t>Empathic listening</w:t>
+      </w:r>
+      <w:r>
+        <w:t xml:space="preserve"> is the core technique. How it is done: the therapist listens for the feeling under the words and reflects it back accurately, so the client hears their own inner world said aloud. Why it helps: feeling deeply understood is, by itself, freeing — it tells the person they are not alone and need not hide. </w:t>
       </w:r>
       <w:r>
         <w:rPr>
@@ -2759,25 +3687,55 @@
         <w:pStyle w:val="ListBullet"/>
       </w:pPr>
       <w:r>
-        <w:t xml:space="preserve">Experiential </w:t>
-      </w:r>
-      <w:r>
-        <w:rPr>
-          <w:b/>
-        </w:rPr>
-        <w:t>techniques</w:t>
-      </w:r>
-      <w:r>
-        <w:t xml:space="preserve"> are also used, like focusing on the </w:t>
-      </w:r>
-      <w:r>
-        <w:rPr>
-          <w:b/>
-        </w:rPr>
-        <w:t>bodily felt sense</w:t>
-      </w:r>
-      <w:r>
-        <w:t xml:space="preserve"> and chair work. These help the person contact and process emotion in the present moment. For example, noticing a tight chest can open up a feeling the person could not name. </w:t>
+        <w:rPr>
+          <w:b/>
+        </w:rPr>
+        <w:t>Reflection and acceptance</w:t>
+      </w:r>
+      <w:r>
+        <w:t xml:space="preserve"> are the next techniques. How it is done: the therapist mirrors feelings without judging, advising or steering, following the client's lead rather than leading. Why it helps: unconditional acceptance dissolves the conditions of worth that first blocked the person's growth. </w:t>
+      </w:r>
+      <w:r>
+        <w:rPr>
+          <w:i/>
+          <w:color w:val="555555"/>
+        </w:rPr>
+        <w:t>[Richard S. Sharf, Theories of Psychotherapy and Counseling]</w:t>
+      </w:r>
+    </w:p>
+    <w:p>
+      <w:pPr>
+        <w:pStyle w:val="ListBullet"/>
+      </w:pPr>
+      <w:r>
+        <w:rPr>
+          <w:b/>
+        </w:rPr>
+        <w:t>Focusing on the felt sense</w:t>
+      </w:r>
+      <w:r>
+        <w:t xml:space="preserve"> is an experiential technique (Gendlin). How it is done: the therapist invites the client to notice a vague bodily feeling — a tightness, a heaviness — and stay with it until words arrive. Example: attending to a knot in the stomach may slowly reveal an unnamed grief. Why it helps: emotion lives in the body, so the body is a doorway to feelings the mind has hidden. </w:t>
+      </w:r>
+      <w:r>
+        <w:rPr>
+          <w:i/>
+          <w:color w:val="555555"/>
+        </w:rPr>
+        <w:t>[Gerald Corey, Theory and Practice of Counseling and Psychotherapy]</w:t>
+      </w:r>
+    </w:p>
+    <w:p>
+      <w:pPr>
+        <w:pStyle w:val="ListBullet"/>
+      </w:pPr>
+      <w:r>
+        <w:rPr>
+          <w:b/>
+        </w:rPr>
+        <w:t>Chair and experiential work</w:t>
+      </w:r>
+      <w:r>
+        <w:t xml:space="preserve"> round out the techniques. How it is done: the client speaks to an imagined part of themselves or another person, bringing a felt conflict into the room to be experienced, not just discussed. </w:t>
       </w:r>
       <w:r>
         <w:rPr>
@@ -3236,6 +4194,101 @@
       </w:tr>
     </w:tbl>
     <w:p/>
+    <w:tbl>
+      <w:tblPr>
+        <w:tblStyle w:val="TableGrid"/>
+        <w:tblW w:type="auto" w:w="0"/>
+        <w:tblLook w:firstColumn="1" w:firstRow="1" w:lastColumn="0" w:lastRow="0" w:noHBand="0" w:noVBand="1" w:val="04A0"/>
+      </w:tblPr>
+      <w:tblGrid>
+        <w:gridCol w:w="8640"/>
+      </w:tblGrid>
+      <w:tr>
+        <w:tc>
+          <w:tcPr>
+            <w:tcW w:type="dxa" w:w="8640"/>
+            <w:shd w:val="clear" w:color="auto" w:fill="F1F3F5"/>
+          </w:tcPr>
+          <w:p>
+            <w:r/>
+            <w:r>
+              <w:rPr>
+                <w:b/>
+              </w:rPr>
+              <w:t>Main focus (the central idea)</w:t>
+            </w:r>
+          </w:p>
+          <w:p>
+            <w:r>
+              <w:t xml:space="preserve">• </w:t>
+            </w:r>
+            <w:r>
+              <w:t xml:space="preserve">The </w:t>
+            </w:r>
+            <w:r>
+              <w:rPr>
+                <w:b/>
+              </w:rPr>
+              <w:t>main focus</w:t>
+            </w:r>
+            <w:r>
+              <w:t xml:space="preserve"> is facing the hard, unavoidable facts of being alive — that we will die, that we are free and responsible, that we are ultimately alone, and that life has no ready-made meaning. These facts stir up anxiety in everyone.</w:t>
+            </w:r>
+          </w:p>
+          <w:p>
+            <w:r>
+              <w:t xml:space="preserve">• </w:t>
+            </w:r>
+            <w:r>
+              <w:t xml:space="preserve">The central claim is that </w:t>
+            </w:r>
+            <w:r>
+              <w:rPr>
+                <w:b/>
+              </w:rPr>
+              <w:t>symptoms often come from dodging this anxiety</w:t>
+            </w:r>
+            <w:r>
+              <w:t xml:space="preserve"> rather than from a disease. So the therapy does not try to remove the anxiety; it helps the person stop running from it and instead live more honestly, more responsibly and with more meaning in its presence.</w:t>
+            </w:r>
+          </w:p>
+        </w:tc>
+      </w:tr>
+    </w:tbl>
+    <w:p/>
+    <w:p>
+      <w:pPr>
+        <w:pStyle w:val="Heading2"/>
+      </w:pPr>
+      <w:r>
+        <w:t>How it actually works (the mechanism of change)</w:t>
+      </w:r>
+    </w:p>
+    <w:p>
+      <w:pPr>
+        <w:pStyle w:val="ListBullet"/>
+      </w:pPr>
+      <w:r>
+        <w:t xml:space="preserve">Change comes from </w:t>
+      </w:r>
+      <w:r>
+        <w:rPr>
+          <w:b/>
+        </w:rPr>
+        <w:t>honest confrontation, not avoidance</w:t>
+      </w:r>
+      <w:r>
+        <w:t>. When the client stops numbing or distracting themselves and squarely faces, say, the fact of death or their own freedom, the dodged anxiety stops leaking out as symptoms and becomes a spur to live more fully.</w:t>
+      </w:r>
+    </w:p>
+    <w:p>
+      <w:pPr>
+        <w:pStyle w:val="ListBullet"/>
+      </w:pPr>
+      <w:r>
+        <w:t>A simple example: a man who buries himself in overwork to avoid the thought of mortality may, once he faces it in therapy, choose to spend his evenings with his children instead. Facing the fact changed how he used his limited time. The awareness itself is what frees the choice.</w:t>
+      </w:r>
+    </w:p>
     <w:p>
       <w:pPr>
         <w:pStyle w:val="Heading2"/>
@@ -3423,7 +4476,7 @@
         <w:t>will to meaning</w:t>
       </w:r>
       <w:r>
-        <w:t xml:space="preserve"> is the deepest human drive. </w:t>
+        <w:t xml:space="preserve"> — the hunger for life to mean something — is the deepest human drive, deeper than pleasure or power. </w:t>
       </w:r>
       <w:r>
         <w:rPr>
@@ -3531,25 +4584,13 @@
         <w:pStyle w:val="ListBullet"/>
       </w:pPr>
       <w:r>
-        <w:t xml:space="preserve">A core </w:t>
-      </w:r>
-      <w:r>
-        <w:rPr>
-          <w:b/>
-        </w:rPr>
-        <w:t>procedure</w:t>
-      </w:r>
-      <w:r>
-        <w:t xml:space="preserve"> is </w:t>
-      </w:r>
-      <w:r>
-        <w:rPr>
-          <w:b/>
-        </w:rPr>
-        <w:t>phenomenological exploration</w:t>
-      </w:r>
-      <w:r>
-        <w:t xml:space="preserve"> of the client's own world. The therapist sets aside their own assumptions and uses Socratic questioning to examine the client's values, choices and avoidances. </w:t>
+        <w:rPr>
+          <w:b/>
+        </w:rPr>
+        <w:t>Phenomenological exploration</w:t>
+      </w:r>
+      <w:r>
+        <w:t xml:space="preserve"> is the core procedure. How it is done: the therapist deliberately sets aside their own assumptions and asks open, curious questions to enter the client's own world exactly as the client sees it. Why it helps: only by seeing the world through the client's eyes can the real avoidances be found. </w:t>
       </w:r>
       <w:r>
         <w:rPr>
@@ -3564,16 +4605,13 @@
         <w:pStyle w:val="ListBullet"/>
       </w:pPr>
       <w:r>
-        <w:t xml:space="preserve">The here-and-now </w:t>
-      </w:r>
-      <w:r>
-        <w:rPr>
-          <w:b/>
-        </w:rPr>
-        <w:t>relationship</w:t>
-      </w:r>
-      <w:r>
-        <w:t xml:space="preserve"> is used as a testing ground. Encouraging </w:t>
+        <w:rPr>
+          <w:b/>
+        </w:rPr>
+        <w:t>Using the here-and-now relationship</w:t>
+      </w:r>
+      <w:r>
+        <w:t xml:space="preserve"> is a technique in itself. How it is done: the therapist treats the bond in the room as a live sample of how the client meets others, and encourages </w:t>
       </w:r>
       <w:r>
         <w:rPr>
@@ -3582,7 +4620,7 @@
         <w:t>'I' statements</w:t>
       </w:r>
       <w:r>
-        <w:t xml:space="preserve"> that own experience helps the client take responsibility, instead of treating problems as things that just happen to them. </w:t>
+        <w:t xml:space="preserve"> ('I chose', 'I feel') in place of 'it happened to me'. Why it helps: owning your words is a first, concrete step to owning your life. </w:t>
       </w:r>
       <w:r>
         <w:rPr>
@@ -3597,28 +4635,13 @@
         <w:pStyle w:val="ListBullet"/>
       </w:pPr>
       <w:r>
-        <w:t xml:space="preserve">A signature logotherapy </w:t>
-      </w:r>
-      <w:r>
-        <w:rPr>
-          <w:b/>
-        </w:rPr>
-        <w:t>technique</w:t>
-      </w:r>
-      <w:r>
-        <w:t xml:space="preserve"> is </w:t>
-      </w:r>
-      <w:r>
-        <w:t xml:space="preserve">paradoxical intention </w:t>
-      </w:r>
-      <w:r>
-        <w:rPr>
-          <w:i/>
-        </w:rPr>
-        <w:t>(deliberately trying to do the very thing you fear, which often drains the fear away)</w:t>
-      </w:r>
-      <w:r>
-        <w:t xml:space="preserve">. The client who fears blushing, for example, tries to blush on purpose, and the anticipatory anxiety loosens. </w:t>
+        <w:rPr>
+          <w:b/>
+        </w:rPr>
+        <w:t>Paradoxical intention</w:t>
+      </w:r>
+      <w:r>
+        <w:t xml:space="preserve"> is a signature logotherapy technique. How it is done: the client is asked to try hard to bring on the very thing they dread — someone who fears blushing tries to blush as red as possible. Why it works: you cannot force an anxious symptom on command, so the effort breaks the vicious circle of 'fear of the fear'. </w:t>
       </w:r>
       <w:r>
         <w:rPr>
@@ -3633,28 +4656,13 @@
         <w:pStyle w:val="ListBullet"/>
       </w:pPr>
       <w:r>
-        <w:t xml:space="preserve">A second logotherapy </w:t>
-      </w:r>
-      <w:r>
-        <w:rPr>
-          <w:b/>
-        </w:rPr>
-        <w:t>technique</w:t>
-      </w:r>
-      <w:r>
-        <w:t xml:space="preserve"> is </w:t>
-      </w:r>
-      <w:r>
-        <w:t xml:space="preserve">dereflection </w:t>
-      </w:r>
-      <w:r>
-        <w:rPr>
-          <w:i/>
-        </w:rPr>
-        <w:t>(taking your attention off yourself and your symptom and putting it onto something meaningful instead)</w:t>
-      </w:r>
-      <w:r>
-        <w:t xml:space="preserve">. The client stops anxiously watching themselves and turns toward meaningful activity and other people. </w:t>
+        <w:rPr>
+          <w:b/>
+        </w:rPr>
+        <w:t>Dereflection</w:t>
+      </w:r>
+      <w:r>
+        <w:t xml:space="preserve"> is the second logotherapy technique. How it is done: the therapist turns the client's attention away from anxiously watching their own symptom and onto meaningful people and activities instead. Example: a man obsessed with his sleeplessness is guided to focus on his work and family, and the sleep often returns on its own. </w:t>
       </w:r>
       <w:r>
         <w:rPr>
@@ -3669,16 +4677,13 @@
         <w:pStyle w:val="ListBullet"/>
       </w:pPr>
       <w:r>
-        <w:t xml:space="preserve">A third technique is </w:t>
-      </w:r>
-      <w:r>
-        <w:rPr>
-          <w:b/>
-        </w:rPr>
-        <w:t>attitude change</w:t>
-      </w:r>
-      <w:r>
-        <w:t xml:space="preserve">. The therapist helps the client find meaning in suffering that cannot be changed, which matters most when the situation itself is fixed. </w:t>
+        <w:rPr>
+          <w:b/>
+        </w:rPr>
+        <w:t>Attitude change</w:t>
+      </w:r>
+      <w:r>
+        <w:t xml:space="preserve"> (finding meaning in unavoidable suffering) is the third technique. How it is done: when a situation genuinely cannot be changed — a terminal illness, a bereavement — the therapist helps the client choose the stance they take toward it, which is the one freedom no one can remove. </w:t>
       </w:r>
       <w:r>
         <w:rPr>
@@ -4098,6 +5103,131 @@
       </w:tr>
     </w:tbl>
     <w:p/>
+    <w:tbl>
+      <w:tblPr>
+        <w:tblStyle w:val="TableGrid"/>
+        <w:tblW w:type="auto" w:w="0"/>
+        <w:tblLook w:firstColumn="1" w:firstRow="1" w:lastColumn="0" w:lastRow="0" w:noHBand="0" w:noVBand="1" w:val="04A0"/>
+      </w:tblPr>
+      <w:tblGrid>
+        <w:gridCol w:w="8640"/>
+      </w:tblGrid>
+      <w:tr>
+        <w:tc>
+          <w:tcPr>
+            <w:tcW w:type="dxa" w:w="8640"/>
+            <w:shd w:val="clear" w:color="auto" w:fill="F1F3F5"/>
+          </w:tcPr>
+          <w:p>
+            <w:r/>
+            <w:r>
+              <w:rPr>
+                <w:b/>
+              </w:rPr>
+              <w:t>Main focus (the central idea)</w:t>
+            </w:r>
+          </w:p>
+          <w:p>
+            <w:r>
+              <w:t xml:space="preserve">• </w:t>
+            </w:r>
+            <w:r>
+              <w:t xml:space="preserve">The </w:t>
+            </w:r>
+            <w:r>
+              <w:rPr>
+                <w:b/>
+              </w:rPr>
+              <w:t>main focus</w:t>
+            </w:r>
+            <w:r>
+              <w:t xml:space="preserve"> is present-moment </w:t>
+            </w:r>
+            <w:r>
+              <w:rPr>
+                <w:b/>
+              </w:rPr>
+              <w:t>awareness</w:t>
+            </w:r>
+            <w:r>
+              <w:t>. Gestalt therapy holds that simply becoming fully aware of what you are feeling, doing and avoiding right now is itself what heals — you do not need the therapist to explain your past to you.</w:t>
+            </w:r>
+          </w:p>
+          <w:p>
+            <w:r>
+              <w:t xml:space="preserve">• </w:t>
+            </w:r>
+            <w:r>
+              <w:t xml:space="preserve">Instead of talking </w:t>
+            </w:r>
+            <w:r>
+              <w:rPr>
+                <w:b/>
+              </w:rPr>
+              <w:t>about</w:t>
+            </w:r>
+            <w:r>
+              <w:t xml:space="preserve"> a problem, the therapist sets up live </w:t>
+            </w:r>
+            <w:r>
+              <w:rPr>
+                <w:b/>
+              </w:rPr>
+              <w:t>experiments</w:t>
+            </w:r>
+            <w:r>
+              <w:t xml:space="preserve"> so the client experiences it directly in the room. The aim is to finish old 'unfinished business' and take back the parts of yourself you had disowned, so you feel whole again.</w:t>
+            </w:r>
+          </w:p>
+        </w:tc>
+      </w:tr>
+    </w:tbl>
+    <w:p/>
+    <w:p>
+      <w:pPr>
+        <w:pStyle w:val="Heading2"/>
+      </w:pPr>
+      <w:r>
+        <w:t>How it actually works (the mechanism of change)</w:t>
+      </w:r>
+    </w:p>
+    <w:p>
+      <w:pPr>
+        <w:pStyle w:val="ListBullet"/>
+      </w:pPr>
+      <w:r>
+        <w:t xml:space="preserve">Change works through </w:t>
+      </w:r>
+      <w:r>
+        <w:rPr>
+          <w:b/>
+        </w:rPr>
+        <w:t>heightened awareness in the here-and-now</w:t>
+      </w:r>
+      <w:r>
+        <w:t>. By exaggerating a gesture, staying with a feeling or speaking to an empty chair, the client suddenly notices what they have been doing out of habit — and that fresh awareness, by itself, opens up a choice that was invisible before.</w:t>
+      </w:r>
+    </w:p>
+    <w:p>
+      <w:pPr>
+        <w:pStyle w:val="ListBullet"/>
+      </w:pPr>
+      <w:r>
+        <w:t xml:space="preserve">This rests on the </w:t>
+      </w:r>
+      <w:r>
+        <w:t xml:space="preserve">paradoxical theory of change </w:t>
+      </w:r>
+      <w:r>
+        <w:rPr>
+          <w:i/>
+        </w:rPr>
+        <w:t>(the odd truth that you change by fully accepting and becoming who you are now, not by forcing yourself to be someone else)</w:t>
+      </w:r>
+      <w:r>
+        <w:t>. Fighting a feeling keeps you stuck; fully owning it is what lets it move, much as you can only leave a room once you admit you are in it.</w:t>
+      </w:r>
+    </w:p>
     <w:p>
       <w:pPr>
         <w:pStyle w:val="Heading2"/>
@@ -4219,7 +5349,7 @@
         <w:t>what and how</w:t>
       </w:r>
       <w:r>
-        <w:t xml:space="preserve"> of present experience, not the why. This is because awareness in the present moment is what heals. </w:t>
+        <w:t xml:space="preserve"> of present experience, not the why. This is because awareness in the present moment, not a theory about the past, is what heals. </w:t>
       </w:r>
       <w:r>
         <w:rPr>
@@ -4255,7 +5385,7 @@
         <w:t>(the one need or interest that stands out from everything else right now, like a craving when you are hungry)</w:t>
       </w:r>
       <w:r>
-        <w:t xml:space="preserve"> against the background. </w:t>
+        <w:t xml:space="preserve"> against the background. Healthy living is a smooth flow of needs rising, being met and fading back. </w:t>
       </w:r>
       <w:r>
         <w:rPr>
@@ -4282,7 +5412,7 @@
         <w:t>(old, unexpressed feelings from the past that keep nagging and spilling into the present)</w:t>
       </w:r>
       <w:r>
-        <w:t xml:space="preserve">. These press for attention and stop a person living fully now. </w:t>
+        <w:t xml:space="preserve">. Like an argument you never got to finish, these press for attention and stop a person living fully now. </w:t>
       </w:r>
       <w:r>
         <w:rPr>
@@ -4315,7 +5445,7 @@
         <w:t>interruptions to contact</w:t>
       </w:r>
       <w:r>
-        <w:t xml:space="preserve"> at the boundary with others. These are named introjection, projection, </w:t>
+        <w:t xml:space="preserve"> at the boundary with others. These are named introjection (swallowing others' rules whole), projection (seeing your own feeling in others), </w:t>
       </w:r>
       <w:r>
         <w:t xml:space="preserve">retroflection </w:t>
@@ -4327,7 +5457,7 @@
         <w:t>(turning back on yourself what you really want to do to someone else, like getting angry at yourself instead of them)</w:t>
       </w:r>
       <w:r>
-        <w:t xml:space="preserve">, deflection and confluence. </w:t>
+        <w:t xml:space="preserve">, deflection (dodging real contact) and confluence (blurring into others). </w:t>
       </w:r>
       <w:r>
         <w:rPr>
@@ -4351,7 +5481,7 @@
         <w:t>Perls' layers of neurosis</w:t>
       </w:r>
       <w:r>
-        <w:t xml:space="preserve">: the phony, phobic, impasse, implosive and explosive layers. A client passes through them on the way to genuine contact. </w:t>
+        <w:t xml:space="preserve">: the phony, phobic, impasse, implosive and explosive layers. A client passes through them, like peeling an onion, on the way to genuine contact. </w:t>
       </w:r>
       <w:r>
         <w:rPr>
@@ -4375,7 +5505,7 @@
         <w:t>top-dog versus underdog</w:t>
       </w:r>
       <w:r>
-        <w:t xml:space="preserve"> split. This is the inner tug-of-war between the bossy 'you should' and the stubborn 'I won't', which keeps a person stuck. </w:t>
+        <w:t xml:space="preserve"> split. This is the inner tug-of-war between the bossy 'you should' (top-dog) and the sly, stubborn 'I won't' (underdog), which keeps a person stuck. </w:t>
       </w:r>
       <w:r>
         <w:rPr>
@@ -4423,28 +5553,28 @@
         <w:pStyle w:val="ListBullet"/>
       </w:pPr>
       <w:r>
-        <w:t xml:space="preserve">The best-known </w:t>
-      </w:r>
-      <w:r>
-        <w:rPr>
-          <w:b/>
-        </w:rPr>
-        <w:t>technique</w:t>
-      </w:r>
-      <w:r>
-        <w:t xml:space="preserve"> is the </w:t>
-      </w:r>
-      <w:r>
-        <w:t xml:space="preserve">empty-chair technique </w:t>
+        <w:t xml:space="preserve">The </w:t>
+      </w:r>
+      <w:r>
+        <w:rPr>
+          <w:b/>
+        </w:rPr>
+        <w:t>empty-chair technique</w:t>
+      </w:r>
+      <w:r>
+        <w:t xml:space="preserve"> is the best-known Gestalt method. How it is done: the client imagines a person, or a part of themselves, sitting in an </w:t>
+      </w:r>
+      <w:r>
+        <w:t xml:space="preserve">empty chair </w:t>
       </w:r>
       <w:r>
         <w:rPr>
           <w:i/>
         </w:rPr>
-        <w:t>(talking to an imagined person, or a part of yourself, pictured sitting in an empty chair)</w:t>
-      </w:r>
-      <w:r>
-        <w:t xml:space="preserve">. This brings an absent person or an inner conflict right into the room. </w:t>
+        <w:t>(an actual empty chair the client talks to, picturing someone absent or an inner part of themselves in it)</w:t>
+      </w:r>
+      <w:r>
+        <w:t xml:space="preserve">, speaks to it, then swaps seats and replies as that other side. Why it helps: a bottled-up conflict becomes a live dialogue, so feelings that were stuck get expressed and the two sides can meet. </w:t>
       </w:r>
       <w:r>
         <w:rPr>
@@ -4459,32 +5589,23 @@
         <w:pStyle w:val="ListBullet"/>
       </w:pPr>
       <w:r>
-        <w:t xml:space="preserve">Further </w:t>
-      </w:r>
-      <w:r>
-        <w:rPr>
-          <w:b/>
-        </w:rPr>
-        <w:t>techniques</w:t>
-      </w:r>
-      <w:r>
-        <w:t xml:space="preserve"> include </w:t>
-      </w:r>
-      <w:r>
-        <w:rPr>
-          <w:b/>
-        </w:rPr>
-        <w:t>exaggerating a gesture</w:t>
-      </w:r>
-      <w:r>
-        <w:t xml:space="preserve">, reversal and staying with the feeling. Each is an experiment meant to heighten awareness, not an interpretation handed down by the therapist. </w:t>
+        <w:t xml:space="preserve">The </w:t>
+      </w:r>
+      <w:r>
+        <w:rPr>
+          <w:b/>
+        </w:rPr>
+        <w:t>two-chair dialogue</w:t>
+      </w:r>
+      <w:r>
+        <w:t xml:space="preserve"> is the related technique for inner splits. How it is done: the top-dog sits in one chair and the underdog in the other, and the client voices both in turn. Why it helps: the warring parts stop fighting in the dark and start hearing each other, which is how they integrate. </w:t>
       </w:r>
       <w:r>
         <w:rPr>
           <w:i/>
           <w:color w:val="555555"/>
         </w:rPr>
-        <w:t>[Richard S. Sharf, Theories of Psychotherapy and Counseling]</w:t>
+        <w:t>[Gerald Corey, Theory and Practice of Counseling and Psychotherapy]</w:t>
       </w:r>
     </w:p>
     <w:p>
@@ -4492,32 +5613,20 @@
         <w:pStyle w:val="ListBullet"/>
       </w:pPr>
       <w:r>
-        <w:t xml:space="preserve">Language </w:t>
-      </w:r>
-      <w:r>
-        <w:rPr>
-          <w:b/>
-        </w:rPr>
-        <w:t>techniques</w:t>
-      </w:r>
-      <w:r>
-        <w:t xml:space="preserve"> matter too. The client swaps 'it' and 'you' for </w:t>
-      </w:r>
-      <w:r>
-        <w:rPr>
-          <w:b/>
-        </w:rPr>
-        <w:t>'I' statements</w:t>
-      </w:r>
-      <w:r>
-        <w:t xml:space="preserve">, and 'I can't' for 'I won't'. This way they own their experience and their choices in the present tense. </w:t>
+        <w:rPr>
+          <w:b/>
+        </w:rPr>
+        <w:t>Exaggeration and staying with the feeling</w:t>
+      </w:r>
+      <w:r>
+        <w:t xml:space="preserve"> are core experiments. How they are done: the therapist asks the client to make a small gesture bigger (keep tapping that foot, harder) or to not escape a rising feeling but stay with it a little longer. Why they help: both turn up the volume on something half-noticed until it reaches full awareness. </w:t>
       </w:r>
       <w:r>
         <w:rPr>
           <w:i/>
           <w:color w:val="555555"/>
         </w:rPr>
-        <w:t>[Gerald Corey, Theory and Practice of Counseling and Psychotherapy]</w:t>
+        <w:t>[Richard S. Sharf, Theories of Psychotherapy and Counseling]</w:t>
       </w:r>
     </w:p>
     <w:p>
@@ -4528,10 +5637,19 @@
         <w:rPr>
           <w:b/>
         </w:rPr>
-        <w:t>Dream work</w:t>
-      </w:r>
-      <w:r>
-        <w:t xml:space="preserve"> is distinctive. Every part of a dream is treated as a cast-off piece of the dreamer, who then plays each part out loud to reclaim it. </w:t>
+        <w:t>'I' language</w:t>
+      </w:r>
+      <w:r>
+        <w:t xml:space="preserve"> is a simple but powerful technique. How it is done: the client swaps 'it' and 'you' for </w:t>
+      </w:r>
+      <w:r>
+        <w:rPr>
+          <w:b/>
+        </w:rPr>
+        <w:t>'I'</w:t>
+      </w:r>
+      <w:r>
+        <w:t xml:space="preserve">, and 'I can't' for 'I won't'. Example: 'my hand is shaking' becomes 'I am shaking', which quietly restores ownership of the experience and the choice. </w:t>
       </w:r>
       <w:r>
         <w:rPr>
@@ -4546,25 +5664,13 @@
         <w:pStyle w:val="ListBullet"/>
       </w:pPr>
       <w:r>
-        <w:t xml:space="preserve">In </w:t>
-      </w:r>
-      <w:r>
-        <w:rPr>
-          <w:b/>
-        </w:rPr>
-        <w:t>stages and process</w:t>
-      </w:r>
-      <w:r>
-        <w:t xml:space="preserve"> the work moves from </w:t>
-      </w:r>
-      <w:r>
-        <w:rPr>
-          <w:b/>
-        </w:rPr>
-        <w:t>contact and the I-Thou relationship</w:t>
-      </w:r>
-      <w:r>
-        <w:t xml:space="preserve">, through awareness work and experiments that heighten contact, to integration and the closing of what was unfinished. </w:t>
+        <w:rPr>
+          <w:b/>
+        </w:rPr>
+        <w:t>Dream work</w:t>
+      </w:r>
+      <w:r>
+        <w:t xml:space="preserve"> is distinctive in Gestalt. How it is done: rather than interpret a dream, the therapist treats every part of it — even a wall or a dog — as a cast-off piece of the dreamer, who speaks as each part in turn. Why it helps: the client reclaims the disowned feelings the dream represents. </w:t>
       </w:r>
       <w:r>
         <w:rPr>
@@ -4579,6 +5685,39 @@
         <w:pStyle w:val="ListBullet"/>
       </w:pPr>
       <w:r>
+        <w:t xml:space="preserve">In </w:t>
+      </w:r>
+      <w:r>
+        <w:rPr>
+          <w:b/>
+        </w:rPr>
+        <w:t>stages and process</w:t>
+      </w:r>
+      <w:r>
+        <w:t xml:space="preserve"> the work moves from </w:t>
+      </w:r>
+      <w:r>
+        <w:rPr>
+          <w:b/>
+        </w:rPr>
+        <w:t>contact and the I-Thou relationship</w:t>
+      </w:r>
+      <w:r>
+        <w:t xml:space="preserve">, through awareness work and experiments that heighten contact, to integration and the closing of what was unfinished. </w:t>
+      </w:r>
+      <w:r>
+        <w:rPr>
+          <w:i/>
+          <w:color w:val="555555"/>
+        </w:rPr>
+        <w:t>[Gerald Corey, Theory and Practice of Counseling and Psychotherapy]</w:t>
+      </w:r>
+    </w:p>
+    <w:p>
+      <w:pPr>
+        <w:pStyle w:val="ListBullet"/>
+      </w:pPr>
+      <w:r>
         <w:t xml:space="preserve">The therapist's </w:t>
       </w:r>
       <w:r>
@@ -4597,7 +5736,7 @@
         <w:t>authentic and present</w:t>
       </w:r>
       <w:r>
-        <w:t xml:space="preserve">, not interpretative. They offer experiments and honest feedback rather than analysing from a distance. </w:t>
+        <w:t xml:space="preserve">, not interpretative. They offer experiments and honest, in-the-moment feedback rather than analysing from a distance. </w:t>
       </w:r>
       <w:r>
         <w:rPr>
@@ -4966,6 +6105,110 @@
       </w:tr>
     </w:tbl>
     <w:p/>
+    <w:tbl>
+      <w:tblPr>
+        <w:tblStyle w:val="TableGrid"/>
+        <w:tblW w:type="auto" w:w="0"/>
+        <w:tblLook w:firstColumn="1" w:firstRow="1" w:lastColumn="0" w:lastRow="0" w:noHBand="0" w:noVBand="1" w:val="04A0"/>
+      </w:tblPr>
+      <w:tblGrid>
+        <w:gridCol w:w="8640"/>
+      </w:tblGrid>
+      <w:tr>
+        <w:tc>
+          <w:tcPr>
+            <w:tcW w:type="dxa" w:w="8640"/>
+            <w:shd w:val="clear" w:color="auto" w:fill="F1F3F5"/>
+          </w:tcPr>
+          <w:p>
+            <w:r/>
+            <w:r>
+              <w:rPr>
+                <w:b/>
+              </w:rPr>
+              <w:t>Main focus (the central idea)</w:t>
+            </w:r>
+          </w:p>
+          <w:p>
+            <w:r>
+              <w:t xml:space="preserve">• </w:t>
+            </w:r>
+            <w:r>
+              <w:t xml:space="preserve">The </w:t>
+            </w:r>
+            <w:r>
+              <w:rPr>
+                <w:b/>
+              </w:rPr>
+              <w:t>main focus</w:t>
+            </w:r>
+            <w:r>
+              <w:t xml:space="preserve"> is the quality of the relationship, not any technique. Rogers claimed that if the therapist offers just three attitudes — being genuine, fully accepting the client, and truly understanding them — that is </w:t>
+            </w:r>
+            <w:r>
+              <w:rPr>
+                <w:b/>
+              </w:rPr>
+              <w:t>enough on its own</w:t>
+            </w:r>
+            <w:r>
+              <w:t xml:space="preserve"> to free the client's natural drive to grow.</w:t>
+            </w:r>
+          </w:p>
+          <w:p>
+            <w:r>
+              <w:t xml:space="preserve">• </w:t>
+            </w:r>
+            <w:r>
+              <w:t xml:space="preserve">The client, not the therapist, is treated as the </w:t>
+            </w:r>
+            <w:r>
+              <w:rPr>
+                <w:b/>
+              </w:rPr>
+              <w:t>expert on their own life</w:t>
+            </w:r>
+            <w:r>
+              <w:t>. So the therapist never diagnoses, advises or steers. They follow the client, trusting that the person already carries within them the direction they need.</w:t>
+            </w:r>
+          </w:p>
+        </w:tc>
+      </w:tr>
+    </w:tbl>
+    <w:p/>
+    <w:p>
+      <w:pPr>
+        <w:pStyle w:val="Heading2"/>
+      </w:pPr>
+      <w:r>
+        <w:t>How it actually works (the mechanism of change)</w:t>
+      </w:r>
+    </w:p>
+    <w:p>
+      <w:pPr>
+        <w:pStyle w:val="ListBullet"/>
+      </w:pPr>
+      <w:r>
+        <w:t xml:space="preserve">The change engine is simple: when a person is </w:t>
+      </w:r>
+      <w:r>
+        <w:rPr>
+          <w:b/>
+        </w:rPr>
+        <w:t>accepted exactly as they are</w:t>
+      </w:r>
+      <w:r>
+        <w:t>, they no longer need to defend or hide, so they can look honestly at feelings they once denied. As the hidden feelings come into the open and are accepted, the gap between their real self and their self-image closes, and health returns.</w:t>
+      </w:r>
+    </w:p>
+    <w:p>
+      <w:pPr>
+        <w:pStyle w:val="ListBullet"/>
+      </w:pPr>
+      <w:r>
+        <w:t>A small example: a man who was taught that anger is 'bad' has buried his, and feels tense and unreal. With a therapist who accepts even his anger without flinching, he slowly dares to feel it, name it, and own it — and the tension eases because he is no longer at war with part of himself.</w:t>
+      </w:r>
+    </w:p>
     <w:p>
       <w:pPr>
         <w:pStyle w:val="Heading2"/>
@@ -5072,7 +6315,7 @@
         <w:t>self-concept and the ideal self</w:t>
       </w:r>
       <w:r>
-        <w:t xml:space="preserve"> (how you see yourself versus who you wish you were). A healthy person also trusts their own gut sense of experience as a guide. </w:t>
+        <w:t xml:space="preserve"> (how you see yourself versus who you wish you were). A healthy person also trusts their own gut sense of experience as a guide, rather than only others' opinions. </w:t>
       </w:r>
       <w:r>
         <w:rPr>
@@ -5099,7 +6342,7 @@
         <w:t>(the belief that you only deserve love and approval when you meet other people's standards)</w:t>
       </w:r>
       <w:r>
-        <w:t xml:space="preserve">. They form when love was conditional, and they push the person to deny feelings that clash with them. </w:t>
+        <w:t xml:space="preserve">. They form when love was given with strings attached, and they push the person to deny feelings that clash with them. </w:t>
       </w:r>
       <w:r>
         <w:rPr>
@@ -5123,7 +6366,7 @@
         <w:t>incongruence</w:t>
       </w:r>
       <w:r>
-        <w:t xml:space="preserve">: the gap between how you see yourself and what you actually feel, or between your real and ideal self. This gap produces anxiety and defensiveness. Closing the gap is the mark of health. </w:t>
+        <w:t xml:space="preserve">: the gap between how you see yourself and what you actually feel, or between your real and ideal self. This gap produces anxiety and defensiveness; closing it is the mark of health. </w:t>
       </w:r>
       <w:r>
         <w:rPr>
@@ -5156,7 +6399,7 @@
         <w:t>incongruence caused by conditions of worth</w:t>
       </w:r>
       <w:r>
-        <w:t xml:space="preserve">. So therapy is not a technical repair; it provides the conditions in which the growth drive can start up again. </w:t>
+        <w:t xml:space="preserve">. So therapy is not a technical repair; it simply provides the conditions in which the growth drive can start up again. </w:t>
       </w:r>
       <w:r>
         <w:rPr>
@@ -5180,7 +6423,7 @@
         <w:t>Rogers' six conditions</w:t>
       </w:r>
       <w:r>
-        <w:t xml:space="preserve">. The three offered by the therapist, the 'core conditions', are congruence, unconditional positive regard and empathy. </w:t>
+        <w:t xml:space="preserve"> for change, of which the three the therapist offers — the 'core conditions' — are congruence, unconditional positive regard and empathy. </w:t>
       </w:r>
       <w:r>
         <w:rPr>
@@ -5198,16 +6441,25 @@
         <w:t xml:space="preserve">The first core condition is </w:t>
       </w:r>
       <w:r>
-        <w:t xml:space="preserve">congruence </w:t>
+        <w:rPr>
+          <w:b/>
+        </w:rPr>
+        <w:t>congruence</w:t>
+      </w:r>
+      <w:r>
+        <w:t xml:space="preserve"> (genuineness). How it shows up: the therapist is </w:t>
+      </w:r>
+      <w:r>
+        <w:t xml:space="preserve">congruent </w:t>
       </w:r>
       <w:r>
         <w:rPr>
           <w:i/>
         </w:rPr>
-        <w:t>(the therapist being real and honest, not hiding behind a professional mask)</w:t>
-      </w:r>
-      <w:r>
-        <w:t xml:space="preserve">. The therapist is genuine and whole in the relationship. </w:t>
+        <w:t>(real and honest in the room, not hiding behind a professional mask or a fixed smile)</w:t>
+      </w:r>
+      <w:r>
+        <w:t xml:space="preserve">, matching their outward manner to their true inner feeling. Why it helps: realness invites realness, so the client dares to be genuine too. </w:t>
       </w:r>
       <w:r>
         <w:rPr>
@@ -5225,16 +6477,25 @@
         <w:t xml:space="preserve">The second core condition is </w:t>
       </w:r>
       <w:r>
-        <w:t xml:space="preserve">unconditional positive regard </w:t>
+        <w:rPr>
+          <w:b/>
+        </w:rPr>
+        <w:t>unconditional positive regard</w:t>
+      </w:r>
+      <w:r>
+        <w:t xml:space="preserve">. How it shows up: the therapist </w:t>
+      </w:r>
+      <w:r>
+        <w:t xml:space="preserve">prizes the client </w:t>
       </w:r>
       <w:r>
         <w:rPr>
           <w:i/>
         </w:rPr>
-        <w:t>(warmly accepting and valuing the client no matter what they bring, with no strings attached)</w:t>
-      </w:r>
-      <w:r>
-        <w:t xml:space="preserve">. </w:t>
+        <w:t>(warmly accepts and values the client no matter what they bring, with no strings attached)</w:t>
+      </w:r>
+      <w:r>
+        <w:t xml:space="preserve"> even when disapproving of a behaviour. Why it helps: being accepted whatever you reveal dissolves the conditions of worth that caused the trouble. </w:t>
       </w:r>
       <w:r>
         <w:rPr>
@@ -5258,7 +6519,7 @@
         <w:t>empathy</w:t>
       </w:r>
       <w:r>
-        <w:t xml:space="preserve">: accurately grasping the client's inner world and reflecting it back, so the client feels deeply understood. </w:t>
+        <w:t xml:space="preserve">. How it shows up: the therapist accurately grasps the client's inner world and reflects it back, checking they have it right. Why it helps: feeling deeply and accurately understood lets the client trust and explore their own experience. </w:t>
       </w:r>
       <w:r>
         <w:rPr>
@@ -5324,7 +6585,7 @@
         <w:t>non-directive</w:t>
       </w:r>
       <w:r>
-        <w:t xml:space="preserve">. The therapist does not interpret, diagnose, advise or reassure. Instead they trust the client as the expert on their own life. </w:t>
+        <w:t xml:space="preserve">. How it is done: the therapist deliberately does not interpret, diagnose, advise or reassure. Why it matters: every piece of steering would quietly re-impose a new 'condition of worth', so holding back is itself the active ingredient. </w:t>
       </w:r>
       <w:r>
         <w:rPr>
@@ -5339,25 +6600,13 @@
         <w:pStyle w:val="ListBullet"/>
       </w:pPr>
       <w:r>
-        <w:t xml:space="preserve">The core </w:t>
-      </w:r>
-      <w:r>
-        <w:rPr>
-          <w:b/>
-        </w:rPr>
-        <w:t>techniques</w:t>
-      </w:r>
-      <w:r>
-        <w:t xml:space="preserve">, as far as the model allows them, are </w:t>
-      </w:r>
-      <w:r>
-        <w:rPr>
-          <w:b/>
-        </w:rPr>
-        <w:t>active and reflective listening</w:t>
-      </w:r>
-      <w:r>
-        <w:t xml:space="preserve">, reflecting feelings, paraphrasing, clarifying and allowing silences, all within a genuine relationship. </w:t>
+        <w:rPr>
+          <w:b/>
+        </w:rPr>
+        <w:t>Reflective listening</w:t>
+      </w:r>
+      <w:r>
+        <w:t xml:space="preserve"> is the central technique. How it is done: the therapist mirrors back the feeling and meaning underneath the client's words ('it sounds as if you felt abandoned'), paraphrases, clarifies and allows comfortable silences. Why it helps: the client hears their own inner world said back clearly, which deepens their self-understanding. </w:t>
       </w:r>
       <w:r>
         <w:rPr>
@@ -5774,6 +7023,131 @@
       </w:tr>
     </w:tbl>
     <w:p/>
+    <w:tbl>
+      <w:tblPr>
+        <w:tblStyle w:val="TableGrid"/>
+        <w:tblW w:type="auto" w:w="0"/>
+        <w:tblLook w:firstColumn="1" w:firstRow="1" w:lastColumn="0" w:lastRow="0" w:noHBand="0" w:noVBand="1" w:val="04A0"/>
+      </w:tblPr>
+      <w:tblGrid>
+        <w:gridCol w:w="8640"/>
+      </w:tblGrid>
+      <w:tr>
+        <w:tc>
+          <w:tcPr>
+            <w:tcW w:type="dxa" w:w="8640"/>
+            <w:shd w:val="clear" w:color="auto" w:fill="F1F3F5"/>
+          </w:tcPr>
+          <w:p>
+            <w:r/>
+            <w:r>
+              <w:rPr>
+                <w:b/>
+              </w:rPr>
+              <w:t>Main focus (the central idea)</w:t>
+            </w:r>
+          </w:p>
+          <w:p>
+            <w:r>
+              <w:t xml:space="preserve">• </w:t>
+            </w:r>
+            <w:r>
+              <w:t xml:space="preserve">The </w:t>
+            </w:r>
+            <w:r>
+              <w:rPr>
+                <w:b/>
+              </w:rPr>
+              <w:t>main focus</w:t>
+            </w:r>
+            <w:r>
+              <w:t xml:space="preserve"> is the person as a whole, aiming at goals, and set in their social world. Adler saw us not as pushed from behind by drives but as </w:t>
+            </w:r>
+            <w:r>
+              <w:rPr>
+                <w:b/>
+              </w:rPr>
+              <w:t>pulled forward by goals</w:t>
+            </w:r>
+            <w:r>
+              <w:t xml:space="preserve"> — a private picture of how to feel capable and belong. Problems are treated as </w:t>
+            </w:r>
+            <w:r>
+              <w:rPr>
+                <w:b/>
+              </w:rPr>
+              <w:t>discouragement and mistaken beliefs about life</w:t>
+            </w:r>
+            <w:r>
+              <w:t>, not as illness.</w:t>
+            </w:r>
+          </w:p>
+          <w:p>
+            <w:r>
+              <w:t xml:space="preserve">• </w:t>
+            </w:r>
+            <w:r>
+              <w:t xml:space="preserve">The yardstick of health is </w:t>
+            </w:r>
+            <w:r>
+              <w:t xml:space="preserve">social interest </w:t>
+            </w:r>
+            <w:r>
+              <w:rPr>
+                <w:i/>
+              </w:rPr>
+              <w:t>(a built-in capacity and willingness to cooperate with and care about other people)</w:t>
+            </w:r>
+            <w:r>
+              <w:t>. So the whole therapy re-educates the client toward courage, cooperation and useful contribution, rather than curing a disease.</w:t>
+            </w:r>
+          </w:p>
+        </w:tc>
+      </w:tr>
+    </w:tbl>
+    <w:p/>
+    <w:p>
+      <w:pPr>
+        <w:pStyle w:val="Heading2"/>
+      </w:pPr>
+      <w:r>
+        <w:t>How it actually works (the mechanism of change)</w:t>
+      </w:r>
+    </w:p>
+    <w:p>
+      <w:pPr>
+        <w:pStyle w:val="ListBullet"/>
+      </w:pPr>
+      <w:r>
+        <w:t xml:space="preserve">Change works through </w:t>
+      </w:r>
+      <w:r>
+        <w:rPr>
+          <w:b/>
+        </w:rPr>
+        <w:t>encouragement plus insight into one's lifestyle</w:t>
+      </w:r>
+      <w:r>
+        <w:t>. The therapist first helps the client see the mistaken, self-defeating beliefs they formed as a child, then rebuilds their courage so they dare to act differently and connect with others.</w:t>
+      </w:r>
+    </w:p>
+    <w:p>
+      <w:pPr>
+        <w:pStyle w:val="ListBullet"/>
+      </w:pPr>
+      <w:r>
+        <w:t xml:space="preserve">The key idea is that </w:t>
+      </w:r>
+      <w:r>
+        <w:rPr>
+          <w:b/>
+        </w:rPr>
+        <w:t>a discouraged person behaves badly</w:t>
+      </w:r>
+      <w:r>
+        <w:t>; a child who believes 'I only matter if I am the centre of attention' will misbehave to get it. Replace the belief and restore the courage, and the behaviour changes on its own — much as a plant straightens once you stop blocking its light.</w:t>
+      </w:r>
+    </w:p>
     <w:p>
       <w:pPr>
         <w:pStyle w:val="Heading2"/>
@@ -5898,7 +7272,7 @@
         <w:t>inferiority and compensation</w:t>
       </w:r>
       <w:r>
-        <w:t xml:space="preserve">. Natural feelings of being 'not enough' spur a striving to feel capable and significant. This can grow into healthy ambition or into a self-defeating complex. </w:t>
+        <w:t xml:space="preserve">. Natural feelings of being 'not enough' spur a striving to feel capable and significant. This can grow into healthy ambition or, if it overwhelms the person, into a self-defeating inferiority complex. </w:t>
       </w:r>
       <w:r>
         <w:rPr>
@@ -5922,7 +7296,7 @@
         <w:t>social interest</w:t>
       </w:r>
       <w:r>
-        <w:t xml:space="preserve">: the inborn capacity to cooperate and contribute. Adler made it the yardstick of mental health, so well-being grows as you feel more connected to others. </w:t>
+        <w:t xml:space="preserve">: the inborn capacity to cooperate and contribute. Adler made it the yardstick of mental health, so well-being grows as you feel more connected to and useful to others. </w:t>
       </w:r>
       <w:r>
         <w:rPr>
@@ -5949,7 +7323,7 @@
         <w:t>(the unique set of beliefs and goals about life that you form very early in childhood and then live by)</w:t>
       </w:r>
       <w:r>
-        <w:t xml:space="preserve">. It is shaped by about age five from the family set-up and birth order. </w:t>
+        <w:t xml:space="preserve">. It is largely shaped by about age five from the family set-up and birth order, and then acts like a pair of tinted glasses through which you read everything. </w:t>
       </w:r>
       <w:r>
         <w:rPr>
@@ -5973,7 +7347,7 @@
         <w:t>private logic and common sense</w:t>
       </w:r>
       <w:r>
-        <w:t xml:space="preserve">. Private logic is a person's own quirky, mistaken beliefs, their 'basic mistakes', which steer them away from cooperative living. </w:t>
+        <w:t xml:space="preserve">. Private logic is a person's own quirky, mistaken beliefs — their 'basic mistakes' — which steer them away from cooperative living. </w:t>
       </w:r>
       <w:r>
         <w:rPr>
@@ -6006,7 +7380,7 @@
         <w:t>discouragement, mistaken beliefs and low social interest</w:t>
       </w:r>
       <w:r>
-        <w:t xml:space="preserve">. Difficulties are seen as problems of living, not illness, in other words a way of life that is not working. </w:t>
+        <w:t xml:space="preserve">. Difficulties are seen as problems of living, not illness; in other words, a way of life that is not working. </w:t>
       </w:r>
       <w:r>
         <w:rPr>
@@ -6030,7 +7404,7 @@
         <w:t>Dreikurs' four mistaken goals</w:t>
       </w:r>
       <w:r>
-        <w:t xml:space="preserve"> of a child's misbehaviour: getting attention, seeking power, taking revenge, and showing inadequacy to be left alone. </w:t>
+        <w:t xml:space="preserve"> of a child's misbehaviour: getting attention, seeking power, taking revenge, and showing inadequacy to be left alone. Naming the goal tells you what the child is really after. </w:t>
       </w:r>
       <w:r>
         <w:rPr>
@@ -6078,25 +7452,13 @@
         <w:pStyle w:val="ListBullet"/>
       </w:pPr>
       <w:r>
-        <w:t xml:space="preserve">A core </w:t>
-      </w:r>
-      <w:r>
-        <w:rPr>
-          <w:b/>
-        </w:rPr>
-        <w:t>procedure</w:t>
-      </w:r>
-      <w:r>
-        <w:t xml:space="preserve"> is the </w:t>
-      </w:r>
-      <w:r>
-        <w:rPr>
-          <w:b/>
-        </w:rPr>
-        <w:t>four-phase structure</w:t>
-      </w:r>
-      <w:r>
-        <w:t xml:space="preserve"> named by Dreikurs. It begins with building an equal, respectful and collaborative relationship. </w:t>
+        <w:rPr>
+          <w:b/>
+        </w:rPr>
+        <w:t>Phase one, the relationship</w:t>
+      </w:r>
+      <w:r>
+        <w:t xml:space="preserve">, is the first procedure. How it is done: the therapist builds an equal, respectful, collaborative partnership — two people side by side, never expert-over-patient. Why it matters: a discouraged person can only risk change inside a warm, non-judging bond. </w:t>
       </w:r>
       <w:r>
         <w:rPr>
@@ -6111,16 +7473,13 @@
         <w:pStyle w:val="ListBullet"/>
       </w:pPr>
       <w:r>
-        <w:t xml:space="preserve">The second phase is </w:t>
-      </w:r>
-      <w:r>
-        <w:rPr>
-          <w:b/>
-        </w:rPr>
-        <w:t>lifestyle assessment</w:t>
-      </w:r>
-      <w:r>
-        <w:t xml:space="preserve">. The therapist looks at the family set-up, birth order and especially </w:t>
+        <w:rPr>
+          <w:b/>
+        </w:rPr>
+        <w:t>Phase two, lifestyle assessment</w:t>
+      </w:r>
+      <w:r>
+        <w:t xml:space="preserve">, is a signature technique. How it is done: the therapist explores the family set-up, birth order and especially </w:t>
       </w:r>
       <w:r>
         <w:t xml:space="preserve">early recollections </w:t>
@@ -6129,10 +7488,10 @@
         <w:rPr>
           <w:i/>
         </w:rPr>
-        <w:t>(your very earliest memories, read as clues to the beliefs you live by now)</w:t>
-      </w:r>
-      <w:r>
-        <w:t xml:space="preserve">, which are treated like projective hints. </w:t>
+        <w:t>(your very earliest specific memories, read as clues to the beliefs you live by now)</w:t>
+      </w:r>
+      <w:r>
+        <w:t xml:space="preserve">, treating these first memories like a projective snapshot of the client's core beliefs. </w:t>
       </w:r>
       <w:r>
         <w:rPr>
@@ -6147,16 +7506,13 @@
         <w:pStyle w:val="ListBullet"/>
       </w:pPr>
       <w:r>
-        <w:t xml:space="preserve">The third phase is </w:t>
-      </w:r>
-      <w:r>
-        <w:rPr>
-          <w:b/>
-        </w:rPr>
-        <w:t>insight</w:t>
-      </w:r>
-      <w:r>
-        <w:t xml:space="preserve">. The therapist gently and tentatively points out the client's mistaken beliefs, private logic and hidden goals. </w:t>
+        <w:rPr>
+          <w:b/>
+        </w:rPr>
+        <w:t>Phase three, insight</w:t>
+      </w:r>
+      <w:r>
+        <w:t xml:space="preserve">, follows. How it is done: the therapist gently and tentatively (never bluntly) points out the client's mistaken beliefs, private logic and hidden goals, offering them as a guess to try on. </w:t>
       </w:r>
       <w:r>
         <w:rPr>
@@ -6171,16 +7527,13 @@
         <w:pStyle w:val="ListBullet"/>
       </w:pPr>
       <w:r>
-        <w:t xml:space="preserve">The fourth phase is </w:t>
-      </w:r>
-      <w:r>
-        <w:rPr>
-          <w:b/>
-        </w:rPr>
-        <w:t>reorientation</w:t>
-      </w:r>
-      <w:r>
-        <w:t xml:space="preserve">. Insight is turned into action through new choices, supported by </w:t>
+        <w:rPr>
+          <w:b/>
+        </w:rPr>
+        <w:t>Phase four, reorientation</w:t>
+      </w:r>
+      <w:r>
+        <w:t xml:space="preserve">, turns insight into action, and its engine is </w:t>
       </w:r>
       <w:r>
         <w:rPr>
@@ -6189,7 +7542,7 @@
         <w:t>encouragement</w:t>
       </w:r>
       <w:r>
-        <w:t xml:space="preserve">, which is the central Adlerian technique. </w:t>
+        <w:t xml:space="preserve">, the central Adlerian technique. How it is done: the therapist steadily highlights strengths and effort, not just results, so the client builds the courage to choose new, cooperative behaviour. </w:t>
       </w:r>
       <w:r>
         <w:rPr>
@@ -6204,16 +7557,13 @@
         <w:pStyle w:val="ListBullet"/>
       </w:pPr>
       <w:r>
-        <w:t xml:space="preserve">Distinctive </w:t>
-      </w:r>
-      <w:r>
-        <w:rPr>
-          <w:b/>
-        </w:rPr>
-        <w:t>techniques</w:t>
-      </w:r>
-      <w:r>
-        <w:t xml:space="preserve"> include </w:t>
+        <w:rPr>
+          <w:b/>
+        </w:rPr>
+        <w:t>Acting 'as if'</w:t>
+      </w:r>
+      <w:r>
+        <w:t xml:space="preserve"> is a distinctive action technique. How it is done: the client behaves for a week as though they already had the quality they lack — </w:t>
       </w:r>
       <w:r>
         <w:t xml:space="preserve">acting as if </w:t>
@@ -6222,19 +7572,40 @@
         <w:rPr>
           <w:i/>
         </w:rPr>
-        <w:t>(behaving as though you already had the quality you want, to try it on for size)</w:t>
-      </w:r>
-      <w:r>
-        <w:t xml:space="preserve">, </w:t>
-      </w:r>
-      <w:r>
-        <w:rPr>
-          <w:b/>
-        </w:rPr>
-        <w:t>spitting in the client's soup</w:t>
-      </w:r>
-      <w:r>
-        <w:t xml:space="preserve"> (pointing out the hidden payoff of a behaviour to make it less appealing), catching oneself, the push-button technique, and setting homework. </w:t>
+        <w:t>(behaving as though you already had the confidence or skill you want, to try it on for size, like rehearsing a role)</w:t>
+      </w:r>
+      <w:r>
+        <w:t xml:space="preserve"> — which breaks the 'I could never' belief by direct experience. </w:t>
+      </w:r>
+      <w:r>
+        <w:rPr>
+          <w:i/>
+          <w:color w:val="555555"/>
+        </w:rPr>
+        <w:t>[Richard S. Sharf, Theories of Psychotherapy and Counseling]</w:t>
+      </w:r>
+    </w:p>
+    <w:p>
+      <w:pPr>
+        <w:pStyle w:val="ListBullet"/>
+      </w:pPr>
+      <w:r>
+        <w:rPr>
+          <w:b/>
+        </w:rPr>
+        <w:t>Spitting in the client's soup</w:t>
+      </w:r>
+      <w:r>
+        <w:t xml:space="preserve"> and </w:t>
+      </w:r>
+      <w:r>
+        <w:rPr>
+          <w:b/>
+        </w:rPr>
+        <w:t>catching oneself</w:t>
+      </w:r>
+      <w:r>
+        <w:t xml:space="preserve"> are further techniques. Spitting in the soup means gently naming the hidden payoff of a behaviour so it loses its appeal (once you see you sulk to get sympathy, sulking feels less sweet). Catching oneself trains the client to spot their old pattern starting and stop it, aided by the push-button technique and homework. </w:t>
       </w:r>
       <w:r>
         <w:rPr>
@@ -6627,6 +7998,140 @@
       </w:tr>
     </w:tbl>
     <w:p/>
+    <w:tbl>
+      <w:tblPr>
+        <w:tblStyle w:val="TableGrid"/>
+        <w:tblW w:type="auto" w:w="0"/>
+        <w:tblLook w:firstColumn="1" w:firstRow="1" w:lastColumn="0" w:lastRow="0" w:noHBand="0" w:noVBand="1" w:val="04A0"/>
+      </w:tblPr>
+      <w:tblGrid>
+        <w:gridCol w:w="8640"/>
+      </w:tblGrid>
+      <w:tr>
+        <w:tc>
+          <w:tcPr>
+            <w:tcW w:type="dxa" w:w="8640"/>
+            <w:shd w:val="clear" w:color="auto" w:fill="F1F3F5"/>
+          </w:tcPr>
+          <w:p>
+            <w:r/>
+            <w:r>
+              <w:rPr>
+                <w:b/>
+              </w:rPr>
+              <w:t>Main focus (the central idea)</w:t>
+            </w:r>
+          </w:p>
+          <w:p>
+            <w:r>
+              <w:t xml:space="preserve">• </w:t>
+            </w:r>
+            <w:r>
+              <w:t xml:space="preserve">The </w:t>
+            </w:r>
+            <w:r>
+              <w:rPr>
+                <w:b/>
+              </w:rPr>
+              <w:t>main focus</w:t>
+            </w:r>
+            <w:r>
+              <w:t xml:space="preserve"> is how we think, feel and relate, pictured through three inner 'selves' called </w:t>
+            </w:r>
+            <w:r>
+              <w:t xml:space="preserve">ego states </w:t>
+            </w:r>
+            <w:r>
+              <w:rPr>
+                <w:i/>
+              </w:rPr>
+              <w:t>(three consistent ways of thinking, feeling and acting that we all switch between, called Parent, Adult and Child)</w:t>
+            </w:r>
+            <w:r>
+              <w:t xml:space="preserve">. At any moment you are speaking from one of them: the </w:t>
+            </w:r>
+            <w:r>
+              <w:rPr>
+                <w:b/>
+              </w:rPr>
+              <w:t>Parent</w:t>
+            </w:r>
+            <w:r>
+              <w:t xml:space="preserve"> (copied from your caregivers), the </w:t>
+            </w:r>
+            <w:r>
+              <w:rPr>
+                <w:b/>
+              </w:rPr>
+              <w:t>Adult</w:t>
+            </w:r>
+            <w:r>
+              <w:t xml:space="preserve"> (calm, here-and-now, factual) or the </w:t>
+            </w:r>
+            <w:r>
+              <w:rPr>
+                <w:b/>
+              </w:rPr>
+              <w:t>Child</w:t>
+            </w:r>
+            <w:r>
+              <w:t xml:space="preserve"> (your feelings and playfulness from long ago).</w:t>
+            </w:r>
+          </w:p>
+          <w:p>
+            <w:r>
+              <w:t xml:space="preserve">• </w:t>
+            </w:r>
+            <w:r>
+              <w:t xml:space="preserve">Problems are read as mixed-up ego states, repeated hidden-motive 'games', and a limiting life-story written in childhood. The whole therapy uses a clear, agreed contract to restore </w:t>
+            </w:r>
+            <w:r>
+              <w:rPr>
+                <w:b/>
+              </w:rPr>
+              <w:t>autonomy</w:t>
+            </w:r>
+            <w:r>
+              <w:t xml:space="preserve"> and honest, game-free closeness, in plain everyday language anyone can use.</w:t>
+            </w:r>
+          </w:p>
+        </w:tc>
+      </w:tr>
+    </w:tbl>
+    <w:p/>
+    <w:p>
+      <w:pPr>
+        <w:pStyle w:val="Heading2"/>
+      </w:pPr>
+      <w:r>
+        <w:t>How it actually works (the mechanism of change)</w:t>
+      </w:r>
+    </w:p>
+    <w:p>
+      <w:pPr>
+        <w:pStyle w:val="ListBullet"/>
+      </w:pPr>
+      <w:r>
+        <w:t xml:space="preserve">Change works by </w:t>
+      </w:r>
+      <w:r>
+        <w:rPr>
+          <w:b/>
+        </w:rPr>
+        <w:t>strengthening the Adult and rewriting the script</w:t>
+      </w:r>
+      <w:r>
+        <w:t>. When the client can see which ego state they are in and which game they keep playing, they can choose to answer from the calm, reality-based Adult instead of being yanked around by an old Parent rule or a hurt Child feeling.</w:t>
+      </w:r>
+    </w:p>
+    <w:p>
+      <w:pPr>
+        <w:pStyle w:val="ListBullet"/>
+      </w:pPr>
+      <w:r>
+        <w:t>A clear example: a woman keeps starting the game 'Why don't you — Yes but' (she asks for advice, then rejects every suggestion) and ends up feeling misunderstood again, which confirms her childhood script 'nobody can help me'. Once she spots the game, she can stop playing it and ask for help straight, Adult-to-Adult.</w:t>
+      </w:r>
+    </w:p>
     <w:p>
       <w:pPr>
         <w:pStyle w:val="Heading2"/>
@@ -6736,13 +8241,10 @@
         <w:t xml:space="preserve">The core basis is the three </w:t>
       </w:r>
       <w:r>
-        <w:t xml:space="preserve">ego states </w:t>
-      </w:r>
-      <w:r>
-        <w:rPr>
-          <w:i/>
-        </w:rPr>
-        <w:t>(three consistent ways of thinking, feeling and acting that we all switch between, called Parent, Adult and Child)</w:t>
+        <w:rPr>
+          <w:b/>
+        </w:rPr>
+        <w:t>ego states</w:t>
       </w:r>
       <w:r>
         <w:t xml:space="preserve">. The </w:t>
@@ -6754,7 +8256,7 @@
         <w:t>Parent</w:t>
       </w:r>
       <w:r>
-        <w:t xml:space="preserve"> is taught and judging, the </w:t>
+        <w:t xml:space="preserve"> is the taught, judging, caring voice copied from caregivers; the </w:t>
       </w:r>
       <w:r>
         <w:rPr>
@@ -6763,7 +8265,7 @@
         <w:t>Adult</w:t>
       </w:r>
       <w:r>
-        <w:t xml:space="preserve"> is calm and factual, and the </w:t>
+        <w:t xml:space="preserve"> is the calm, factual problem-solver dealing with the here-and-now; the </w:t>
       </w:r>
       <w:r>
         <w:rPr>
@@ -6772,7 +8274,7 @@
         <w:t>Child</w:t>
       </w:r>
       <w:r>
-        <w:t xml:space="preserve"> is feeling and playful. </w:t>
+        <w:t xml:space="preserve"> holds the feelings, wants and playfulness carried from early life. </w:t>
       </w:r>
       <w:r>
         <w:rPr>
@@ -6790,13 +8292,16 @@
         <w:t xml:space="preserve">A second basis is the analysis of </w:t>
       </w:r>
       <w:r>
-        <w:rPr>
-          <w:b/>
-        </w:rPr>
-        <w:t>transactions</w:t>
-      </w:r>
-      <w:r>
-        <w:t xml:space="preserve">. They can be </w:t>
+        <w:t xml:space="preserve">transaction </w:t>
+      </w:r>
+      <w:r>
+        <w:rPr>
+          <w:i/>
+        </w:rPr>
+        <w:t>(one back-and-forth exchange between two people: you say something, I respond)</w:t>
+      </w:r>
+      <w:r>
+        <w:t xml:space="preserve">s. They can be </w:t>
       </w:r>
       <w:r>
         <w:rPr>
@@ -6805,7 +8310,7 @@
         <w:t>complementary</w:t>
       </w:r>
       <w:r>
-        <w:t xml:space="preserve"> (so talk flows), </w:t>
+        <w:t xml:space="preserve"> (replies come from the expected state, so talk flows), </w:t>
       </w:r>
       <w:r>
         <w:rPr>
@@ -6814,7 +8319,7 @@
         <w:t>crossed</w:t>
       </w:r>
       <w:r>
-        <w:t xml:space="preserve"> (so talk breaks off), or </w:t>
+        <w:t xml:space="preserve"> (an unexpected state replies, so talk breaks off), or </w:t>
       </w:r>
       <w:r>
         <w:t xml:space="preserve">ulterior </w:t>
@@ -6850,7 +8355,7 @@
         <w:t>strokes</w:t>
       </w:r>
       <w:r>
-        <w:t xml:space="preserve">, the units of recognition we all hunger for. Positive or negative, conditional or not, they shape how a person fills their time, from withdrawal through rituals and pastimes up to games and intimacy. </w:t>
+        <w:t xml:space="preserve">, the units of recognition we all hunger for. A stroke is any sign of being noticed; positive or negative, conditional or not. Berne's point is that we need them so badly that we will provoke negative ones rather than be ignored, which shapes how we fill our time. </w:t>
       </w:r>
       <w:r>
         <w:rPr>
@@ -6886,7 +8391,7 @@
         <w:t>(repeated hidden-motive exchanges that always end in the same bad feeling)</w:t>
       </w:r>
       <w:r>
-        <w:t xml:space="preserve">, like 'Why don't you, Yes but'. They pay off in a familiar racket feeling that props up the life script. </w:t>
+        <w:t xml:space="preserve">, like 'Why don't you, Yes but'. They pay off in a familiar bad 'racket' feeling (such as righteous anger) that quietly props up the life script. </w:t>
       </w:r>
       <w:r>
         <w:rPr>
@@ -6910,10 +8415,10 @@
         <w:rPr>
           <w:i/>
         </w:rPr>
-        <w:t>(an unconscious life story you decided on as a child, based on messages from your parents)</w:t>
-      </w:r>
-      <w:r>
-        <w:t xml:space="preserve">. It is built from injunctions like 'don't be close', driver messages like 'be perfect', and the child's own early decisions. </w:t>
+        <w:t>(an unconscious life story you decided on as a child, based on messages from your parents, and then act out)</w:t>
+      </w:r>
+      <w:r>
+        <w:t xml:space="preserve">. It is built from injunctions like 'don't be close', driver messages like 'be perfect', and the child's own early decisions about how life will go. </w:t>
       </w:r>
       <w:r>
         <w:rPr>
@@ -6937,7 +8442,7 @@
         <w:t>life positions</w:t>
       </w:r>
       <w:r>
-        <w:t xml:space="preserve"> of the OK Corral. They run from the healthy 'I'm OK, you're OK' down to the blaming, the self-doubting and the hopeless positions that colour a person's whole outlook. </w:t>
+        <w:t xml:space="preserve"> of the OK Corral. They run from the healthy 'I'm OK, you're OK' down to 'I'm OK, you're not' (blaming), 'I'm not OK, you're OK' (self-doubting) and 'I'm not OK, you're not OK' (hopeless), each colouring a person's whole outlook. </w:t>
       </w:r>
       <w:r>
         <w:rPr>
@@ -6970,7 +8475,7 @@
         <w:t>contaminated or excluded ego states</w:t>
       </w:r>
       <w:r>
-        <w:t xml:space="preserve">, destructive games, a negative script and an unhealthy life position. The therapist maps which ego state and which game is driving the complaint. </w:t>
+        <w:t xml:space="preserve"> (for example Parent prejudices leaking into the Adult), destructive games, a negative script and an unhealthy life position. The therapist maps which ego state and which game is driving the complaint. </w:t>
       </w:r>
       <w:r>
         <w:rPr>
@@ -7042,16 +8547,7 @@
         <w:pStyle w:val="ListBullet"/>
       </w:pPr>
       <w:r>
-        <w:t xml:space="preserve">A central </w:t>
-      </w:r>
-      <w:r>
-        <w:rPr>
-          <w:b/>
-        </w:rPr>
-        <w:t>procedure</w:t>
-      </w:r>
-      <w:r>
-        <w:t xml:space="preserve"> is the </w:t>
+        <w:t xml:space="preserve">The </w:t>
       </w:r>
       <w:r>
         <w:rPr>
@@ -7060,7 +8556,7 @@
         <w:t>contract</w:t>
       </w:r>
       <w:r>
-        <w:t xml:space="preserve">: a clear, mutual agreement on goals and roles. It gives TA its collaborative, adult-to-adult, 'OK, OK' stance from the very first session. </w:t>
+        <w:t xml:space="preserve"> is a defining technique, not just a formality. How it is done: at the start, client and therapist agree in plain words on a clear, observable goal and their shared roles. Why it helps: it sets the equal, adult-to-adult, 'you're OK, I'm OK' tone and keeps both accountable. </w:t>
       </w:r>
       <w:r>
         <w:rPr>
@@ -7075,25 +8571,52 @@
         <w:pStyle w:val="ListBullet"/>
       </w:pPr>
       <w:r>
-        <w:t xml:space="preserve">The main </w:t>
-      </w:r>
-      <w:r>
-        <w:rPr>
-          <w:b/>
-        </w:rPr>
-        <w:t>technique</w:t>
-      </w:r>
-      <w:r>
-        <w:t xml:space="preserve"> is the </w:t>
-      </w:r>
-      <w:r>
-        <w:rPr>
-          <w:b/>
-        </w:rPr>
-        <w:t>four kinds of analysis</w:t>
-      </w:r>
-      <w:r>
-        <w:t xml:space="preserve">: structural analysis of ego states, transactional analysis of exchanges, game analysis of hidden payoffs, and script analysis of the life story. </w:t>
+        <w:t xml:space="preserve">The </w:t>
+      </w:r>
+      <w:r>
+        <w:rPr>
+          <w:b/>
+        </w:rPr>
+        <w:t>four analyses</w:t>
+      </w:r>
+      <w:r>
+        <w:t xml:space="preserve"> are the main technique set. </w:t>
+      </w:r>
+      <w:r>
+        <w:rPr>
+          <w:b/>
+        </w:rPr>
+        <w:t>Structural analysis</w:t>
+      </w:r>
+      <w:r>
+        <w:t xml:space="preserve"> maps the client's three ego states; </w:t>
+      </w:r>
+      <w:r>
+        <w:rPr>
+          <w:b/>
+        </w:rPr>
+        <w:t>transactional analysis</w:t>
+      </w:r>
+      <w:r>
+        <w:t xml:space="preserve"> studies their exchanges with others; </w:t>
+      </w:r>
+      <w:r>
+        <w:rPr>
+          <w:b/>
+        </w:rPr>
+        <w:t>game analysis</w:t>
+      </w:r>
+      <w:r>
+        <w:t xml:space="preserve"> uncovers the hidden payoff of repeated bad exchanges; and </w:t>
+      </w:r>
+      <w:r>
+        <w:rPr>
+          <w:b/>
+        </w:rPr>
+        <w:t>script analysis</w:t>
+      </w:r>
+      <w:r>
+        <w:t xml:space="preserve"> traces the childhood life-story driving it all. Together they move the problem from vague to visible. </w:t>
       </w:r>
       <w:r>
         <w:rPr>
@@ -7108,16 +8631,13 @@
         <w:pStyle w:val="ListBullet"/>
       </w:pPr>
       <w:r>
-        <w:t xml:space="preserve">Berne listed eight </w:t>
-      </w:r>
-      <w:r>
-        <w:rPr>
-          <w:b/>
-        </w:rPr>
-        <w:t>therapeutic operations</w:t>
-      </w:r>
-      <w:r>
-        <w:t xml:space="preserve">, from interrogation, specification and confrontation, through explanation, illustration, confirmation and interpretation, up to </w:t>
+        <w:rPr>
+          <w:b/>
+        </w:rPr>
+        <w:t>Berne's eight therapeutic operations</w:t>
+      </w:r>
+      <w:r>
+        <w:t xml:space="preserve"> are the therapist's fine tools, running from interrogation, specification and confrontation, through explanation, illustration, confirmation and interpretation, up to </w:t>
       </w:r>
       <w:r>
         <w:t xml:space="preserve">crystallisation </w:t>
@@ -7129,7 +8649,7 @@
         <w:t>(the moment the client can finally hold a new, freeing view of themselves on their own)</w:t>
       </w:r>
       <w:r>
-        <w:t xml:space="preserve">. </w:t>
+        <w:t xml:space="preserve">. Each is a graded step from gathering facts to the client's own insight. </w:t>
       </w:r>
       <w:r>
         <w:rPr>
@@ -7144,16 +8664,13 @@
         <w:pStyle w:val="ListBullet"/>
       </w:pPr>
       <w:r>
-        <w:t xml:space="preserve">Further </w:t>
-      </w:r>
-      <w:r>
-        <w:rPr>
-          <w:b/>
-        </w:rPr>
-        <w:t>techniques</w:t>
-      </w:r>
-      <w:r>
-        <w:t xml:space="preserve"> include the </w:t>
+        <w:rPr>
+          <w:b/>
+        </w:rPr>
+        <w:t>Redecision work</w:t>
+      </w:r>
+      <w:r>
+        <w:t xml:space="preserve"> is the powerful change technique (the Gouldings). How it is done: using chair work, the client goes back to the early scene where they made a limiting decision ('I must never show need') and, from the Adult, makes a new decision now. Supported by the </w:t>
       </w:r>
       <w:r>
         <w:rPr>
@@ -7162,16 +8679,7 @@
         <w:t>egogram</w:t>
       </w:r>
       <w:r>
-        <w:t xml:space="preserve">, permissions and protection, and </w:t>
-      </w:r>
-      <w:r>
-        <w:rPr>
-          <w:b/>
-        </w:rPr>
-        <w:t>redecision work</w:t>
-      </w:r>
-      <w:r>
-        <w:t xml:space="preserve"> that re-lives and changes early childhood decisions through chair work, plus stroke work, role play and homework, usually in a group. </w:t>
+        <w:t xml:space="preserve">, permissions, stroke work and homework, usually in a group. </w:t>
       </w:r>
       <w:r>
         <w:rPr>
@@ -7564,6 +9072,119 @@
       </w:tr>
     </w:tbl>
     <w:p/>
+    <w:tbl>
+      <w:tblPr>
+        <w:tblStyle w:val="TableGrid"/>
+        <w:tblW w:type="auto" w:w="0"/>
+        <w:tblLook w:firstColumn="1" w:firstRow="1" w:lastColumn="0" w:lastRow="0" w:noHBand="0" w:noVBand="1" w:val="04A0"/>
+      </w:tblPr>
+      <w:tblGrid>
+        <w:gridCol w:w="8640"/>
+      </w:tblGrid>
+      <w:tr>
+        <w:tc>
+          <w:tcPr>
+            <w:tcW w:type="dxa" w:w="8640"/>
+            <w:shd w:val="clear" w:color="auto" w:fill="F1F3F5"/>
+          </w:tcPr>
+          <w:p>
+            <w:r/>
+            <w:r>
+              <w:rPr>
+                <w:b/>
+              </w:rPr>
+              <w:t>Main focus (the central idea)</w:t>
+            </w:r>
+          </w:p>
+          <w:p>
+            <w:r>
+              <w:t xml:space="preserve">• </w:t>
+            </w:r>
+            <w:r>
+              <w:t xml:space="preserve">The </w:t>
+            </w:r>
+            <w:r>
+              <w:rPr>
+                <w:b/>
+              </w:rPr>
+              <w:t>main focus</w:t>
+            </w:r>
+            <w:r>
+              <w:t xml:space="preserve"> is present choices and responsibility. Reality therapy holds that we </w:t>
+            </w:r>
+            <w:r>
+              <w:rPr>
+                <w:b/>
+              </w:rPr>
+              <w:t>choose almost all of our behaviour</w:t>
+            </w:r>
+            <w:r>
+              <w:t xml:space="preserve"> to try to meet five basic needs, and that we can directly control only what we do and think — not, directly, how we feel. So the work stays firmly on the present and on better choices, not on the past or on blame.</w:t>
+            </w:r>
+          </w:p>
+          <w:p>
+            <w:r>
+              <w:t xml:space="preserve">• </w:t>
+            </w:r>
+            <w:r>
+              <w:t xml:space="preserve">Glasser pictured it as a car with </w:t>
+            </w:r>
+            <w:r>
+              <w:rPr>
+                <w:b/>
+              </w:rPr>
+              <w:t>four wheels</w:t>
+            </w:r>
+            <w:r>
+              <w:t>: thinking and acting are the front wheels we steer with, while feelings and body are the back wheels that follow. Change where you drive (what you do and think) and the back wheels — your feelings — come along behind.</w:t>
+            </w:r>
+          </w:p>
+        </w:tc>
+      </w:tr>
+    </w:tbl>
+    <w:p/>
+    <w:p>
+      <w:pPr>
+        <w:pStyle w:val="Heading2"/>
+      </w:pPr>
+      <w:r>
+        <w:t>How it actually works (the mechanism of change)</w:t>
+      </w:r>
+    </w:p>
+    <w:p>
+      <w:pPr>
+        <w:pStyle w:val="ListBullet"/>
+      </w:pPr>
+      <w:r>
+        <w:t xml:space="preserve">Change works through </w:t>
+      </w:r>
+      <w:r>
+        <w:rPr>
+          <w:b/>
+        </w:rPr>
+        <w:t>self-evaluation inside a caring relationship</w:t>
+      </w:r>
+      <w:r>
+        <w:t>. The therapist does not scold or diagnose; within a warm bond they keep asking, kindly, 'Is what you are doing actually getting you what you want?'. When the client honestly answers 'no', they become willing to plan something better.</w:t>
+      </w:r>
+    </w:p>
+    <w:p>
+      <w:pPr>
+        <w:pStyle w:val="ListBullet"/>
+      </w:pPr>
+      <w:r>
+        <w:t xml:space="preserve">The crucial move is that the </w:t>
+      </w:r>
+      <w:r>
+        <w:rPr>
+          <w:b/>
+        </w:rPr>
+        <w:t>client judges their own behaviour</w:t>
+      </w:r>
+      <w:r>
+        <w:t>, not the therapist. A teenager who skips school to feel powerful is led to see for himself that it is costing him the future he wants; owning that judgement is what powers a realistic new plan he will actually keep.</w:t>
+      </w:r>
+    </w:p>
     <w:p>
       <w:pPr>
         <w:pStyle w:val="Heading2"/>
@@ -7661,7 +9282,19 @@
         <w:t>all behaviour is chosen</w:t>
       </w:r>
       <w:r>
-        <w:t xml:space="preserve">. We can directly control only our acting and thinking, which in turn steer our feelings and body. Glasser pictured this as the four wheels of a car: thinking and acting are the front wheels that steer. </w:t>
+        <w:t xml:space="preserve">, which Glasser grounded in </w:t>
+      </w:r>
+      <w:r>
+        <w:t xml:space="preserve">choice theory </w:t>
+      </w:r>
+      <w:r>
+        <w:rPr>
+          <w:i/>
+        </w:rPr>
+        <w:t>(the idea that we choose nearly all of our behaviour to try to meet our basic needs)</w:t>
+      </w:r>
+      <w:r>
+        <w:t xml:space="preserve">. We can directly control only our acting and thinking, which then steer our feelings and body — the four-wheel car picture. </w:t>
       </w:r>
       <w:r>
         <w:rPr>
@@ -7688,7 +9321,7 @@
         <w:t>(the five needs that drive all of us: survival, love and belonging, power, freedom and fun)</w:t>
       </w:r>
       <w:r>
-        <w:t xml:space="preserve">. Love and belonging is treated as the most important for mental health. </w:t>
+        <w:t xml:space="preserve">. Love and belonging is treated as the most important for mental health, which is why Glasser said most problems are relationship problems. </w:t>
       </w:r>
       <w:r>
         <w:rPr>
@@ -7712,10 +9345,10 @@
         <w:rPr>
           <w:i/>
         </w:rPr>
-        <w:t>(a private mental picture album of the people and things you most want in your life)</w:t>
-      </w:r>
-      <w:r>
-        <w:t xml:space="preserve">. We compare the real world to it, and a gap between the two drives our behaviour. </w:t>
+        <w:t>(a private mental picture album of the specific people and things you most want in your life)</w:t>
+      </w:r>
+      <w:r>
+        <w:t xml:space="preserve">. We constantly compare the real world to this album, and a gap between the two is what drives our behaviour to close it. </w:t>
       </w:r>
       <w:r>
         <w:rPr>
@@ -7739,7 +9372,7 @@
         <w:t>relationships are central</w:t>
       </w:r>
       <w:r>
-        <w:t xml:space="preserve">. The seven deadly habits of criticising, blaming and complaining damage connection; the seven caring habits of supporting, listening and respecting rebuild it. </w:t>
+        <w:t xml:space="preserve">. The seven deadly habits (criticising, blaming, complaining, nagging, threatening, punishing, bribing) damage connection; the seven caring habits (supporting, encouraging, listening, accepting, trusting, respecting, negotiating differences) rebuild it. </w:t>
       </w:r>
       <w:r>
         <w:rPr>
@@ -7796,7 +9429,7 @@
         <w:t>unmet need</w:t>
       </w:r>
       <w:r>
-        <w:t xml:space="preserve">, usually love and belonging. They then choose ineffective behaviours, like withdrawing, 'depressing' or blaming, to try to meet it, which builds a failure identity. </w:t>
+        <w:t xml:space="preserve">, usually love and belonging. They then choose ineffective behaviours — withdrawing, 'depressing' (Glasser's verb, to stress it is chosen) or blaming — to try to meet it, which builds a failure identity. </w:t>
       </w:r>
       <w:r>
         <w:rPr>
@@ -7829,7 +9462,7 @@
         <w:t>take responsibility and make effective choices</w:t>
       </w:r>
       <w:r>
-        <w:t xml:space="preserve">, improve their relationships, and meet needs in ways that are responsible, realistic and right, Glasser's three Rs. </w:t>
+        <w:t xml:space="preserve">, improve their relationships, and meet needs in ways that are responsible, realistic and right — Glasser's three Rs. </w:t>
       </w:r>
       <w:r>
         <w:rPr>
@@ -7844,25 +9477,13 @@
         <w:pStyle w:val="ListBullet"/>
       </w:pPr>
       <w:r>
-        <w:t xml:space="preserve">The core </w:t>
-      </w:r>
-      <w:r>
-        <w:rPr>
-          <w:b/>
-        </w:rPr>
-        <w:t>procedure</w:t>
-      </w:r>
-      <w:r>
-        <w:t xml:space="preserve"> is </w:t>
-      </w:r>
-      <w:r>
-        <w:rPr>
-          <w:b/>
-        </w:rPr>
-        <w:t>Wubbolding's cycle of counselling</w:t>
-      </w:r>
-      <w:r>
-        <w:t xml:space="preserve">. It first builds the environment: a trusting, friendly bond with humour and good listening, while avoiding arguing and criticising. </w:t>
+        <w:rPr>
+          <w:b/>
+        </w:rPr>
+        <w:t>Building the environment</w:t>
+      </w:r>
+      <w:r>
+        <w:t xml:space="preserve"> is the first procedure, from Wubbolding's cycle. How it is done: the therapist forms a trusting, friendly bond using warmth, humour and genuine listening, while firmly avoiding arguing, criticising and accepting excuses. Why it matters: a person will only evaluate themselves honestly inside a relationship that feels safe. </w:t>
       </w:r>
       <w:r>
         <w:rPr>
@@ -7877,25 +9498,13 @@
         <w:pStyle w:val="ListBullet"/>
       </w:pPr>
       <w:r>
-        <w:t xml:space="preserve">The main </w:t>
-      </w:r>
-      <w:r>
-        <w:rPr>
-          <w:b/>
-        </w:rPr>
-        <w:t>technique</w:t>
-      </w:r>
-      <w:r>
-        <w:t xml:space="preserve"> is the </w:t>
-      </w:r>
-      <w:r>
-        <w:rPr>
-          <w:b/>
-        </w:rPr>
-        <w:t>WDEP system</w:t>
-      </w:r>
-      <w:r>
-        <w:t xml:space="preserve">. W explores the client's wants and needs. D clarifies what they are currently doing and the direction it is taking them. </w:t>
+        <w:rPr>
+          <w:b/>
+        </w:rPr>
+        <w:t>W — exploring Wants</w:t>
+      </w:r>
+      <w:r>
+        <w:t xml:space="preserve"> is the first WDEP step. How it is done: the therapist asks what the client truly wants — from life, from others, from therapy — drawing out the pictures in their quality world. Why it helps: you cannot steer toward a goal you have never named. </w:t>
       </w:r>
       <w:r>
         <w:rPr>
@@ -7910,25 +9519,13 @@
         <w:pStyle w:val="ListBullet"/>
       </w:pPr>
       <w:r>
-        <w:t xml:space="preserve">The WDEP </w:t>
-      </w:r>
-      <w:r>
-        <w:rPr>
-          <w:b/>
-        </w:rPr>
-        <w:t>technique</w:t>
-      </w:r>
-      <w:r>
-        <w:t xml:space="preserve"> continues with E, the client's own </w:t>
-      </w:r>
-      <w:r>
-        <w:rPr>
-          <w:b/>
-        </w:rPr>
-        <w:t>self-evaluation</w:t>
-      </w:r>
-      <w:r>
-        <w:t xml:space="preserve"> of whether their behaviour is helping and is realistic. Then P is a plan they commit to and that is workable. </w:t>
+        <w:rPr>
+          <w:b/>
+        </w:rPr>
+        <w:t>D — Doing and direction</w:t>
+      </w:r>
+      <w:r>
+        <w:t xml:space="preserve"> is the second step. How it is done: the therapist asks in concrete detail what the client is actually doing right now and where that road is taking them. Why it helps: it makes the current behaviour visible so it can be weighed. </w:t>
       </w:r>
       <w:r>
         <w:rPr>
@@ -7943,28 +9540,13 @@
         <w:pStyle w:val="ListBullet"/>
       </w:pPr>
       <w:r>
-        <w:t xml:space="preserve">A memorable planning </w:t>
-      </w:r>
-      <w:r>
-        <w:rPr>
-          <w:b/>
-        </w:rPr>
-        <w:t>technique</w:t>
-      </w:r>
-      <w:r>
-        <w:t xml:space="preserve"> is the </w:t>
-      </w:r>
-      <w:r>
-        <w:t xml:space="preserve">SAMI2C3 plan </w:t>
-      </w:r>
-      <w:r>
-        <w:rPr>
-          <w:i/>
-        </w:rPr>
-        <w:t>(a plan that is Simple, Attainable, Measurable, Immediate, Involving, Controlled, Committed and Consistent)</w:t>
-      </w:r>
-      <w:r>
-        <w:t xml:space="preserve">, which makes the commitment concrete and easy to check. </w:t>
+        <w:rPr>
+          <w:b/>
+        </w:rPr>
+        <w:t>E — self-Evaluation</w:t>
+      </w:r>
+      <w:r>
+        <w:t xml:space="preserve"> is the pivot of the whole method. How it is done: the therapist asks the client to judge, for themselves, whether their current behaviour is getting them what they want and is realistic. Why it is central: change only begins when the person — not the therapist — decides the old way is not working. </w:t>
       </w:r>
       <w:r>
         <w:rPr>
@@ -7979,6 +9561,39 @@
         <w:pStyle w:val="ListBullet"/>
       </w:pPr>
       <w:r>
+        <w:rPr>
+          <w:b/>
+        </w:rPr>
+        <w:t>P — Planning</w:t>
+      </w:r>
+      <w:r>
+        <w:t xml:space="preserve"> is the final step, made memorable as the </w:t>
+      </w:r>
+      <w:r>
+        <w:t xml:space="preserve">SAMI2C3 plan </w:t>
+      </w:r>
+      <w:r>
+        <w:rPr>
+          <w:i/>
+        </w:rPr>
+        <w:t>(a plan that is Simple, Attainable, Measurable, Immediate, Involving, Controlled, Committed and Consistent)</w:t>
+      </w:r>
+      <w:r>
+        <w:t xml:space="preserve">. How it is done: client and therapist craft one small, concrete, do-it-now step the client commits to, so success is easy to see and build on. </w:t>
+      </w:r>
+      <w:r>
+        <w:rPr>
+          <w:i/>
+          <w:color w:val="555555"/>
+        </w:rPr>
+        <w:t>[Affective Therapies (Unit IV compiled reader)]</w:t>
+      </w:r>
+    </w:p>
+    <w:p>
+      <w:pPr>
+        <w:pStyle w:val="ListBullet"/>
+      </w:pPr>
+      <w:r>
         <w:t xml:space="preserve">Further </w:t>
       </w:r>
       <w:r>
@@ -7988,7 +9603,7 @@
         <w:t>techniques</w:t>
       </w:r>
       <w:r>
-        <w:t xml:space="preserve"> include skilful questioning, metaphor and humour, paradox, role play, contracts and self-disclosure. A gentle challenge runs through it: 'Is what you are doing helping?', with a firm refusal to accept excuses. </w:t>
+        <w:t xml:space="preserve"> include skilful questioning, metaphor and humour, paradox, role play, written contracts and self-disclosure. The gentle, repeated challenge — 'Is what you are doing helping?' — runs through all of them, always with a firm refusal to accept excuses. </w:t>
       </w:r>
       <w:r>
         <w:rPr>
@@ -8372,6 +9987,122 @@
       </w:tr>
     </w:tbl>
     <w:p/>
+    <w:tbl>
+      <w:tblPr>
+        <w:tblStyle w:val="TableGrid"/>
+        <w:tblW w:type="auto" w:w="0"/>
+        <w:tblLook w:firstColumn="1" w:firstRow="1" w:lastColumn="0" w:lastRow="0" w:noHBand="0" w:noVBand="1" w:val="04A0"/>
+      </w:tblPr>
+      <w:tblGrid>
+        <w:gridCol w:w="8640"/>
+      </w:tblGrid>
+      <w:tr>
+        <w:tc>
+          <w:tcPr>
+            <w:tcW w:type="dxa" w:w="8640"/>
+            <w:shd w:val="clear" w:color="auto" w:fill="F1F3F5"/>
+          </w:tcPr>
+          <w:p>
+            <w:r/>
+            <w:r>
+              <w:rPr>
+                <w:b/>
+              </w:rPr>
+              <w:t>Main focus (the central idea)</w:t>
+            </w:r>
+          </w:p>
+          <w:p>
+            <w:r>
+              <w:t xml:space="preserve">• </w:t>
+            </w:r>
+            <w:r>
+              <w:t xml:space="preserve">The </w:t>
+            </w:r>
+            <w:r>
+              <w:rPr>
+                <w:b/>
+              </w:rPr>
+              <w:t>main focus</w:t>
+            </w:r>
+            <w:r>
+              <w:t xml:space="preserve"> is to </w:t>
+            </w:r>
+            <w:r>
+              <w:rPr>
+                <w:b/>
+              </w:rPr>
+              <w:t>strengthen the person</w:t>
+            </w:r>
+            <w:r>
+              <w:t>, not to dig into them. Supportive therapy does the opposite of uncovering work: instead of opening up hidden conflicts, it reinforces the client's existing strengths, defences and coping so they can get through the day.</w:t>
+            </w:r>
+          </w:p>
+          <w:p>
+            <w:r>
+              <w:t xml:space="preserve">• </w:t>
+            </w:r>
+            <w:r>
+              <w:t xml:space="preserve">Picture someone whose house is in a storm. Deep therapy would rebuild the foundations; supportive therapy props up the walls so the house stands through the storm. The aim is to </w:t>
+            </w:r>
+            <w:r>
+              <w:rPr>
+                <w:b/>
+              </w:rPr>
+              <w:t>keep the person steady and functioning</w:t>
+            </w:r>
+            <w:r>
+              <w:t>, raise their self-esteem, and carry them through a crisis or a long illness, using the warm relationship itself as the main support.</w:t>
+            </w:r>
+          </w:p>
+        </w:tc>
+      </w:tr>
+    </w:tbl>
+    <w:p/>
+    <w:p>
+      <w:pPr>
+        <w:pStyle w:val="Heading2"/>
+      </w:pPr>
+      <w:r>
+        <w:t>How it actually works (the mechanism of change)</w:t>
+      </w:r>
+    </w:p>
+    <w:p>
+      <w:pPr>
+        <w:pStyle w:val="ListBullet"/>
+      </w:pPr>
+      <w:r>
+        <w:t xml:space="preserve">The change engine is a </w:t>
+      </w:r>
+      <w:r>
+        <w:rPr>
+          <w:b/>
+        </w:rPr>
+        <w:t>borrowed strength plus relief of pressure</w:t>
+      </w:r>
+      <w:r>
+        <w:t xml:space="preserve">. A dependable, warm therapist acts as an </w:t>
+      </w:r>
+      <w:r>
+        <w:t xml:space="preserve">auxiliary ego </w:t>
+      </w:r>
+      <w:r>
+        <w:rPr>
+          <w:i/>
+        </w:rPr>
+        <w:t>(a stand-in source of steadiness and judgement that the client leans on until their own recovers)</w:t>
+      </w:r>
+      <w:r>
+        <w:t>, so the client borrows the calm and good sense they cannot yet manage alone — much like leaning on a crutch until a sprained ankle heals.</w:t>
+      </w:r>
+    </w:p>
+    <w:p>
+      <w:pPr>
+        <w:pStyle w:val="ListBullet"/>
+      </w:pPr>
+      <w:r>
+        <w:t>At the same time, letting feelings out, getting clear reassurance and advice, and solving one practical problem at a time all lower the pressure on an overwhelmed mind. As the stress drops and small successes build, the client's own coping and confidence slowly come back, and the borrowed support is needed less.</w:t>
+      </w:r>
+    </w:p>
     <w:p>
       <w:pPr>
         <w:pStyle w:val="Heading2"/>
@@ -9183,6 +10914,128 @@
       </w:tr>
     </w:tbl>
     <w:p/>
+    <w:tbl>
+      <w:tblPr>
+        <w:tblStyle w:val="TableGrid"/>
+        <w:tblW w:type="auto" w:w="0"/>
+        <w:tblLook w:firstColumn="1" w:firstRow="1" w:lastColumn="0" w:lastRow="0" w:noHBand="0" w:noVBand="1" w:val="04A0"/>
+      </w:tblPr>
+      <w:tblGrid>
+        <w:gridCol w:w="8640"/>
+      </w:tblGrid>
+      <w:tr>
+        <w:tc>
+          <w:tcPr>
+            <w:tcW w:type="dxa" w:w="8640"/>
+            <w:shd w:val="clear" w:color="auto" w:fill="F1F3F5"/>
+          </w:tcPr>
+          <w:p>
+            <w:r/>
+            <w:r>
+              <w:rPr>
+                <w:b/>
+              </w:rPr>
+              <w:t>Main focus (the central idea)</w:t>
+            </w:r>
+          </w:p>
+          <w:p>
+            <w:r>
+              <w:t xml:space="preserve">• </w:t>
+            </w:r>
+            <w:r>
+              <w:t xml:space="preserve">The </w:t>
+            </w:r>
+            <w:r>
+              <w:rPr>
+                <w:b/>
+              </w:rPr>
+              <w:t>main focus</w:t>
+            </w:r>
+            <w:r>
+              <w:t xml:space="preserve"> is </w:t>
+            </w:r>
+            <w:r>
+              <w:rPr>
+                <w:b/>
+              </w:rPr>
+              <w:t>focused attention put to use</w:t>
+            </w:r>
+            <w:r>
+              <w:t>. In hypnosis the mind narrows to one thing and the usual critical, doubting part steps back, so helpful suggestions can take hold far more easily than in ordinary waking talk.</w:t>
+            </w:r>
+          </w:p>
+          <w:p>
+            <w:r>
+              <w:t xml:space="preserve">• </w:t>
+            </w:r>
+            <w:r>
+              <w:t xml:space="preserve">Think of how a child, lost in a story, really feels afraid or excited — attention is so absorbed that the imagined becomes almost real. Hypnotherapy deliberately creates that absorbed state and then feeds in useful ideas (calm instead of panic, numbness instead of pain). It is </w:t>
+            </w:r>
+            <w:r>
+              <w:rPr>
+                <w:b/>
+              </w:rPr>
+              <w:t>not sleep and not loss of control</w:t>
+            </w:r>
+            <w:r>
+              <w:t xml:space="preserve">; the client stays aware and could stop any time. It is mostly used as an </w:t>
+            </w:r>
+            <w:r>
+              <w:rPr>
+                <w:b/>
+              </w:rPr>
+              <w:t>add-on</w:t>
+            </w:r>
+            <w:r>
+              <w:t xml:space="preserve"> to other treatment, not a therapy on its own.</w:t>
+            </w:r>
+          </w:p>
+        </w:tc>
+      </w:tr>
+    </w:tbl>
+    <w:p/>
+    <w:p>
+      <w:pPr>
+        <w:pStyle w:val="Heading2"/>
+      </w:pPr>
+      <w:r>
+        <w:t>How it actually works (the mechanism of change)</w:t>
+      </w:r>
+    </w:p>
+    <w:p>
+      <w:pPr>
+        <w:pStyle w:val="ListBullet"/>
+      </w:pPr>
+      <w:r>
+        <w:t xml:space="preserve">The change engine is </w:t>
+      </w:r>
+      <w:r>
+        <w:rPr>
+          <w:b/>
+        </w:rPr>
+        <w:t>heightened suggestibility inside a narrowed focus</w:t>
+      </w:r>
+      <w:r>
+        <w:t>. When attention is absorbed and the critical, judging mind relaxes, a suggestion meets less resistance and is accepted more like a direct instruction — so 'your hand feels numb' or 'the worry drifts away' can actually reshape how the body and feelings respond.</w:t>
+      </w:r>
+    </w:p>
+    <w:p>
+      <w:pPr>
+        <w:pStyle w:val="ListBullet"/>
+      </w:pPr>
+      <w:r>
+        <w:t xml:space="preserve">The gains are then made to last by </w:t>
+      </w:r>
+      <w:r>
+        <w:rPr>
+          <w:b/>
+        </w:rPr>
+        <w:t>post-hypnotic suggestion and self-hypnosis</w:t>
+      </w:r>
+      <w:r>
+        <w:t>: the helpful response is linked to a cue the client can use later, and they are taught to re-enter the calm state on their own. In short, hypnosis opens a window; the suggestions and home practice are what carry the change out of the room and into daily life.</w:t>
+      </w:r>
+    </w:p>
     <w:p>
       <w:pPr>
         <w:pStyle w:val="Heading2"/>
@@ -10015,6 +11868,119 @@
       </w:tr>
     </w:tbl>
     <w:p/>
+    <w:tbl>
+      <w:tblPr>
+        <w:tblStyle w:val="TableGrid"/>
+        <w:tblW w:type="auto" w:w="0"/>
+        <w:tblLook w:firstColumn="1" w:firstRow="1" w:lastColumn="0" w:lastRow="0" w:noHBand="0" w:noVBand="1" w:val="04A0"/>
+      </w:tblPr>
+      <w:tblGrid>
+        <w:gridCol w:w="8640"/>
+      </w:tblGrid>
+      <w:tr>
+        <w:tc>
+          <w:tcPr>
+            <w:tcW w:type="dxa" w:w="8640"/>
+            <w:shd w:val="clear" w:color="auto" w:fill="F1F3F5"/>
+          </w:tcPr>
+          <w:p>
+            <w:r/>
+            <w:r>
+              <w:rPr>
+                <w:b/>
+              </w:rPr>
+              <w:t>Main focus (the central idea)</w:t>
+            </w:r>
+          </w:p>
+          <w:p>
+            <w:r>
+              <w:t xml:space="preserve">• </w:t>
+            </w:r>
+            <w:r>
+              <w:t xml:space="preserve">The </w:t>
+            </w:r>
+            <w:r>
+              <w:rPr>
+                <w:b/>
+              </w:rPr>
+              <w:t>main focus</w:t>
+            </w:r>
+            <w:r>
+              <w:t xml:space="preserve"> is to meet children </w:t>
+            </w:r>
+            <w:r>
+              <w:rPr>
+                <w:b/>
+              </w:rPr>
+              <w:t>in their own language, which is play</w:t>
+            </w:r>
+            <w:r>
+              <w:t xml:space="preserve">. A young child cannot sit and explain, in words, that they feel scared, angry or unsafe — but they can show it with toys. So play therapy treats </w:t>
+            </w:r>
+            <w:r>
+              <w:rPr>
+                <w:b/>
+              </w:rPr>
+              <w:t>toys as words and play as speech</w:t>
+            </w:r>
+            <w:r>
+              <w:t>.</w:t>
+            </w:r>
+          </w:p>
+          <w:p>
+            <w:r>
+              <w:t xml:space="preserve">• </w:t>
+            </w:r>
+            <w:r>
+              <w:t xml:space="preserve">A frightened child may make two dolls fight, or bury a toy in the sand and dig it up again, working through a real worry at a safe, pretend distance. The therapist gives a warm, accepting playroom and follows the child's lead, so the child can </w:t>
+            </w:r>
+            <w:r>
+              <w:rPr>
+                <w:b/>
+              </w:rPr>
+              <w:t>express, understand and master</w:t>
+            </w:r>
+            <w:r>
+              <w:t xml:space="preserve"> feelings and experiences they could never put into a sentence.</w:t>
+            </w:r>
+          </w:p>
+        </w:tc>
+      </w:tr>
+    </w:tbl>
+    <w:p/>
+    <w:p>
+      <w:pPr>
+        <w:pStyle w:val="Heading2"/>
+      </w:pPr>
+      <w:r>
+        <w:t>How it actually works (the mechanism of change)</w:t>
+      </w:r>
+    </w:p>
+    <w:p>
+      <w:pPr>
+        <w:pStyle w:val="ListBullet"/>
+      </w:pPr>
+      <w:r>
+        <w:t xml:space="preserve">The change engine is </w:t>
+      </w:r>
+      <w:r>
+        <w:rPr>
+          <w:b/>
+        </w:rPr>
+        <w:t>safe expression plus mastery through repetition</w:t>
+      </w:r>
+      <w:r>
+        <w:t>. By acting a frightening or confusing experience out in symbolic play, the child lets the bottled-up feeling out at a safe distance (it is only the dolls, not really them) and, by replaying it with a better ending, moves from feeling helpless to feeling in charge of the story.</w:t>
+      </w:r>
+    </w:p>
+    <w:p>
+      <w:pPr>
+        <w:pStyle w:val="ListBullet"/>
+      </w:pPr>
+      <w:r>
+        <w:t>The accepting relationship does the rest: when the therapist reflects the child's feelings and accepts them without blame, the child learns the feelings are allowed and manageable. Over many sessions this builds self-esteem, emotional control and trust — and when parents are trained to play this way too, as in filial therapy, the healing continues at home.</w:t>
+      </w:r>
+    </w:p>
     <w:p>
       <w:pPr>
         <w:pStyle w:val="Heading2"/>
@@ -10838,6 +12804,128 @@
       </w:tr>
     </w:tbl>
     <w:p/>
+    <w:tbl>
+      <w:tblPr>
+        <w:tblStyle w:val="TableGrid"/>
+        <w:tblW w:type="auto" w:w="0"/>
+        <w:tblLook w:firstColumn="1" w:firstRow="1" w:lastColumn="0" w:lastRow="0" w:noHBand="0" w:noVBand="1" w:val="04A0"/>
+      </w:tblPr>
+      <w:tblGrid>
+        <w:gridCol w:w="8640"/>
+      </w:tblGrid>
+      <w:tr>
+        <w:tc>
+          <w:tcPr>
+            <w:tcW w:type="dxa" w:w="8640"/>
+            <w:shd w:val="clear" w:color="auto" w:fill="F1F3F5"/>
+          </w:tcPr>
+          <w:p>
+            <w:r/>
+            <w:r>
+              <w:rPr>
+                <w:b/>
+              </w:rPr>
+              <w:t>Main focus (the central idea)</w:t>
+            </w:r>
+          </w:p>
+          <w:p>
+            <w:r>
+              <w:t xml:space="preserve">• </w:t>
+            </w:r>
+            <w:r>
+              <w:t xml:space="preserve">The </w:t>
+            </w:r>
+            <w:r>
+              <w:rPr>
+                <w:b/>
+              </w:rPr>
+              <w:t>main focus</w:t>
+            </w:r>
+            <w:r>
+              <w:t xml:space="preserve"> is to </w:t>
+            </w:r>
+            <w:r>
+              <w:rPr>
+                <w:b/>
+              </w:rPr>
+              <w:t>act out the problem</w:t>
+            </w:r>
+            <w:r>
+              <w:t>, rather than just talk about it. Rather than describe a painful argument with a parent, the client (the protagonist) stages it on the spot, with group members stepping in to play the other people, so the conflict is lived again in the room.</w:t>
+            </w:r>
+          </w:p>
+          <w:p>
+            <w:r>
+              <w:t xml:space="preserve">• </w:t>
+            </w:r>
+            <w:r>
+              <w:t xml:space="preserve">The guiding belief is that health is </w:t>
+            </w:r>
+            <w:r>
+              <w:rPr>
+                <w:b/>
+              </w:rPr>
+              <w:t>spontaneity</w:t>
+            </w:r>
+            <w:r>
+              <w:t xml:space="preserve"> — being able to respond freshly and flexibly — and that distress comes from getting stuck in rigid, narrow roles. By replaying scenes and trying new responses safely, the person recovers spontaneity and widens their range of roles. Doing it, not only saying it, is what makes the difference.</w:t>
+            </w:r>
+          </w:p>
+        </w:tc>
+      </w:tr>
+    </w:tbl>
+    <w:p/>
+    <w:p>
+      <w:pPr>
+        <w:pStyle w:val="Heading2"/>
+      </w:pPr>
+      <w:r>
+        <w:t>How it actually works (the mechanism of change)</w:t>
+      </w:r>
+    </w:p>
+    <w:p>
+      <w:pPr>
+        <w:pStyle w:val="ListBullet"/>
+      </w:pPr>
+      <w:r>
+        <w:t xml:space="preserve">The change engine is </w:t>
+      </w:r>
+      <w:r>
+        <w:rPr>
+          <w:b/>
+        </w:rPr>
+        <w:t>enactment plus a fresh viewpoint</w:t>
+      </w:r>
+      <w:r>
+        <w:t xml:space="preserve">. Acting a scene out brings the real emotion up and releases it (catharsis), far more fully than describing it would. Then techniques like </w:t>
+      </w:r>
+      <w:r>
+        <w:rPr>
+          <w:b/>
+        </w:rPr>
+        <w:t>role reversal</w:t>
+      </w:r>
+      <w:r>
+        <w:t xml:space="preserve"> — where the protagonist steps into the other person's shoes and plays them — let the client literally feel the situation from the other side, which produces sudden empathy and insight.</w:t>
+      </w:r>
+    </w:p>
+    <w:p>
+      <w:pPr>
+        <w:pStyle w:val="ListBullet"/>
+      </w:pPr>
+      <w:r>
+        <w:t xml:space="preserve">Because the stage is 'surplus reality', the client can also replay what never happened — say what was never said, meet someone who has died, rehearse a feared future — and so finish unfinished business and practise new roles safely. The closing </w:t>
+      </w:r>
+      <w:r>
+        <w:rPr>
+          <w:b/>
+        </w:rPr>
+        <w:t>sharing</w:t>
+      </w:r>
+      <w:r>
+        <w:t>, where others tell their own similar stories, dissolves the shame of being alone with the problem and settles the person back into real life.</w:t>
+      </w:r>
+    </w:p>
     <w:p>
       <w:pPr>
         <w:pStyle w:val="Heading2"/>
@@ -11694,6 +13782,140 @@
       </w:tr>
     </w:tbl>
     <w:p/>
+    <w:tbl>
+      <w:tblPr>
+        <w:tblStyle w:val="TableGrid"/>
+        <w:tblW w:type="auto" w:w="0"/>
+        <w:tblLook w:firstColumn="1" w:firstRow="1" w:lastColumn="0" w:lastRow="0" w:noHBand="0" w:noVBand="1" w:val="04A0"/>
+      </w:tblPr>
+      <w:tblGrid>
+        <w:gridCol w:w="8640"/>
+      </w:tblGrid>
+      <w:tr>
+        <w:tc>
+          <w:tcPr>
+            <w:tcW w:type="dxa" w:w="8640"/>
+            <w:shd w:val="clear" w:color="auto" w:fill="F1F3F5"/>
+          </w:tcPr>
+          <w:p>
+            <w:r/>
+            <w:r>
+              <w:rPr>
+                <w:b/>
+              </w:rPr>
+              <w:t>Main focus (the central idea)</w:t>
+            </w:r>
+          </w:p>
+          <w:p>
+            <w:r>
+              <w:t xml:space="preserve">• </w:t>
+            </w:r>
+            <w:r>
+              <w:t xml:space="preserve">The </w:t>
+            </w:r>
+            <w:r>
+              <w:rPr>
+                <w:b/>
+              </w:rPr>
+              <w:t>main focus</w:t>
+            </w:r>
+            <w:r>
+              <w:t xml:space="preserve"> is to settle the mind through the </w:t>
+            </w:r>
+            <w:r>
+              <w:rPr>
+                <w:b/>
+              </w:rPr>
+              <w:t>body, breath and attention</w:t>
+            </w:r>
+            <w:r>
+              <w:t>. Instead of talking a problem out, these practices quiet the whole nervous system — slow breathing, gentle movement, still postures and focused awareness — so the body shifts from 'alarm' mode into 'rest' mode, and the restless chatter of the mind calms down.</w:t>
+            </w:r>
+          </w:p>
+          <w:p>
+            <w:r>
+              <w:t xml:space="preserve">• </w:t>
+            </w:r>
+            <w:r>
+              <w:t xml:space="preserve">They are </w:t>
+            </w:r>
+            <w:r>
+              <w:rPr>
+                <w:b/>
+              </w:rPr>
+              <w:t>mind-body</w:t>
+            </w:r>
+            <w:r>
+              <w:t xml:space="preserve"> methods: change the body (breath, posture, movement) and attention, and the mind follows. The group is honest about range and evidence, though. Mindfulness, yoga and tai chi have a </w:t>
+            </w:r>
+            <w:r>
+              <w:rPr>
+                <w:b/>
+              </w:rPr>
+              <w:t>real evidence base</w:t>
+            </w:r>
+            <w:r>
+              <w:t xml:space="preserve">; the energy-healing claims of reiki and pranic healing have </w:t>
+            </w:r>
+            <w:r>
+              <w:rPr>
+                <w:b/>
+              </w:rPr>
+              <w:t>weak or inconclusive evidence</w:t>
+            </w:r>
+            <w:r>
+              <w:t>, and must never replace proper medical or psychological care.</w:t>
+            </w:r>
+          </w:p>
+        </w:tc>
+      </w:tr>
+    </w:tbl>
+    <w:p/>
+    <w:p>
+      <w:pPr>
+        <w:pStyle w:val="Heading2"/>
+      </w:pPr>
+      <w:r>
+        <w:t>How it actually works (the mechanism of change)</w:t>
+      </w:r>
+    </w:p>
+    <w:p>
+      <w:pPr>
+        <w:pStyle w:val="ListBullet"/>
+      </w:pPr>
+      <w:r>
+        <w:t xml:space="preserve">The main change engine is </w:t>
+      </w:r>
+      <w:r>
+        <w:rPr>
+          <w:b/>
+        </w:rPr>
+        <w:t>better self-regulation of the nervous system</w:t>
+      </w:r>
+      <w:r>
+        <w:t>. Slow breathing, relaxation and steady movement switch on the body's calming (parasympathetic) side — heart rate, blood pressure, muscle tension and the stress hormone cortisol all drop — which is the body's natural opposite of the fight-or-flight stress response.</w:t>
+      </w:r>
+    </w:p>
+    <w:p>
+      <w:pPr>
+        <w:pStyle w:val="ListBullet"/>
+      </w:pPr>
+      <w:r>
+        <w:t xml:space="preserve">Meditation adds a mental skill called </w:t>
+      </w:r>
+      <w:r>
+        <w:t xml:space="preserve">decentring </w:t>
+      </w:r>
+      <w:r>
+        <w:rPr>
+          <w:i/>
+        </w:rPr>
+        <w:t>(learning to watch a thought as just a passing mental event, not a fact or a command)</w:t>
+      </w:r>
+      <w:r>
+        <w:t>: by watching worries drift past like clouds instead of being swept along by them, the person ruminates less and accepts more. For the energy-healing practices, any benefit is best explained by this same relaxation, focused attention and positive expectancy — not by a special energy, for which there is no credible proof.</w:t>
+      </w:r>
+    </w:p>
     <w:p>
       <w:pPr>
         <w:pStyle w:val="Heading2"/>

</xml_diff>